<commit_message>
operandos y operaciones logicas
Co-Authored-By: Maikel Flores <159388957+MaikelFn@users.noreply.github.com>
</commit_message>
<xml_diff>
--- a/Producciones.docx
+++ b/Producciones.docx
@@ -1743,6 +1743,92 @@
         </w:rPr>
         <w:lastRenderedPageBreak/>
         <w:t>&lt;Expr_Relacional&gt; ::= &lt;Cor_Ini&gt; &lt;Operando_Igualdad&gt; &lt;Cor_Fin&gt; &lt;Op_Dif&gt;   &lt;Cor_Ini&gt; &lt;Operando_Igualdad&gt; &lt;Cor_Fin&gt;</w:t>
+      </w:r>
+    </w:p>
+    <w:p>
+      <w:pPr>
+        <w:rPr>
+          <w:rFonts w:ascii="Arial" w:hAnsi="Arial" w:cs="Arial"/>
+        </w:rPr>
+      </w:pPr>
+    </w:p>
+    <w:p>
+      <w:pPr>
+        <w:rPr>
+          <w:rFonts w:ascii="Arial" w:hAnsi="Arial" w:cs="Arial"/>
+        </w:rPr>
+      </w:pPr>
+      <w:r>
+        <w:rPr>
+          <w:rFonts w:ascii="Arial" w:hAnsi="Arial" w:cs="Arial"/>
+        </w:rPr>
+        <w:t>&lt;Operando_Logico&gt; ::= &lt;Lit_Bool&gt;</w:t>
+      </w:r>
+    </w:p>
+    <w:p>
+      <w:pPr>
+        <w:rPr>
+          <w:rFonts w:ascii="Arial" w:hAnsi="Arial" w:cs="Arial"/>
+        </w:rPr>
+      </w:pPr>
+      <w:r>
+        <w:rPr>
+          <w:rFonts w:ascii="Arial" w:hAnsi="Arial" w:cs="Arial"/>
+        </w:rPr>
+        <w:t>&lt;Operando_Logico&gt; ::= &lt;Expr_Relacional&gt;</w:t>
+      </w:r>
+    </w:p>
+    <w:p>
+      <w:pPr>
+        <w:rPr>
+          <w:rFonts w:ascii="Arial" w:hAnsi="Arial" w:cs="Arial"/>
+        </w:rPr>
+      </w:pPr>
+    </w:p>
+    <w:p>
+      <w:pPr>
+        <w:rPr>
+          <w:rFonts w:ascii="Arial" w:hAnsi="Arial" w:cs="Arial"/>
+        </w:rPr>
+      </w:pPr>
+      <w:r>
+        <w:rPr>
+          <w:rFonts w:ascii="Arial" w:hAnsi="Arial" w:cs="Arial"/>
+        </w:rPr>
+        <w:t>&lt;Expr_Logica&gt; ::= &lt;Par_Ini&gt; &lt;Operando_Logico&gt; &lt;Par_Fin&gt; &lt;Op_And&gt; &lt;Par_Ini&gt; &lt;Operando_Logico&gt; &lt;Par_Fin&gt;</w:t>
+      </w:r>
+    </w:p>
+    <w:p>
+      <w:pPr>
+        <w:rPr>
+          <w:rFonts w:ascii="Arial" w:hAnsi="Arial" w:cs="Arial"/>
+        </w:rPr>
+      </w:pPr>
+      <w:r>
+        <w:rPr>
+          <w:rFonts w:ascii="Arial" w:hAnsi="Arial" w:cs="Arial"/>
+        </w:rPr>
+        <w:t>&lt;Expr_Logica&gt; ::= &lt;Par_Ini&gt; &lt;Operando_Logico&gt; &lt;Par_Fin&gt; &lt;Op_Or&gt;  &lt;Par_Ini&gt; &lt;Operando_Logico&gt; &lt;Par_Fin&gt;</w:t>
+      </w:r>
+    </w:p>
+    <w:p>
+      <w:pPr>
+        <w:rPr>
+          <w:rFonts w:ascii="Arial" w:hAnsi="Arial" w:cs="Arial"/>
+        </w:rPr>
+      </w:pPr>
+    </w:p>
+    <w:p>
+      <w:pPr>
+        <w:rPr>
+          <w:rFonts w:ascii="Arial" w:hAnsi="Arial" w:cs="Arial"/>
+        </w:rPr>
+      </w:pPr>
+      <w:r>
+        <w:rPr>
+          <w:rFonts w:ascii="Arial" w:hAnsi="Arial" w:cs="Arial"/>
+        </w:rPr>
+        <w:t>&lt;Expr_Negacion_Logica&gt; ::= &lt;Op_Not&gt; &lt;Par_Ini&gt; &lt;Operando_Logico&gt; &lt;Par_Fin&gt;</w:t>
       </w:r>
     </w:p>
     <w:sectPr>

</xml_diff>

<commit_message>
Declaración y llamada de funciones
Declaración de funciones parcialmente completo
llamada de funciones completo
</commit_message>
<xml_diff>
--- a/Producciones.docx
+++ b/Producciones.docx
@@ -843,7 +843,20 @@
           <w:rFonts w:ascii="Arial" w:hAnsi="Arial" w:cs="Arial"/>
           <w:lang w:val="en-US"/>
         </w:rPr>
-        <w:t>&lt;Main&gt;   ::= "main"</w:t>
+        <w:t>&lt;Main&gt;   ::= "</w:t>
+      </w:r>
+      <w:r>
+        <w:rPr>
+          <w:rFonts w:ascii="Arial" w:hAnsi="Arial" w:cs="Arial"/>
+        </w:rPr>
+        <w:t>principal</w:t>
+      </w:r>
+      <w:r>
+        <w:rPr>
+          <w:rFonts w:ascii="Arial" w:hAnsi="Arial" w:cs="Arial"/>
+          <w:lang w:val="en-US"/>
+        </w:rPr>
+        <w:t>"</w:t>
       </w:r>
     </w:p>
     <w:p>
@@ -1018,6 +1031,14 @@
           <w:lang w:val="en-US"/>
         </w:rPr>
       </w:pPr>
+    </w:p>
+    <w:p>
+      <w:pPr>
+        <w:rPr>
+          <w:rFonts w:ascii="Arial" w:hAnsi="Arial" w:cs="Arial"/>
+          <w:lang w:val="en-US"/>
+        </w:rPr>
+      </w:pPr>
       <w:r>
         <w:rPr>
           <w:rFonts w:ascii="Arial" w:hAnsi="Arial" w:cs="Arial"/>
@@ -1126,6 +1147,7 @@
           <w:rFonts w:ascii="Arial" w:hAnsi="Arial" w:cs="Arial"/>
           <w:lang w:val="es-CR"/>
         </w:rPr>
+        <w:lastRenderedPageBreak/>
         <w:t>&lt;Arreglo&gt; ::= &lt;Arreglo_Float&gt;</w:t>
       </w:r>
     </w:p>
@@ -1156,20 +1178,6 @@
           <w:rFonts w:ascii="Arial" w:hAnsi="Arial" w:cs="Arial"/>
         </w:rPr>
       </w:pPr>
-    </w:p>
-    <w:p>
-      <w:pPr>
-        <w:rPr>
-          <w:rFonts w:ascii="Arial" w:hAnsi="Arial" w:cs="Arial"/>
-        </w:rPr>
-      </w:pPr>
-    </w:p>
-    <w:p>
-      <w:pPr>
-        <w:rPr>
-          <w:rFonts w:ascii="Arial" w:hAnsi="Arial" w:cs="Arial"/>
-        </w:rPr>
-      </w:pPr>
       <w:r>
         <w:rPr>
           <w:rFonts w:ascii="Arial" w:hAnsi="Arial" w:cs="Arial"/>
@@ -1459,20 +1467,20 @@
         <w:rPr>
           <w:rFonts w:ascii="Arial" w:hAnsi="Arial" w:cs="Arial"/>
         </w:rPr>
+        <w:t>&lt;Expr_Suma_Resta&gt; ::= &lt;Expr_Potencia&gt; &lt;Op_Suma&gt; &lt;Expr_Suma_Resta&gt;</w:t>
+      </w:r>
+    </w:p>
+    <w:p>
+      <w:pPr>
+        <w:rPr>
+          <w:rFonts w:ascii="Arial" w:hAnsi="Arial" w:cs="Arial"/>
+        </w:rPr>
+      </w:pPr>
+      <w:r>
+        <w:rPr>
+          <w:rFonts w:ascii="Arial" w:hAnsi="Arial" w:cs="Arial"/>
+        </w:rPr>
         <w:lastRenderedPageBreak/>
-        <w:t>&lt;Expr_Suma_Resta&gt; ::= &lt;Expr_Potencia&gt; &lt;Op_Suma&gt; &lt;Expr_Suma_Resta&gt;</w:t>
-      </w:r>
-    </w:p>
-    <w:p>
-      <w:pPr>
-        <w:rPr>
-          <w:rFonts w:ascii="Arial" w:hAnsi="Arial" w:cs="Arial"/>
-        </w:rPr>
-      </w:pPr>
-      <w:r>
-        <w:rPr>
-          <w:rFonts w:ascii="Arial" w:hAnsi="Arial" w:cs="Arial"/>
-        </w:rPr>
         <w:t>&lt;Expr_Suma_Resta&gt; ::= &lt;Expr_Potencia&gt; &lt;Op_Resta&gt; &lt;Expr_Suma_Resta&gt;</w:t>
       </w:r>
     </w:p>
@@ -1742,20 +1750,20 @@
         <w:rPr>
           <w:rFonts w:ascii="Arial" w:hAnsi="Arial" w:cs="Arial"/>
         </w:rPr>
+        <w:t>&lt;Expr_Relacional&gt; ::= &lt;Cor_Ini&gt; &lt;Operando_Relacional&gt; &lt;Cor_Fin&gt; &lt;Op_Mayor_Ig&gt; &lt;Cor_Ini&gt; &lt;Operando_Relacional&gt; &lt;Cor_Fin&gt;</w:t>
+      </w:r>
+    </w:p>
+    <w:p>
+      <w:pPr>
+        <w:rPr>
+          <w:rFonts w:ascii="Arial" w:hAnsi="Arial" w:cs="Arial"/>
+        </w:rPr>
+      </w:pPr>
+      <w:r>
+        <w:rPr>
+          <w:rFonts w:ascii="Arial" w:hAnsi="Arial" w:cs="Arial"/>
+        </w:rPr>
         <w:lastRenderedPageBreak/>
-        <w:t>&lt;Expr_Relacional&gt; ::= &lt;Cor_Ini&gt; &lt;Operando_Relacional&gt; &lt;Cor_Fin&gt; &lt;Op_Mayor_Ig&gt; &lt;Cor_Ini&gt; &lt;Operando_Relacional&gt; &lt;Cor_Fin&gt;</w:t>
-      </w:r>
-    </w:p>
-    <w:p>
-      <w:pPr>
-        <w:rPr>
-          <w:rFonts w:ascii="Arial" w:hAnsi="Arial" w:cs="Arial"/>
-        </w:rPr>
-      </w:pPr>
-      <w:r>
-        <w:rPr>
-          <w:rFonts w:ascii="Arial" w:hAnsi="Arial" w:cs="Arial"/>
-        </w:rPr>
         <w:t>&lt;Expr_Relacional&gt; ::= &lt;Cor_Ini&gt; &lt;Operando_Igualdad&gt; &lt;Cor_Fin&gt; &lt;Op_Igual&gt; &lt;Cor_Ini&gt; &lt;Operando_Igualdad&gt; &lt;Cor_Fin&gt;</w:t>
       </w:r>
     </w:p>
@@ -1849,20 +1857,6 @@
           <w:rFonts w:ascii="Arial" w:hAnsi="Arial" w:cs="Arial"/>
         </w:rPr>
       </w:pPr>
-    </w:p>
-    <w:p>
-      <w:pPr>
-        <w:rPr>
-          <w:rFonts w:ascii="Arial" w:hAnsi="Arial" w:cs="Arial"/>
-        </w:rPr>
-      </w:pPr>
-    </w:p>
-    <w:p>
-      <w:pPr>
-        <w:rPr>
-          <w:rFonts w:ascii="Arial" w:hAnsi="Arial" w:cs="Arial"/>
-        </w:rPr>
-      </w:pPr>
       <w:r>
         <w:rPr>
           <w:rFonts w:ascii="Arial" w:hAnsi="Arial" w:cs="Arial"/>
@@ -2030,41 +2024,258 @@
         <w:rPr>
           <w:rFonts w:ascii="Arial" w:hAnsi="Arial" w:cs="Arial"/>
         </w:rPr>
+        <w:t>&lt;Asignacion_Var&gt;</w:t>
+      </w:r>
+      <w:r>
+        <w:rPr>
+          <w:rFonts w:ascii="Arial" w:hAnsi="Arial" w:cs="Arial"/>
+        </w:rPr>
+        <w:t xml:space="preserve"> </w:t>
+      </w:r>
+      <w:r>
+        <w:rPr>
+          <w:rFonts w:ascii="Arial" w:hAnsi="Arial" w:cs="Arial"/>
+        </w:rPr>
+        <w:t>::= &lt;Id&gt; &lt;Op_Asig&gt; &lt;Expresion&gt; &lt;Fin_Expr&gt;</w:t>
+      </w:r>
+    </w:p>
+    <w:p>
+      <w:pPr>
+        <w:rPr>
+          <w:rFonts w:ascii="Arial" w:hAnsi="Arial" w:cs="Arial"/>
+        </w:rPr>
+      </w:pPr>
+      <w:r>
+        <w:rPr>
+          <w:rFonts w:ascii="Arial" w:hAnsi="Arial" w:cs="Arial"/>
+        </w:rPr>
+        <w:t>&lt;Expr_Sin_Asignacion&gt; ::= &lt;Expresion&gt; &lt;Fin_Expr&gt;</w:t>
+      </w:r>
+    </w:p>
+    <w:p>
+      <w:pPr>
+        <w:rPr>
+          <w:rFonts w:ascii="Arial" w:hAnsi="Arial" w:cs="Arial"/>
+        </w:rPr>
+      </w:pPr>
+    </w:p>
+    <w:p>
+      <w:pPr>
+        <w:rPr>
+          <w:rFonts w:ascii="Arial" w:hAnsi="Arial" w:cs="Arial"/>
+        </w:rPr>
+      </w:pPr>
+    </w:p>
+    <w:p>
+      <w:pPr>
+        <w:rPr>
+          <w:rFonts w:ascii="Arial" w:hAnsi="Arial" w:cs="Arial"/>
+        </w:rPr>
+      </w:pPr>
+      <w:r>
+        <w:rPr>
+          <w:rFonts w:ascii="Arial" w:hAnsi="Arial" w:cs="Arial"/>
+        </w:rPr>
         <w:lastRenderedPageBreak/>
-        <w:t>&lt;Asignacion_Var&gt;</w:t>
-      </w:r>
-      <w:r>
-        <w:rPr>
-          <w:rFonts w:ascii="Arial" w:hAnsi="Arial" w:cs="Arial"/>
-        </w:rPr>
-        <w:t xml:space="preserve"> </w:t>
-      </w:r>
-      <w:r>
-        <w:rPr>
-          <w:rFonts w:ascii="Arial" w:hAnsi="Arial" w:cs="Arial"/>
-        </w:rPr>
-        <w:t>::= &lt;Id&gt; &lt;Op_Asig&gt; &lt;Expresion&gt; &lt;Fin_Expr&gt;</w:t>
-      </w:r>
-    </w:p>
-    <w:p>
-      <w:pPr>
-        <w:rPr>
-          <w:rFonts w:ascii="Arial" w:hAnsi="Arial" w:cs="Arial"/>
-        </w:rPr>
-      </w:pPr>
-      <w:r>
-        <w:rPr>
-          <w:rFonts w:ascii="Arial" w:hAnsi="Arial" w:cs="Arial"/>
-        </w:rPr>
-        <w:t>&lt;Expr_Sin_Asignacion&gt; ::= &lt;Expresion&gt; &lt;Fin_Expr&gt;</w:t>
-      </w:r>
-    </w:p>
-    <w:p>
-      <w:pPr>
-        <w:rPr>
-          <w:rFonts w:ascii="Arial" w:hAnsi="Arial" w:cs="Arial"/>
-        </w:rPr>
-      </w:pPr>
+        <w:t>&lt;Tipo_Retorno&gt; ::= "int" | "float" | "char" | "bool"</w:t>
+      </w:r>
+    </w:p>
+    <w:p>
+      <w:pPr>
+        <w:rPr>
+          <w:rFonts w:ascii="Arial" w:hAnsi="Arial" w:cs="Arial"/>
+        </w:rPr>
+      </w:pPr>
+      <w:r>
+        <w:rPr>
+          <w:rFonts w:ascii="Arial" w:hAnsi="Arial" w:cs="Arial"/>
+        </w:rPr>
+        <w:t>&lt;Parametro&gt; ::= &lt;Tipo&gt; &lt;Id&gt;</w:t>
+      </w:r>
+    </w:p>
+    <w:p>
+      <w:pPr>
+        <w:rPr>
+          <w:rFonts w:ascii="Arial" w:hAnsi="Arial" w:cs="Arial"/>
+        </w:rPr>
+      </w:pPr>
+      <w:r>
+        <w:rPr>
+          <w:rFonts w:ascii="Arial" w:hAnsi="Arial" w:cs="Arial"/>
+        </w:rPr>
+        <w:t>&lt;Parametros&gt; ::= &lt;Parametro&gt;</w:t>
+      </w:r>
+    </w:p>
+    <w:p>
+      <w:pPr>
+        <w:rPr>
+          <w:rFonts w:ascii="Arial" w:hAnsi="Arial" w:cs="Arial"/>
+        </w:rPr>
+      </w:pPr>
+      <w:r>
+        <w:rPr>
+          <w:rFonts w:ascii="Arial" w:hAnsi="Arial" w:cs="Arial"/>
+        </w:rPr>
+        <w:t>&lt;Parametros&gt; ::= &lt;Parametro&gt; &lt;Coma&gt; &lt;Parametros&gt;</w:t>
+      </w:r>
+    </w:p>
+    <w:p>
+      <w:pPr>
+        <w:rPr>
+          <w:rFonts w:ascii="Arial" w:hAnsi="Arial" w:cs="Arial"/>
+        </w:rPr>
+      </w:pPr>
+    </w:p>
+    <w:p>
+      <w:pPr>
+        <w:rPr>
+          <w:rFonts w:ascii="Arial" w:hAnsi="Arial" w:cs="Arial"/>
+        </w:rPr>
+      </w:pPr>
+      <w:r>
+        <w:rPr>
+          <w:rFonts w:ascii="Arial" w:hAnsi="Arial" w:cs="Arial"/>
+        </w:rPr>
+        <w:t>&lt;Declaracion_Funcion&gt; ::= &lt;Tipo_Retorno&gt; &lt;Id&gt; &lt;Par_Ini&gt; &lt;Parametros&gt; &lt;Par_Fin&gt; &lt;Bloque&gt;</w:t>
+      </w:r>
+    </w:p>
+    <w:p>
+      <w:pPr>
+        <w:rPr>
+          <w:rFonts w:ascii="Arial" w:hAnsi="Arial" w:cs="Arial"/>
+        </w:rPr>
+      </w:pPr>
+      <w:r>
+        <w:rPr>
+          <w:rFonts w:ascii="Arial" w:hAnsi="Arial" w:cs="Arial"/>
+        </w:rPr>
+        <w:t>&lt;Declaracion_Funcion&gt; ::= &lt;Tipo_Retorno&gt; &lt;Id&gt; &lt;Par_Ini&gt; &lt;Par_Fin&gt; &lt;Bloque&gt;</w:t>
+      </w:r>
+    </w:p>
+    <w:p>
+      <w:pPr>
+        <w:rPr>
+          <w:rFonts w:ascii="Arial" w:hAnsi="Arial" w:cs="Arial"/>
+        </w:rPr>
+      </w:pPr>
+    </w:p>
+    <w:p>
+      <w:pPr>
+        <w:rPr>
+          <w:rFonts w:ascii="Arial" w:hAnsi="Arial" w:cs="Arial"/>
+        </w:rPr>
+      </w:pPr>
+      <w:r>
+        <w:rPr>
+          <w:rFonts w:ascii="Arial" w:hAnsi="Arial" w:cs="Arial"/>
+        </w:rPr>
+        <w:t>&lt;Argumento&gt; ::= &lt;Expresion&gt;</w:t>
+      </w:r>
+    </w:p>
+    <w:p>
+      <w:pPr>
+        <w:rPr>
+          <w:rFonts w:ascii="Arial" w:hAnsi="Arial" w:cs="Arial"/>
+        </w:rPr>
+      </w:pPr>
+      <w:r>
+        <w:rPr>
+          <w:rFonts w:ascii="Arial" w:hAnsi="Arial" w:cs="Arial"/>
+        </w:rPr>
+        <w:t>&lt;Argumentos&gt; ::= &lt;Argumento&gt;</w:t>
+      </w:r>
+    </w:p>
+    <w:p>
+      <w:pPr>
+        <w:rPr>
+          <w:rFonts w:ascii="Arial" w:hAnsi="Arial" w:cs="Arial"/>
+        </w:rPr>
+      </w:pPr>
+      <w:r>
+        <w:rPr>
+          <w:rFonts w:ascii="Arial" w:hAnsi="Arial" w:cs="Arial"/>
+        </w:rPr>
+        <w:t>&lt;Argumentos&gt; ::= &lt;Argumento&gt; &lt;Coma&gt; &lt;Argumentos&gt;</w:t>
+      </w:r>
+    </w:p>
+    <w:p>
+      <w:pPr>
+        <w:rPr>
+          <w:rFonts w:ascii="Arial" w:hAnsi="Arial" w:cs="Arial"/>
+        </w:rPr>
+      </w:pPr>
+    </w:p>
+    <w:p>
+      <w:pPr>
+        <w:rPr>
+          <w:rFonts w:ascii="Arial" w:hAnsi="Arial" w:cs="Arial"/>
+        </w:rPr>
+      </w:pPr>
+      <w:r>
+        <w:rPr>
+          <w:rFonts w:ascii="Arial" w:hAnsi="Arial" w:cs="Arial"/>
+        </w:rPr>
+        <w:t>&lt;Llamada_Funcion&gt; ::= &lt;Id&gt; &lt;Par_Ini&gt; &lt;Argumentos&gt; &lt;Par_Fin&gt;</w:t>
+      </w:r>
+    </w:p>
+    <w:p>
+      <w:pPr>
+        <w:rPr>
+          <w:rFonts w:ascii="Arial" w:hAnsi="Arial" w:cs="Arial"/>
+        </w:rPr>
+      </w:pPr>
+      <w:r>
+        <w:rPr>
+          <w:rFonts w:ascii="Arial" w:hAnsi="Arial" w:cs="Arial"/>
+        </w:rPr>
+        <w:t>&lt;Llamada_Funcion&gt; ::= &lt;Id&gt; &lt;Par_Ini&gt; &lt;Par_Fin&gt;</w:t>
+      </w:r>
+    </w:p>
+    <w:p>
+      <w:pPr>
+        <w:rPr>
+          <w:rFonts w:ascii="Arial" w:hAnsi="Arial" w:cs="Arial"/>
+        </w:rPr>
+      </w:pPr>
+    </w:p>
+    <w:p>
+      <w:pPr>
+        <w:rPr>
+          <w:rFonts w:ascii="Arial" w:hAnsi="Arial" w:cs="Arial"/>
+        </w:rPr>
+      </w:pPr>
+      <w:r>
+        <w:rPr>
+          <w:rFonts w:ascii="Arial" w:hAnsi="Arial" w:cs="Arial"/>
+        </w:rPr>
+        <w:t>&lt;</w:t>
+      </w:r>
+      <w:proofErr w:type="spellStart"/>
+      <w:r>
+        <w:rPr>
+          <w:rFonts w:ascii="Arial" w:hAnsi="Arial" w:cs="Arial"/>
+        </w:rPr>
+        <w:t>Funcion_Main</w:t>
+      </w:r>
+      <w:proofErr w:type="spellEnd"/>
+      <w:r>
+        <w:rPr>
+          <w:rFonts w:ascii="Arial" w:hAnsi="Arial" w:cs="Arial"/>
+        </w:rPr>
+        <w:t>&gt; ::= &lt;Void&gt; &lt;Main&gt; &lt;Par_Ini&gt; &lt;Par_Fin&gt; &lt;Bloque&gt;</w:t>
+      </w:r>
+      <w:r>
+        <w:rPr>
+          <w:rFonts w:ascii="Arial" w:hAnsi="Arial" w:cs="Arial"/>
+        </w:rPr>
+        <w:br/>
+      </w:r>
+      <w:r>
+        <w:rPr>
+          <w:rFonts w:ascii="Arial" w:hAnsi="Arial" w:cs="Arial"/>
+        </w:rPr>
+        <w:br/>
+      </w:r>
     </w:p>
     <w:sectPr>
       <w:pgSz w:w="12240" w:h="15840"/>

</xml_diff>

<commit_message>
Revert "Declaración y llamada de funciones"
This reverts commit 9e1f9fa9250f744be015ad61e2b1b541ba83f2dc.
</commit_message>
<xml_diff>
--- a/Producciones.docx
+++ b/Producciones.docx
@@ -843,20 +843,7 @@
           <w:rFonts w:ascii="Arial" w:hAnsi="Arial" w:cs="Arial"/>
           <w:lang w:val="en-US"/>
         </w:rPr>
-        <w:t>&lt;Main&gt;   ::= "</w:t>
-      </w:r>
-      <w:r>
-        <w:rPr>
-          <w:rFonts w:ascii="Arial" w:hAnsi="Arial" w:cs="Arial"/>
-        </w:rPr>
-        <w:t>principal</w:t>
-      </w:r>
-      <w:r>
-        <w:rPr>
-          <w:rFonts w:ascii="Arial" w:hAnsi="Arial" w:cs="Arial"/>
-          <w:lang w:val="en-US"/>
-        </w:rPr>
-        <w:t>"</w:t>
+        <w:t>&lt;Main&gt;   ::= "main"</w:t>
       </w:r>
     </w:p>
     <w:p>
@@ -1031,14 +1018,6 @@
           <w:lang w:val="en-US"/>
         </w:rPr>
       </w:pPr>
-    </w:p>
-    <w:p>
-      <w:pPr>
-        <w:rPr>
-          <w:rFonts w:ascii="Arial" w:hAnsi="Arial" w:cs="Arial"/>
-          <w:lang w:val="en-US"/>
-        </w:rPr>
-      </w:pPr>
       <w:r>
         <w:rPr>
           <w:rFonts w:ascii="Arial" w:hAnsi="Arial" w:cs="Arial"/>
@@ -1147,326 +1126,340 @@
           <w:rFonts w:ascii="Arial" w:hAnsi="Arial" w:cs="Arial"/>
           <w:lang w:val="es-CR"/>
         </w:rPr>
+        <w:t>&lt;Arreglo&gt; ::= &lt;Arreglo_Float&gt;</w:t>
+      </w:r>
+    </w:p>
+    <w:p>
+      <w:pPr>
+        <w:rPr>
+          <w:rFonts w:ascii="Arial" w:hAnsi="Arial" w:cs="Arial"/>
+          <w:lang w:val="es-CR"/>
+        </w:rPr>
+      </w:pPr>
+    </w:p>
+    <w:p>
+      <w:pPr>
+        <w:rPr>
+          <w:rFonts w:ascii="Arial" w:hAnsi="Arial" w:cs="Arial"/>
+        </w:rPr>
+      </w:pPr>
+      <w:r>
+        <w:rPr>
+          <w:rFonts w:ascii="Arial" w:hAnsi="Arial" w:cs="Arial"/>
+        </w:rPr>
+        <w:t>&lt;Indice&gt; ::= &lt;Lit_Int&gt;</w:t>
+      </w:r>
+    </w:p>
+    <w:p>
+      <w:pPr>
+        <w:rPr>
+          <w:rFonts w:ascii="Arial" w:hAnsi="Arial" w:cs="Arial"/>
+        </w:rPr>
+      </w:pPr>
+    </w:p>
+    <w:p>
+      <w:pPr>
+        <w:rPr>
+          <w:rFonts w:ascii="Arial" w:hAnsi="Arial" w:cs="Arial"/>
+        </w:rPr>
+      </w:pPr>
+    </w:p>
+    <w:p>
+      <w:pPr>
+        <w:rPr>
+          <w:rFonts w:ascii="Arial" w:hAnsi="Arial" w:cs="Arial"/>
+        </w:rPr>
+      </w:pPr>
+      <w:r>
+        <w:rPr>
+          <w:rFonts w:ascii="Arial" w:hAnsi="Arial" w:cs="Arial"/>
+        </w:rPr>
+        <w:t>&lt;Acceso_Arreglo&gt; ::= &lt;Id&gt; &lt;Cor_Ini&gt; &lt;Indice&gt; &lt;Cor_Fin&gt;</w:t>
+      </w:r>
+    </w:p>
+    <w:p>
+      <w:pPr>
+        <w:rPr>
+          <w:rFonts w:ascii="Arial" w:hAnsi="Arial" w:cs="Arial"/>
+        </w:rPr>
+      </w:pPr>
+      <w:r>
+        <w:rPr>
+          <w:rFonts w:ascii="Arial" w:hAnsi="Arial" w:cs="Arial"/>
+        </w:rPr>
+        <w:t>&lt;Asignacion_Arreglo&gt; ::= &lt;Acceso_Arreglo&gt; &lt;Op_Asig&gt; &lt;Expresion&gt; &lt;Fin_Expr&gt;</w:t>
+      </w:r>
+    </w:p>
+    <w:p>
+      <w:pPr>
+        <w:rPr>
+          <w:rFonts w:ascii="Arial" w:hAnsi="Arial" w:cs="Arial"/>
+        </w:rPr>
+      </w:pPr>
+    </w:p>
+    <w:p>
+      <w:pPr>
+        <w:rPr>
+          <w:rFonts w:ascii="Arial" w:hAnsi="Arial" w:cs="Arial"/>
+          <w:lang w:val="en-US"/>
+        </w:rPr>
+      </w:pPr>
+      <w:r>
+        <w:rPr>
+          <w:rFonts w:ascii="Arial" w:hAnsi="Arial" w:cs="Arial"/>
+          <w:lang w:val="en-US"/>
+        </w:rPr>
+        <w:t>&lt;Expr_Negativo&gt; ::= &lt;Op_Neg&gt; &lt;Lit_Int&gt;</w:t>
+      </w:r>
+    </w:p>
+    <w:p>
+      <w:pPr>
+        <w:rPr>
+          <w:rFonts w:ascii="Arial" w:hAnsi="Arial" w:cs="Arial"/>
+          <w:lang w:val="en-US"/>
+        </w:rPr>
+      </w:pPr>
+      <w:r>
+        <w:rPr>
+          <w:rFonts w:ascii="Arial" w:hAnsi="Arial" w:cs="Arial"/>
+          <w:lang w:val="en-US"/>
+        </w:rPr>
+        <w:t>&lt;Expr_Negativo&gt; ::= &lt;Op_Neg&gt; &lt;Lit_Float&gt;</w:t>
+      </w:r>
+    </w:p>
+    <w:p>
+      <w:pPr>
+        <w:rPr>
+          <w:rFonts w:ascii="Arial" w:hAnsi="Arial" w:cs="Arial"/>
+          <w:lang w:val="en-US"/>
+        </w:rPr>
+      </w:pPr>
+    </w:p>
+    <w:p>
+      <w:pPr>
+        <w:rPr>
+          <w:rFonts w:ascii="Arial" w:hAnsi="Arial" w:cs="Arial"/>
+          <w:lang w:val="en-US"/>
+        </w:rPr>
+      </w:pPr>
+      <w:r>
+        <w:rPr>
+          <w:rFonts w:ascii="Arial" w:hAnsi="Arial" w:cs="Arial"/>
+          <w:lang w:val="en-US"/>
+        </w:rPr>
+        <w:t>&lt;Expr_Incremento&gt; ::= &lt;Id&gt; &lt;Op_Inc&gt;</w:t>
+      </w:r>
+    </w:p>
+    <w:p>
+      <w:pPr>
+        <w:rPr>
+          <w:rFonts w:ascii="Arial" w:hAnsi="Arial" w:cs="Arial"/>
+          <w:lang w:val="en-US"/>
+        </w:rPr>
+      </w:pPr>
+      <w:r>
+        <w:rPr>
+          <w:rFonts w:ascii="Arial" w:hAnsi="Arial" w:cs="Arial"/>
+          <w:lang w:val="en-US"/>
+        </w:rPr>
+        <w:t>&lt;Expr_Decremento&gt; ::= &lt;Id&gt; &lt;Op_Dec&gt;</w:t>
+      </w:r>
+    </w:p>
+    <w:p>
+      <w:pPr>
+        <w:rPr>
+          <w:rFonts w:ascii="Arial" w:hAnsi="Arial" w:cs="Arial"/>
+          <w:lang w:val="en-US"/>
+        </w:rPr>
+      </w:pPr>
+    </w:p>
+    <w:p>
+      <w:pPr>
+        <w:rPr>
+          <w:rFonts w:ascii="Arial" w:hAnsi="Arial" w:cs="Arial"/>
+          <w:lang w:val="en-US"/>
+        </w:rPr>
+      </w:pPr>
+      <w:r>
+        <w:rPr>
+          <w:rFonts w:ascii="Arial" w:hAnsi="Arial" w:cs="Arial"/>
+          <w:lang w:val="en-US"/>
+        </w:rPr>
+        <w:t>&lt;Operando&gt; ::= &lt;Id&gt;</w:t>
+      </w:r>
+    </w:p>
+    <w:p>
+      <w:pPr>
+        <w:rPr>
+          <w:rFonts w:ascii="Arial" w:hAnsi="Arial" w:cs="Arial"/>
+          <w:lang w:val="en-US"/>
+        </w:rPr>
+      </w:pPr>
+      <w:r>
+        <w:rPr>
+          <w:rFonts w:ascii="Arial" w:hAnsi="Arial" w:cs="Arial"/>
+          <w:lang w:val="en-US"/>
+        </w:rPr>
+        <w:t>&lt;Operando&gt; ::= &lt;Lit_Int&gt;</w:t>
+      </w:r>
+    </w:p>
+    <w:p>
+      <w:pPr>
+        <w:rPr>
+          <w:rFonts w:ascii="Arial" w:hAnsi="Arial" w:cs="Arial"/>
+          <w:lang w:val="en-US"/>
+        </w:rPr>
+      </w:pPr>
+      <w:r>
+        <w:rPr>
+          <w:rFonts w:ascii="Arial" w:hAnsi="Arial" w:cs="Arial"/>
+          <w:lang w:val="en-US"/>
+        </w:rPr>
+        <w:t>&lt;Operando&gt; ::= &lt;Lit_Float&gt;</w:t>
+      </w:r>
+    </w:p>
+    <w:p>
+      <w:pPr>
+        <w:rPr>
+          <w:rFonts w:ascii="Arial" w:hAnsi="Arial" w:cs="Arial"/>
+        </w:rPr>
+      </w:pPr>
+      <w:r>
+        <w:rPr>
+          <w:rFonts w:ascii="Arial" w:hAnsi="Arial" w:cs="Arial"/>
+        </w:rPr>
+        <w:t>&lt;Operando&gt; ::= &lt;Acceso_Arreglo&gt;</w:t>
+      </w:r>
+    </w:p>
+    <w:p>
+      <w:pPr>
+        <w:rPr>
+          <w:rFonts w:ascii="Arial" w:hAnsi="Arial" w:cs="Arial"/>
+        </w:rPr>
+      </w:pPr>
+      <w:r>
+        <w:rPr>
+          <w:rFonts w:ascii="Arial" w:hAnsi="Arial" w:cs="Arial"/>
+        </w:rPr>
+        <w:t>&lt;Operando&gt; ::= &lt;Par_Ini&gt; &lt;Expr_Aritmetica&gt; &lt;Par_Fin&gt;</w:t>
+      </w:r>
+    </w:p>
+    <w:p>
+      <w:pPr>
+        <w:rPr>
+          <w:rFonts w:ascii="Arial" w:hAnsi="Arial" w:cs="Arial"/>
+        </w:rPr>
+      </w:pPr>
+      <w:r>
+        <w:rPr>
+          <w:rFonts w:ascii="Arial" w:hAnsi="Arial" w:cs="Arial"/>
+        </w:rPr>
+        <w:t>&lt;Operando&gt; ::= &lt;Expr_Negativo&gt;</w:t>
+      </w:r>
+    </w:p>
+    <w:p>
+      <w:pPr>
+        <w:rPr>
+          <w:rFonts w:ascii="Arial" w:hAnsi="Arial" w:cs="Arial"/>
+        </w:rPr>
+      </w:pPr>
+      <w:r>
+        <w:rPr>
+          <w:rFonts w:ascii="Arial" w:hAnsi="Arial" w:cs="Arial"/>
+        </w:rPr>
+        <w:t>&lt;Operando&gt; ::= &lt;Expr_Incremento&gt;</w:t>
+      </w:r>
+    </w:p>
+    <w:p>
+      <w:pPr>
+        <w:rPr>
+          <w:rFonts w:ascii="Arial" w:hAnsi="Arial" w:cs="Arial"/>
+        </w:rPr>
+      </w:pPr>
+      <w:r>
+        <w:rPr>
+          <w:rFonts w:ascii="Arial" w:hAnsi="Arial" w:cs="Arial"/>
+        </w:rPr>
+        <w:t>&lt;Operando&gt; ::= &lt;Expr_Decremento&gt;</w:t>
+      </w:r>
+    </w:p>
+    <w:p>
+      <w:pPr>
+        <w:rPr>
+          <w:rFonts w:ascii="Arial" w:hAnsi="Arial" w:cs="Arial"/>
+        </w:rPr>
+      </w:pPr>
+      <w:r>
+        <w:rPr>
+          <w:rFonts w:ascii="Arial" w:hAnsi="Arial" w:cs="Arial"/>
+        </w:rPr>
+        <w:t>&lt;Operando&gt; ::= &lt;Llamada_Funcion&gt;</w:t>
+      </w:r>
+    </w:p>
+    <w:p>
+      <w:pPr>
+        <w:rPr>
+          <w:rFonts w:ascii="Arial" w:hAnsi="Arial" w:cs="Arial"/>
+        </w:rPr>
+      </w:pPr>
+    </w:p>
+    <w:p>
+      <w:pPr>
+        <w:rPr>
+          <w:rFonts w:ascii="Arial" w:hAnsi="Arial" w:cs="Arial"/>
+        </w:rPr>
+      </w:pPr>
+      <w:r>
+        <w:rPr>
+          <w:rFonts w:ascii="Arial" w:hAnsi="Arial" w:cs="Arial"/>
+        </w:rPr>
+        <w:t>&lt;Expr_Potencia&gt; ::= &lt;Operando&gt;</w:t>
+      </w:r>
+    </w:p>
+    <w:p>
+      <w:pPr>
+        <w:rPr>
+          <w:rFonts w:ascii="Arial" w:hAnsi="Arial" w:cs="Arial"/>
+        </w:rPr>
+      </w:pPr>
+      <w:r>
+        <w:rPr>
+          <w:rFonts w:ascii="Arial" w:hAnsi="Arial" w:cs="Arial"/>
+        </w:rPr>
+        <w:t>&lt;Expr_Potencia&gt; ::= &lt;Operando&gt; &lt;Op_Pot&gt; &lt;Expr_Potencia&gt;</w:t>
+      </w:r>
+    </w:p>
+    <w:p>
+      <w:pPr>
+        <w:rPr>
+          <w:rFonts w:ascii="Arial" w:hAnsi="Arial" w:cs="Arial"/>
+        </w:rPr>
+      </w:pPr>
+    </w:p>
+    <w:p>
+      <w:pPr>
+        <w:rPr>
+          <w:rFonts w:ascii="Arial" w:hAnsi="Arial" w:cs="Arial"/>
+        </w:rPr>
+      </w:pPr>
+      <w:r>
+        <w:rPr>
+          <w:rFonts w:ascii="Arial" w:hAnsi="Arial" w:cs="Arial"/>
+        </w:rPr>
+        <w:t>&lt;Expr_Suma_Resta&gt; ::= &lt;Expr_Potencia&gt;</w:t>
+      </w:r>
+    </w:p>
+    <w:p>
+      <w:pPr>
+        <w:rPr>
+          <w:rFonts w:ascii="Arial" w:hAnsi="Arial" w:cs="Arial"/>
+        </w:rPr>
+      </w:pPr>
+      <w:r>
+        <w:rPr>
+          <w:rFonts w:ascii="Arial" w:hAnsi="Arial" w:cs="Arial"/>
+        </w:rPr>
         <w:lastRenderedPageBreak/>
-        <w:t>&lt;Arreglo&gt; ::= &lt;Arreglo_Float&gt;</w:t>
-      </w:r>
-    </w:p>
-    <w:p>
-      <w:pPr>
-        <w:rPr>
-          <w:rFonts w:ascii="Arial" w:hAnsi="Arial" w:cs="Arial"/>
-          <w:lang w:val="es-CR"/>
-        </w:rPr>
-      </w:pPr>
-    </w:p>
-    <w:p>
-      <w:pPr>
-        <w:rPr>
-          <w:rFonts w:ascii="Arial" w:hAnsi="Arial" w:cs="Arial"/>
-        </w:rPr>
-      </w:pPr>
-      <w:r>
-        <w:rPr>
-          <w:rFonts w:ascii="Arial" w:hAnsi="Arial" w:cs="Arial"/>
-        </w:rPr>
-        <w:t>&lt;Indice&gt; ::= &lt;Lit_Int&gt;</w:t>
-      </w:r>
-    </w:p>
-    <w:p>
-      <w:pPr>
-        <w:rPr>
-          <w:rFonts w:ascii="Arial" w:hAnsi="Arial" w:cs="Arial"/>
-        </w:rPr>
-      </w:pPr>
-      <w:r>
-        <w:rPr>
-          <w:rFonts w:ascii="Arial" w:hAnsi="Arial" w:cs="Arial"/>
-        </w:rPr>
-        <w:t>&lt;Acceso_Arreglo&gt; ::= &lt;Id&gt; &lt;Cor_Ini&gt; &lt;Indice&gt; &lt;Cor_Fin&gt;</w:t>
-      </w:r>
-    </w:p>
-    <w:p>
-      <w:pPr>
-        <w:rPr>
-          <w:rFonts w:ascii="Arial" w:hAnsi="Arial" w:cs="Arial"/>
-        </w:rPr>
-      </w:pPr>
-      <w:r>
-        <w:rPr>
-          <w:rFonts w:ascii="Arial" w:hAnsi="Arial" w:cs="Arial"/>
-        </w:rPr>
-        <w:t>&lt;Asignacion_Arreglo&gt; ::= &lt;Acceso_Arreglo&gt; &lt;Op_Asig&gt; &lt;Expresion&gt; &lt;Fin_Expr&gt;</w:t>
-      </w:r>
-    </w:p>
-    <w:p>
-      <w:pPr>
-        <w:rPr>
-          <w:rFonts w:ascii="Arial" w:hAnsi="Arial" w:cs="Arial"/>
-        </w:rPr>
-      </w:pPr>
-    </w:p>
-    <w:p>
-      <w:pPr>
-        <w:rPr>
-          <w:rFonts w:ascii="Arial" w:hAnsi="Arial" w:cs="Arial"/>
-          <w:lang w:val="en-US"/>
-        </w:rPr>
-      </w:pPr>
-      <w:r>
-        <w:rPr>
-          <w:rFonts w:ascii="Arial" w:hAnsi="Arial" w:cs="Arial"/>
-          <w:lang w:val="en-US"/>
-        </w:rPr>
-        <w:t>&lt;Expr_Negativo&gt; ::= &lt;Op_Neg&gt; &lt;Lit_Int&gt;</w:t>
-      </w:r>
-    </w:p>
-    <w:p>
-      <w:pPr>
-        <w:rPr>
-          <w:rFonts w:ascii="Arial" w:hAnsi="Arial" w:cs="Arial"/>
-          <w:lang w:val="en-US"/>
-        </w:rPr>
-      </w:pPr>
-      <w:r>
-        <w:rPr>
-          <w:rFonts w:ascii="Arial" w:hAnsi="Arial" w:cs="Arial"/>
-          <w:lang w:val="en-US"/>
-        </w:rPr>
-        <w:t>&lt;Expr_Negativo&gt; ::= &lt;Op_Neg&gt; &lt;Lit_Float&gt;</w:t>
-      </w:r>
-    </w:p>
-    <w:p>
-      <w:pPr>
-        <w:rPr>
-          <w:rFonts w:ascii="Arial" w:hAnsi="Arial" w:cs="Arial"/>
-          <w:lang w:val="en-US"/>
-        </w:rPr>
-      </w:pPr>
-    </w:p>
-    <w:p>
-      <w:pPr>
-        <w:rPr>
-          <w:rFonts w:ascii="Arial" w:hAnsi="Arial" w:cs="Arial"/>
-          <w:lang w:val="en-US"/>
-        </w:rPr>
-      </w:pPr>
-      <w:r>
-        <w:rPr>
-          <w:rFonts w:ascii="Arial" w:hAnsi="Arial" w:cs="Arial"/>
-          <w:lang w:val="en-US"/>
-        </w:rPr>
-        <w:t>&lt;Expr_Incremento&gt; ::= &lt;Id&gt; &lt;Op_Inc&gt;</w:t>
-      </w:r>
-    </w:p>
-    <w:p>
-      <w:pPr>
-        <w:rPr>
-          <w:rFonts w:ascii="Arial" w:hAnsi="Arial" w:cs="Arial"/>
-          <w:lang w:val="en-US"/>
-        </w:rPr>
-      </w:pPr>
-      <w:r>
-        <w:rPr>
-          <w:rFonts w:ascii="Arial" w:hAnsi="Arial" w:cs="Arial"/>
-          <w:lang w:val="en-US"/>
-        </w:rPr>
-        <w:t>&lt;Expr_Decremento&gt; ::= &lt;Id&gt; &lt;Op_Dec&gt;</w:t>
-      </w:r>
-    </w:p>
-    <w:p>
-      <w:pPr>
-        <w:rPr>
-          <w:rFonts w:ascii="Arial" w:hAnsi="Arial" w:cs="Arial"/>
-          <w:lang w:val="en-US"/>
-        </w:rPr>
-      </w:pPr>
-    </w:p>
-    <w:p>
-      <w:pPr>
-        <w:rPr>
-          <w:rFonts w:ascii="Arial" w:hAnsi="Arial" w:cs="Arial"/>
-          <w:lang w:val="en-US"/>
-        </w:rPr>
-      </w:pPr>
-      <w:r>
-        <w:rPr>
-          <w:rFonts w:ascii="Arial" w:hAnsi="Arial" w:cs="Arial"/>
-          <w:lang w:val="en-US"/>
-        </w:rPr>
-        <w:t>&lt;Operando&gt; ::= &lt;Id&gt;</w:t>
-      </w:r>
-    </w:p>
-    <w:p>
-      <w:pPr>
-        <w:rPr>
-          <w:rFonts w:ascii="Arial" w:hAnsi="Arial" w:cs="Arial"/>
-          <w:lang w:val="en-US"/>
-        </w:rPr>
-      </w:pPr>
-      <w:r>
-        <w:rPr>
-          <w:rFonts w:ascii="Arial" w:hAnsi="Arial" w:cs="Arial"/>
-          <w:lang w:val="en-US"/>
-        </w:rPr>
-        <w:t>&lt;Operando&gt; ::= &lt;Lit_Int&gt;</w:t>
-      </w:r>
-    </w:p>
-    <w:p>
-      <w:pPr>
-        <w:rPr>
-          <w:rFonts w:ascii="Arial" w:hAnsi="Arial" w:cs="Arial"/>
-          <w:lang w:val="en-US"/>
-        </w:rPr>
-      </w:pPr>
-      <w:r>
-        <w:rPr>
-          <w:rFonts w:ascii="Arial" w:hAnsi="Arial" w:cs="Arial"/>
-          <w:lang w:val="en-US"/>
-        </w:rPr>
-        <w:t>&lt;Operando&gt; ::= &lt;Lit_Float&gt;</w:t>
-      </w:r>
-    </w:p>
-    <w:p>
-      <w:pPr>
-        <w:rPr>
-          <w:rFonts w:ascii="Arial" w:hAnsi="Arial" w:cs="Arial"/>
-        </w:rPr>
-      </w:pPr>
-      <w:r>
-        <w:rPr>
-          <w:rFonts w:ascii="Arial" w:hAnsi="Arial" w:cs="Arial"/>
-        </w:rPr>
-        <w:t>&lt;Operando&gt; ::= &lt;Acceso_Arreglo&gt;</w:t>
-      </w:r>
-    </w:p>
-    <w:p>
-      <w:pPr>
-        <w:rPr>
-          <w:rFonts w:ascii="Arial" w:hAnsi="Arial" w:cs="Arial"/>
-        </w:rPr>
-      </w:pPr>
-      <w:r>
-        <w:rPr>
-          <w:rFonts w:ascii="Arial" w:hAnsi="Arial" w:cs="Arial"/>
-        </w:rPr>
-        <w:t>&lt;Operando&gt; ::= &lt;Par_Ini&gt; &lt;Expr_Aritmetica&gt; &lt;Par_Fin&gt;</w:t>
-      </w:r>
-    </w:p>
-    <w:p>
-      <w:pPr>
-        <w:rPr>
-          <w:rFonts w:ascii="Arial" w:hAnsi="Arial" w:cs="Arial"/>
-        </w:rPr>
-      </w:pPr>
-      <w:r>
-        <w:rPr>
-          <w:rFonts w:ascii="Arial" w:hAnsi="Arial" w:cs="Arial"/>
-        </w:rPr>
-        <w:t>&lt;Operando&gt; ::= &lt;Expr_Negativo&gt;</w:t>
-      </w:r>
-    </w:p>
-    <w:p>
-      <w:pPr>
-        <w:rPr>
-          <w:rFonts w:ascii="Arial" w:hAnsi="Arial" w:cs="Arial"/>
-        </w:rPr>
-      </w:pPr>
-      <w:r>
-        <w:rPr>
-          <w:rFonts w:ascii="Arial" w:hAnsi="Arial" w:cs="Arial"/>
-        </w:rPr>
-        <w:t>&lt;Operando&gt; ::= &lt;Expr_Incremento&gt;</w:t>
-      </w:r>
-    </w:p>
-    <w:p>
-      <w:pPr>
-        <w:rPr>
-          <w:rFonts w:ascii="Arial" w:hAnsi="Arial" w:cs="Arial"/>
-        </w:rPr>
-      </w:pPr>
-      <w:r>
-        <w:rPr>
-          <w:rFonts w:ascii="Arial" w:hAnsi="Arial" w:cs="Arial"/>
-        </w:rPr>
-        <w:t>&lt;Operando&gt; ::= &lt;Expr_Decremento&gt;</w:t>
-      </w:r>
-    </w:p>
-    <w:p>
-      <w:pPr>
-        <w:rPr>
-          <w:rFonts w:ascii="Arial" w:hAnsi="Arial" w:cs="Arial"/>
-        </w:rPr>
-      </w:pPr>
-      <w:r>
-        <w:rPr>
-          <w:rFonts w:ascii="Arial" w:hAnsi="Arial" w:cs="Arial"/>
-        </w:rPr>
-        <w:t>&lt;Operando&gt; ::= &lt;Llamada_Funcion&gt;</w:t>
-      </w:r>
-    </w:p>
-    <w:p>
-      <w:pPr>
-        <w:rPr>
-          <w:rFonts w:ascii="Arial" w:hAnsi="Arial" w:cs="Arial"/>
-        </w:rPr>
-      </w:pPr>
-    </w:p>
-    <w:p>
-      <w:pPr>
-        <w:rPr>
-          <w:rFonts w:ascii="Arial" w:hAnsi="Arial" w:cs="Arial"/>
-        </w:rPr>
-      </w:pPr>
-      <w:r>
-        <w:rPr>
-          <w:rFonts w:ascii="Arial" w:hAnsi="Arial" w:cs="Arial"/>
-        </w:rPr>
-        <w:t>&lt;Expr_Potencia&gt; ::= &lt;Operando&gt;</w:t>
-      </w:r>
-    </w:p>
-    <w:p>
-      <w:pPr>
-        <w:rPr>
-          <w:rFonts w:ascii="Arial" w:hAnsi="Arial" w:cs="Arial"/>
-        </w:rPr>
-      </w:pPr>
-      <w:r>
-        <w:rPr>
-          <w:rFonts w:ascii="Arial" w:hAnsi="Arial" w:cs="Arial"/>
-        </w:rPr>
-        <w:t>&lt;Expr_Potencia&gt; ::= &lt;Operando&gt; &lt;Op_Pot&gt; &lt;Expr_Potencia&gt;</w:t>
-      </w:r>
-    </w:p>
-    <w:p>
-      <w:pPr>
-        <w:rPr>
-          <w:rFonts w:ascii="Arial" w:hAnsi="Arial" w:cs="Arial"/>
-        </w:rPr>
-      </w:pPr>
-    </w:p>
-    <w:p>
-      <w:pPr>
-        <w:rPr>
-          <w:rFonts w:ascii="Arial" w:hAnsi="Arial" w:cs="Arial"/>
-        </w:rPr>
-      </w:pPr>
-      <w:r>
-        <w:rPr>
-          <w:rFonts w:ascii="Arial" w:hAnsi="Arial" w:cs="Arial"/>
-        </w:rPr>
-        <w:t>&lt;Expr_Suma_Resta&gt; ::= &lt;Expr_Potencia&gt;</w:t>
-      </w:r>
-    </w:p>
-    <w:p>
-      <w:pPr>
-        <w:rPr>
-          <w:rFonts w:ascii="Arial" w:hAnsi="Arial" w:cs="Arial"/>
-        </w:rPr>
-      </w:pPr>
-      <w:r>
-        <w:rPr>
-          <w:rFonts w:ascii="Arial" w:hAnsi="Arial" w:cs="Arial"/>
-        </w:rPr>
         <w:t>&lt;Expr_Suma_Resta&gt; ::= &lt;Expr_Potencia&gt; &lt;Op_Suma&gt; &lt;Expr_Suma_Resta&gt;</w:t>
       </w:r>
     </w:p>
@@ -1480,276 +1473,276 @@
         <w:rPr>
           <w:rFonts w:ascii="Arial" w:hAnsi="Arial" w:cs="Arial"/>
         </w:rPr>
+        <w:t>&lt;Expr_Suma_Resta&gt; ::= &lt;Expr_Potencia&gt; &lt;Op_Resta&gt; &lt;Expr_Suma_Resta&gt;</w:t>
+      </w:r>
+    </w:p>
+    <w:p>
+      <w:pPr>
+        <w:rPr>
+          <w:rFonts w:ascii="Arial" w:hAnsi="Arial" w:cs="Arial"/>
+        </w:rPr>
+      </w:pPr>
+    </w:p>
+    <w:p>
+      <w:pPr>
+        <w:rPr>
+          <w:rFonts w:ascii="Arial" w:hAnsi="Arial" w:cs="Arial"/>
+        </w:rPr>
+      </w:pPr>
+      <w:r>
+        <w:rPr>
+          <w:rFonts w:ascii="Arial" w:hAnsi="Arial" w:cs="Arial"/>
+        </w:rPr>
+        <w:t>&lt;Expr_Mult_Div&gt; ::= &lt;Expr_Suma_Resta&gt;</w:t>
+      </w:r>
+    </w:p>
+    <w:p>
+      <w:pPr>
+        <w:rPr>
+          <w:rFonts w:ascii="Arial" w:hAnsi="Arial" w:cs="Arial"/>
+        </w:rPr>
+      </w:pPr>
+      <w:r>
+        <w:rPr>
+          <w:rFonts w:ascii="Arial" w:hAnsi="Arial" w:cs="Arial"/>
+        </w:rPr>
+        <w:t>&lt;Expr_Mult_Div&gt; ::= &lt;Expr_Suma_Resta&gt; &lt;Op_Mult&gt; &lt;Expr_Mult_Div&gt;</w:t>
+      </w:r>
+    </w:p>
+    <w:p>
+      <w:pPr>
+        <w:rPr>
+          <w:rFonts w:ascii="Arial" w:hAnsi="Arial" w:cs="Arial"/>
+        </w:rPr>
+      </w:pPr>
+      <w:r>
+        <w:rPr>
+          <w:rFonts w:ascii="Arial" w:hAnsi="Arial" w:cs="Arial"/>
+        </w:rPr>
+        <w:t>&lt;Expr_Mult_Div&gt; ::= &lt;Expr_Suma_Resta&gt; &lt;Op_Div&gt; &lt;Expr_Mult_Div&gt;</w:t>
+      </w:r>
+    </w:p>
+    <w:p>
+      <w:pPr>
+        <w:rPr>
+          <w:rFonts w:ascii="Arial" w:hAnsi="Arial" w:cs="Arial"/>
+        </w:rPr>
+      </w:pPr>
+      <w:r>
+        <w:rPr>
+          <w:rFonts w:ascii="Arial" w:hAnsi="Arial" w:cs="Arial"/>
+        </w:rPr>
+        <w:t>&lt;Expr_Mult_Div&gt; ::= &lt;Expr_Suma_Resta&gt; &lt;Op_DivEnt&gt; &lt;Expr_Mult_Div&gt;</w:t>
+      </w:r>
+    </w:p>
+    <w:p>
+      <w:pPr>
+        <w:rPr>
+          <w:rFonts w:ascii="Arial" w:hAnsi="Arial" w:cs="Arial"/>
+        </w:rPr>
+      </w:pPr>
+    </w:p>
+    <w:p>
+      <w:pPr>
+        <w:rPr>
+          <w:rFonts w:ascii="Arial" w:hAnsi="Arial" w:cs="Arial"/>
+        </w:rPr>
+      </w:pPr>
+      <w:r>
+        <w:rPr>
+          <w:rFonts w:ascii="Arial" w:hAnsi="Arial" w:cs="Arial"/>
+        </w:rPr>
+        <w:t>&lt;Expr_Aritmetica&gt; ::= &lt;Expr_Mult_Div&gt;</w:t>
+      </w:r>
+    </w:p>
+    <w:p>
+      <w:pPr>
+        <w:rPr>
+          <w:rFonts w:ascii="Arial" w:hAnsi="Arial" w:cs="Arial"/>
+        </w:rPr>
+      </w:pPr>
+      <w:r>
+        <w:rPr>
+          <w:rFonts w:ascii="Arial" w:hAnsi="Arial" w:cs="Arial"/>
+        </w:rPr>
+        <w:t>&lt;Expr_Aritmetica&gt; ::= &lt;Expr_Mult_Div&gt; &lt;Op_Mod&gt; &lt;Expr_Aritmetica&gt;</w:t>
+      </w:r>
+    </w:p>
+    <w:p>
+      <w:pPr>
+        <w:rPr>
+          <w:rFonts w:ascii="Arial" w:hAnsi="Arial" w:cs="Arial"/>
+        </w:rPr>
+      </w:pPr>
+    </w:p>
+    <w:p>
+      <w:pPr>
+        <w:rPr>
+          <w:rFonts w:ascii="Arial" w:hAnsi="Arial" w:cs="Arial"/>
+        </w:rPr>
+      </w:pPr>
+      <w:r>
+        <w:rPr>
+          <w:rFonts w:ascii="Arial" w:hAnsi="Arial" w:cs="Arial"/>
+        </w:rPr>
+        <w:t>&lt;Operando_Relacional&gt; ::= &lt;Id&gt;</w:t>
+      </w:r>
+    </w:p>
+    <w:p>
+      <w:pPr>
+        <w:rPr>
+          <w:rFonts w:ascii="Arial" w:hAnsi="Arial" w:cs="Arial"/>
+        </w:rPr>
+      </w:pPr>
+      <w:r>
+        <w:rPr>
+          <w:rFonts w:ascii="Arial" w:hAnsi="Arial" w:cs="Arial"/>
+        </w:rPr>
+        <w:t>&lt;Operando_Relacional&gt; ::= &lt;Lit_Int&gt;</w:t>
+      </w:r>
+    </w:p>
+    <w:p>
+      <w:pPr>
+        <w:rPr>
+          <w:rFonts w:ascii="Arial" w:hAnsi="Arial" w:cs="Arial"/>
+        </w:rPr>
+      </w:pPr>
+      <w:r>
+        <w:rPr>
+          <w:rFonts w:ascii="Arial" w:hAnsi="Arial" w:cs="Arial"/>
+        </w:rPr>
+        <w:t>&lt;Operando_Relacional&gt; ::= &lt;Lit_Float&gt;</w:t>
+      </w:r>
+    </w:p>
+    <w:p>
+      <w:pPr>
+        <w:rPr>
+          <w:rFonts w:ascii="Arial" w:hAnsi="Arial" w:cs="Arial"/>
+        </w:rPr>
+      </w:pPr>
+      <w:r>
+        <w:rPr>
+          <w:rFonts w:ascii="Arial" w:hAnsi="Arial" w:cs="Arial"/>
+        </w:rPr>
+        <w:t>&lt;Operando_Relacional&gt; ::= &lt;Acceso_Arreglo&gt;</w:t>
+      </w:r>
+    </w:p>
+    <w:p>
+      <w:pPr>
+        <w:rPr>
+          <w:rFonts w:ascii="Arial" w:hAnsi="Arial" w:cs="Arial"/>
+        </w:rPr>
+      </w:pPr>
+      <w:r>
+        <w:rPr>
+          <w:rFonts w:ascii="Arial" w:hAnsi="Arial" w:cs="Arial"/>
+        </w:rPr>
+        <w:t>&lt;Operando_Relacional&gt; ::= &lt;Llamada_Funcion&gt;</w:t>
+      </w:r>
+    </w:p>
+    <w:p>
+      <w:pPr>
+        <w:rPr>
+          <w:rFonts w:ascii="Arial" w:hAnsi="Arial" w:cs="Arial"/>
+        </w:rPr>
+      </w:pPr>
+    </w:p>
+    <w:p>
+      <w:pPr>
+        <w:rPr>
+          <w:rFonts w:ascii="Arial" w:hAnsi="Arial" w:cs="Arial"/>
+        </w:rPr>
+      </w:pPr>
+      <w:r>
+        <w:rPr>
+          <w:rFonts w:ascii="Arial" w:hAnsi="Arial" w:cs="Arial"/>
+        </w:rPr>
+        <w:t>&lt;Operando_Igualdad&gt; ::= &lt;Operando_Relacional&gt;</w:t>
+      </w:r>
+    </w:p>
+    <w:p>
+      <w:pPr>
+        <w:rPr>
+          <w:rFonts w:ascii="Arial" w:hAnsi="Arial" w:cs="Arial"/>
+        </w:rPr>
+      </w:pPr>
+      <w:r>
+        <w:rPr>
+          <w:rFonts w:ascii="Arial" w:hAnsi="Arial" w:cs="Arial"/>
+        </w:rPr>
+        <w:t>&lt;Operando_Igualdad&gt; ::= &lt;Lit_Bool&gt;</w:t>
+      </w:r>
+    </w:p>
+    <w:p>
+      <w:pPr>
+        <w:rPr>
+          <w:rFonts w:ascii="Arial" w:hAnsi="Arial" w:cs="Arial"/>
+        </w:rPr>
+      </w:pPr>
+      <w:r>
+        <w:rPr>
+          <w:rFonts w:ascii="Arial" w:hAnsi="Arial" w:cs="Arial"/>
+        </w:rPr>
+        <w:t>&lt;Operando_Igualdad&gt; ::= &lt;Lit_Char&gt;</w:t>
+      </w:r>
+    </w:p>
+    <w:p>
+      <w:pPr>
+        <w:rPr>
+          <w:rFonts w:ascii="Arial" w:hAnsi="Arial" w:cs="Arial"/>
+        </w:rPr>
+      </w:pPr>
+    </w:p>
+    <w:p>
+      <w:pPr>
+        <w:rPr>
+          <w:rFonts w:ascii="Arial" w:hAnsi="Arial" w:cs="Arial"/>
+        </w:rPr>
+      </w:pPr>
+      <w:r>
+        <w:rPr>
+          <w:rFonts w:ascii="Arial" w:hAnsi="Arial" w:cs="Arial"/>
+        </w:rPr>
+        <w:t>&lt;Expr_Relacional&gt; ::= &lt;Cor_Ini&gt; &lt;Operando_Relacional&gt; &lt;Cor_Fin&gt; &lt;Op_Menor&gt;    &lt;Cor_Ini&gt; &lt;Operando_Relacional&gt; &lt;Cor_Fin&gt;</w:t>
+      </w:r>
+    </w:p>
+    <w:p>
+      <w:pPr>
+        <w:rPr>
+          <w:rFonts w:ascii="Arial" w:hAnsi="Arial" w:cs="Arial"/>
+        </w:rPr>
+      </w:pPr>
+      <w:r>
+        <w:rPr>
+          <w:rFonts w:ascii="Arial" w:hAnsi="Arial" w:cs="Arial"/>
+        </w:rPr>
+        <w:t>&lt;Expr_Relacional&gt; ::= &lt;Cor_Ini&gt; &lt;Operando_Relacional&gt; &lt;Cor_Fin&gt; &lt;Op_Menor_Ig&gt; &lt;Cor_Ini&gt; &lt;Operando_Relacional&gt; &lt;Cor_Fin&gt;</w:t>
+      </w:r>
+    </w:p>
+    <w:p>
+      <w:pPr>
+        <w:rPr>
+          <w:rFonts w:ascii="Arial" w:hAnsi="Arial" w:cs="Arial"/>
+        </w:rPr>
+      </w:pPr>
+      <w:r>
+        <w:rPr>
+          <w:rFonts w:ascii="Arial" w:hAnsi="Arial" w:cs="Arial"/>
+        </w:rPr>
+        <w:t>&lt;Expr_Relacional&gt; ::= &lt;Cor_Ini&gt; &lt;Operando_Relacional&gt; &lt;Cor_Fin&gt; &lt;Op_Mayor&gt;    &lt;Cor_Ini&gt; &lt;Operando_Relacional&gt; &lt;Cor_Fin&gt;</w:t>
+      </w:r>
+    </w:p>
+    <w:p>
+      <w:pPr>
+        <w:rPr>
+          <w:rFonts w:ascii="Arial" w:hAnsi="Arial" w:cs="Arial"/>
+        </w:rPr>
+      </w:pPr>
+      <w:r>
+        <w:rPr>
+          <w:rFonts w:ascii="Arial" w:hAnsi="Arial" w:cs="Arial"/>
+        </w:rPr>
         <w:lastRenderedPageBreak/>
-        <w:t>&lt;Expr_Suma_Resta&gt; ::= &lt;Expr_Potencia&gt; &lt;Op_Resta&gt; &lt;Expr_Suma_Resta&gt;</w:t>
-      </w:r>
-    </w:p>
-    <w:p>
-      <w:pPr>
-        <w:rPr>
-          <w:rFonts w:ascii="Arial" w:hAnsi="Arial" w:cs="Arial"/>
-        </w:rPr>
-      </w:pPr>
-    </w:p>
-    <w:p>
-      <w:pPr>
-        <w:rPr>
-          <w:rFonts w:ascii="Arial" w:hAnsi="Arial" w:cs="Arial"/>
-        </w:rPr>
-      </w:pPr>
-      <w:r>
-        <w:rPr>
-          <w:rFonts w:ascii="Arial" w:hAnsi="Arial" w:cs="Arial"/>
-        </w:rPr>
-        <w:t>&lt;Expr_Mult_Div&gt; ::= &lt;Expr_Suma_Resta&gt;</w:t>
-      </w:r>
-    </w:p>
-    <w:p>
-      <w:pPr>
-        <w:rPr>
-          <w:rFonts w:ascii="Arial" w:hAnsi="Arial" w:cs="Arial"/>
-        </w:rPr>
-      </w:pPr>
-      <w:r>
-        <w:rPr>
-          <w:rFonts w:ascii="Arial" w:hAnsi="Arial" w:cs="Arial"/>
-        </w:rPr>
-        <w:t>&lt;Expr_Mult_Div&gt; ::= &lt;Expr_Suma_Resta&gt; &lt;Op_Mult&gt; &lt;Expr_Mult_Div&gt;</w:t>
-      </w:r>
-    </w:p>
-    <w:p>
-      <w:pPr>
-        <w:rPr>
-          <w:rFonts w:ascii="Arial" w:hAnsi="Arial" w:cs="Arial"/>
-        </w:rPr>
-      </w:pPr>
-      <w:r>
-        <w:rPr>
-          <w:rFonts w:ascii="Arial" w:hAnsi="Arial" w:cs="Arial"/>
-        </w:rPr>
-        <w:t>&lt;Expr_Mult_Div&gt; ::= &lt;Expr_Suma_Resta&gt; &lt;Op_Div&gt; &lt;Expr_Mult_Div&gt;</w:t>
-      </w:r>
-    </w:p>
-    <w:p>
-      <w:pPr>
-        <w:rPr>
-          <w:rFonts w:ascii="Arial" w:hAnsi="Arial" w:cs="Arial"/>
-        </w:rPr>
-      </w:pPr>
-      <w:r>
-        <w:rPr>
-          <w:rFonts w:ascii="Arial" w:hAnsi="Arial" w:cs="Arial"/>
-        </w:rPr>
-        <w:t>&lt;Expr_Mult_Div&gt; ::= &lt;Expr_Suma_Resta&gt; &lt;Op_DivEnt&gt; &lt;Expr_Mult_Div&gt;</w:t>
-      </w:r>
-    </w:p>
-    <w:p>
-      <w:pPr>
-        <w:rPr>
-          <w:rFonts w:ascii="Arial" w:hAnsi="Arial" w:cs="Arial"/>
-        </w:rPr>
-      </w:pPr>
-    </w:p>
-    <w:p>
-      <w:pPr>
-        <w:rPr>
-          <w:rFonts w:ascii="Arial" w:hAnsi="Arial" w:cs="Arial"/>
-        </w:rPr>
-      </w:pPr>
-      <w:r>
-        <w:rPr>
-          <w:rFonts w:ascii="Arial" w:hAnsi="Arial" w:cs="Arial"/>
-        </w:rPr>
-        <w:t>&lt;Expr_Aritmetica&gt; ::= &lt;Expr_Mult_Div&gt;</w:t>
-      </w:r>
-    </w:p>
-    <w:p>
-      <w:pPr>
-        <w:rPr>
-          <w:rFonts w:ascii="Arial" w:hAnsi="Arial" w:cs="Arial"/>
-        </w:rPr>
-      </w:pPr>
-      <w:r>
-        <w:rPr>
-          <w:rFonts w:ascii="Arial" w:hAnsi="Arial" w:cs="Arial"/>
-        </w:rPr>
-        <w:t>&lt;Expr_Aritmetica&gt; ::= &lt;Expr_Mult_Div&gt; &lt;Op_Mod&gt; &lt;Expr_Aritmetica&gt;</w:t>
-      </w:r>
-    </w:p>
-    <w:p>
-      <w:pPr>
-        <w:rPr>
-          <w:rFonts w:ascii="Arial" w:hAnsi="Arial" w:cs="Arial"/>
-        </w:rPr>
-      </w:pPr>
-    </w:p>
-    <w:p>
-      <w:pPr>
-        <w:rPr>
-          <w:rFonts w:ascii="Arial" w:hAnsi="Arial" w:cs="Arial"/>
-        </w:rPr>
-      </w:pPr>
-      <w:r>
-        <w:rPr>
-          <w:rFonts w:ascii="Arial" w:hAnsi="Arial" w:cs="Arial"/>
-        </w:rPr>
-        <w:t>&lt;Operando_Relacional&gt; ::= &lt;Id&gt;</w:t>
-      </w:r>
-    </w:p>
-    <w:p>
-      <w:pPr>
-        <w:rPr>
-          <w:rFonts w:ascii="Arial" w:hAnsi="Arial" w:cs="Arial"/>
-        </w:rPr>
-      </w:pPr>
-      <w:r>
-        <w:rPr>
-          <w:rFonts w:ascii="Arial" w:hAnsi="Arial" w:cs="Arial"/>
-        </w:rPr>
-        <w:t>&lt;Operando_Relacional&gt; ::= &lt;Lit_Int&gt;</w:t>
-      </w:r>
-    </w:p>
-    <w:p>
-      <w:pPr>
-        <w:rPr>
-          <w:rFonts w:ascii="Arial" w:hAnsi="Arial" w:cs="Arial"/>
-        </w:rPr>
-      </w:pPr>
-      <w:r>
-        <w:rPr>
-          <w:rFonts w:ascii="Arial" w:hAnsi="Arial" w:cs="Arial"/>
-        </w:rPr>
-        <w:t>&lt;Operando_Relacional&gt; ::= &lt;Lit_Float&gt;</w:t>
-      </w:r>
-    </w:p>
-    <w:p>
-      <w:pPr>
-        <w:rPr>
-          <w:rFonts w:ascii="Arial" w:hAnsi="Arial" w:cs="Arial"/>
-        </w:rPr>
-      </w:pPr>
-      <w:r>
-        <w:rPr>
-          <w:rFonts w:ascii="Arial" w:hAnsi="Arial" w:cs="Arial"/>
-        </w:rPr>
-        <w:t>&lt;Operando_Relacional&gt; ::= &lt;Acceso_Arreglo&gt;</w:t>
-      </w:r>
-    </w:p>
-    <w:p>
-      <w:pPr>
-        <w:rPr>
-          <w:rFonts w:ascii="Arial" w:hAnsi="Arial" w:cs="Arial"/>
-        </w:rPr>
-      </w:pPr>
-      <w:r>
-        <w:rPr>
-          <w:rFonts w:ascii="Arial" w:hAnsi="Arial" w:cs="Arial"/>
-        </w:rPr>
-        <w:t>&lt;Operando_Relacional&gt; ::= &lt;Llamada_Funcion&gt;</w:t>
-      </w:r>
-    </w:p>
-    <w:p>
-      <w:pPr>
-        <w:rPr>
-          <w:rFonts w:ascii="Arial" w:hAnsi="Arial" w:cs="Arial"/>
-        </w:rPr>
-      </w:pPr>
-    </w:p>
-    <w:p>
-      <w:pPr>
-        <w:rPr>
-          <w:rFonts w:ascii="Arial" w:hAnsi="Arial" w:cs="Arial"/>
-        </w:rPr>
-      </w:pPr>
-      <w:r>
-        <w:rPr>
-          <w:rFonts w:ascii="Arial" w:hAnsi="Arial" w:cs="Arial"/>
-        </w:rPr>
-        <w:t>&lt;Operando_Igualdad&gt; ::= &lt;Operando_Relacional&gt;</w:t>
-      </w:r>
-    </w:p>
-    <w:p>
-      <w:pPr>
-        <w:rPr>
-          <w:rFonts w:ascii="Arial" w:hAnsi="Arial" w:cs="Arial"/>
-        </w:rPr>
-      </w:pPr>
-      <w:r>
-        <w:rPr>
-          <w:rFonts w:ascii="Arial" w:hAnsi="Arial" w:cs="Arial"/>
-        </w:rPr>
-        <w:t>&lt;Operando_Igualdad&gt; ::= &lt;Lit_Bool&gt;</w:t>
-      </w:r>
-    </w:p>
-    <w:p>
-      <w:pPr>
-        <w:rPr>
-          <w:rFonts w:ascii="Arial" w:hAnsi="Arial" w:cs="Arial"/>
-        </w:rPr>
-      </w:pPr>
-      <w:r>
-        <w:rPr>
-          <w:rFonts w:ascii="Arial" w:hAnsi="Arial" w:cs="Arial"/>
-        </w:rPr>
-        <w:t>&lt;Operando_Igualdad&gt; ::= &lt;Lit_Char&gt;</w:t>
-      </w:r>
-    </w:p>
-    <w:p>
-      <w:pPr>
-        <w:rPr>
-          <w:rFonts w:ascii="Arial" w:hAnsi="Arial" w:cs="Arial"/>
-        </w:rPr>
-      </w:pPr>
-    </w:p>
-    <w:p>
-      <w:pPr>
-        <w:rPr>
-          <w:rFonts w:ascii="Arial" w:hAnsi="Arial" w:cs="Arial"/>
-        </w:rPr>
-      </w:pPr>
-      <w:r>
-        <w:rPr>
-          <w:rFonts w:ascii="Arial" w:hAnsi="Arial" w:cs="Arial"/>
-        </w:rPr>
-        <w:t>&lt;Expr_Relacional&gt; ::= &lt;Cor_Ini&gt; &lt;Operando_Relacional&gt; &lt;Cor_Fin&gt; &lt;Op_Menor&gt;    &lt;Cor_Ini&gt; &lt;Operando_Relacional&gt; &lt;Cor_Fin&gt;</w:t>
-      </w:r>
-    </w:p>
-    <w:p>
-      <w:pPr>
-        <w:rPr>
-          <w:rFonts w:ascii="Arial" w:hAnsi="Arial" w:cs="Arial"/>
-        </w:rPr>
-      </w:pPr>
-      <w:r>
-        <w:rPr>
-          <w:rFonts w:ascii="Arial" w:hAnsi="Arial" w:cs="Arial"/>
-        </w:rPr>
-        <w:t>&lt;Expr_Relacional&gt; ::= &lt;Cor_Ini&gt; &lt;Operando_Relacional&gt; &lt;Cor_Fin&gt; &lt;Op_Menor_Ig&gt; &lt;Cor_Ini&gt; &lt;Operando_Relacional&gt; &lt;Cor_Fin&gt;</w:t>
-      </w:r>
-    </w:p>
-    <w:p>
-      <w:pPr>
-        <w:rPr>
-          <w:rFonts w:ascii="Arial" w:hAnsi="Arial" w:cs="Arial"/>
-        </w:rPr>
-      </w:pPr>
-      <w:r>
-        <w:rPr>
-          <w:rFonts w:ascii="Arial" w:hAnsi="Arial" w:cs="Arial"/>
-        </w:rPr>
-        <w:t>&lt;Expr_Relacional&gt; ::= &lt;Cor_Ini&gt; &lt;Operando_Relacional&gt; &lt;Cor_Fin&gt; &lt;Op_Mayor&gt;    &lt;Cor_Ini&gt; &lt;Operando_Relacional&gt; &lt;Cor_Fin&gt;</w:t>
-      </w:r>
-    </w:p>
-    <w:p>
-      <w:pPr>
-        <w:rPr>
-          <w:rFonts w:ascii="Arial" w:hAnsi="Arial" w:cs="Arial"/>
-        </w:rPr>
-      </w:pPr>
-      <w:r>
-        <w:rPr>
-          <w:rFonts w:ascii="Arial" w:hAnsi="Arial" w:cs="Arial"/>
-        </w:rPr>
         <w:t>&lt;Expr_Relacional&gt; ::= &lt;Cor_Ini&gt; &lt;Operando_Relacional&gt; &lt;Cor_Fin&gt; &lt;Op_Mayor_Ig&gt; &lt;Cor_Ini&gt; &lt;Operando_Relacional&gt; &lt;Cor_Fin&gt;</w:t>
       </w:r>
     </w:p>
@@ -1763,80 +1756,282 @@
         <w:rPr>
           <w:rFonts w:ascii="Arial" w:hAnsi="Arial" w:cs="Arial"/>
         </w:rPr>
+        <w:t>&lt;Expr_Relacional&gt; ::= &lt;Cor_Ini&gt; &lt;Operando_Igualdad&gt; &lt;Cor_Fin&gt; &lt;Op_Igual&gt; &lt;Cor_Ini&gt; &lt;Operando_Igualdad&gt; &lt;Cor_Fin&gt;</w:t>
+      </w:r>
+    </w:p>
+    <w:p>
+      <w:pPr>
+        <w:rPr>
+          <w:rFonts w:ascii="Arial" w:hAnsi="Arial" w:cs="Arial"/>
+        </w:rPr>
+      </w:pPr>
+      <w:r>
+        <w:rPr>
+          <w:rFonts w:ascii="Arial" w:hAnsi="Arial" w:cs="Arial"/>
+        </w:rPr>
+        <w:t>&lt;Expr_Relacional&gt; ::= &lt;Cor_Ini&gt; &lt;Operando_Igualdad&gt; &lt;Cor_Fin&gt; &lt;Op_Dif&gt;   &lt;Cor_Ini&gt; &lt;Operando_Igualdad&gt; &lt;Cor_Fin&gt;</w:t>
+      </w:r>
+    </w:p>
+    <w:p>
+      <w:pPr>
+        <w:rPr>
+          <w:rFonts w:ascii="Arial" w:hAnsi="Arial" w:cs="Arial"/>
+        </w:rPr>
+      </w:pPr>
+    </w:p>
+    <w:p>
+      <w:pPr>
+        <w:rPr>
+          <w:rFonts w:ascii="Arial" w:hAnsi="Arial" w:cs="Arial"/>
+        </w:rPr>
+      </w:pPr>
+      <w:r>
+        <w:rPr>
+          <w:rFonts w:ascii="Arial" w:hAnsi="Arial" w:cs="Arial"/>
+        </w:rPr>
+        <w:t>&lt;Operando_Logico&gt; ::= &lt;Lit_Bool&gt;</w:t>
+      </w:r>
+    </w:p>
+    <w:p>
+      <w:pPr>
+        <w:rPr>
+          <w:rFonts w:ascii="Arial" w:hAnsi="Arial" w:cs="Arial"/>
+        </w:rPr>
+      </w:pPr>
+      <w:r>
+        <w:rPr>
+          <w:rFonts w:ascii="Arial" w:hAnsi="Arial" w:cs="Arial"/>
+        </w:rPr>
+        <w:t>&lt;Operando_Logico&gt; ::= &lt;Expr_Relacional&gt;</w:t>
+      </w:r>
+    </w:p>
+    <w:p>
+      <w:pPr>
+        <w:rPr>
+          <w:rFonts w:ascii="Arial" w:hAnsi="Arial" w:cs="Arial"/>
+        </w:rPr>
+      </w:pPr>
+      <w:r>
+        <w:rPr>
+          <w:rFonts w:ascii="Arial" w:hAnsi="Arial" w:cs="Arial"/>
+        </w:rPr>
+        <w:t>&lt;Operando_Logico&gt; ::= &lt;Expr_Negacion_Logica&gt;</w:t>
+      </w:r>
+    </w:p>
+    <w:p>
+      <w:pPr>
+        <w:rPr>
+          <w:rFonts w:ascii="Arial" w:hAnsi="Arial" w:cs="Arial"/>
+        </w:rPr>
+      </w:pPr>
+      <w:r>
+        <w:rPr>
+          <w:rFonts w:ascii="Arial" w:hAnsi="Arial" w:cs="Arial"/>
+        </w:rPr>
+        <w:t>&lt;Operando_Logico&gt;</w:t>
+      </w:r>
+      <w:r>
+        <w:rPr>
+          <w:rFonts w:ascii="Arial" w:hAnsi="Arial" w:cs="Arial"/>
+        </w:rPr>
+        <w:t xml:space="preserve"> </w:t>
+      </w:r>
+      <w:r>
+        <w:rPr>
+          <w:rFonts w:ascii="Arial" w:hAnsi="Arial" w:cs="Arial"/>
+        </w:rPr>
+        <w:t>::= &lt;Llamada_Funcion&gt;</w:t>
+      </w:r>
+    </w:p>
+    <w:p>
+      <w:pPr>
+        <w:rPr>
+          <w:rFonts w:ascii="Arial" w:hAnsi="Arial" w:cs="Arial"/>
+        </w:rPr>
+      </w:pPr>
+    </w:p>
+    <w:p>
+      <w:pPr>
+        <w:rPr>
+          <w:rFonts w:ascii="Arial" w:hAnsi="Arial" w:cs="Arial"/>
+        </w:rPr>
+      </w:pPr>
+    </w:p>
+    <w:p>
+      <w:pPr>
+        <w:rPr>
+          <w:rFonts w:ascii="Arial" w:hAnsi="Arial" w:cs="Arial"/>
+        </w:rPr>
+      </w:pPr>
+      <w:r>
+        <w:rPr>
+          <w:rFonts w:ascii="Arial" w:hAnsi="Arial" w:cs="Arial"/>
+        </w:rPr>
+        <w:t>&lt;Expr_Logica&gt; ::= &lt;Par_Ini&gt; &lt;Operando_Logico&gt; &lt;Par_Fin&gt; &lt;Op_And&gt; &lt;Par_Ini&gt; &lt;Operando_Logico&gt; &lt;Par_Fin&gt;</w:t>
+      </w:r>
+    </w:p>
+    <w:p>
+      <w:pPr>
+        <w:rPr>
+          <w:rFonts w:ascii="Arial" w:hAnsi="Arial" w:cs="Arial"/>
+        </w:rPr>
+      </w:pPr>
+      <w:r>
+        <w:rPr>
+          <w:rFonts w:ascii="Arial" w:hAnsi="Arial" w:cs="Arial"/>
+        </w:rPr>
+        <w:t>&lt;Expr_Logica&gt; ::= &lt;Par_Ini&gt; &lt;Operando_Logico&gt; &lt;Par_Fin&gt; &lt;Op_Or&gt;  &lt;Par_Ini&gt; &lt;Operando_Logico&gt; &lt;Par_Fin&gt;</w:t>
+      </w:r>
+    </w:p>
+    <w:p>
+      <w:pPr>
+        <w:rPr>
+          <w:rFonts w:ascii="Arial" w:hAnsi="Arial" w:cs="Arial"/>
+        </w:rPr>
+      </w:pPr>
+    </w:p>
+    <w:p>
+      <w:pPr>
+        <w:rPr>
+          <w:rFonts w:ascii="Arial" w:hAnsi="Arial" w:cs="Arial"/>
+        </w:rPr>
+      </w:pPr>
+      <w:r>
+        <w:rPr>
+          <w:rFonts w:ascii="Arial" w:hAnsi="Arial" w:cs="Arial"/>
+        </w:rPr>
+        <w:t>&lt;Expr_Negacion_Logica&gt; ::= &lt;Op_Not&gt; &lt;Par_Ini&gt; &lt;Operando_Logico&gt; &lt;Par_Fin&gt;</w:t>
+      </w:r>
+    </w:p>
+    <w:p>
+      <w:pPr>
+        <w:rPr>
+          <w:rFonts w:ascii="Arial" w:hAnsi="Arial" w:cs="Arial"/>
+        </w:rPr>
+      </w:pPr>
+      <w:r>
+        <w:rPr>
+          <w:rFonts w:ascii="Arial" w:hAnsi="Arial" w:cs="Arial"/>
+        </w:rPr>
+        <w:t>&lt;Expr_Negacion_Logica&gt; ::= &lt;Op_Not&gt; &lt;Par_Ini&gt; &lt;Expr_Logica&gt; &lt;Par_Fin&gt;</w:t>
+      </w:r>
+    </w:p>
+    <w:p>
+      <w:pPr>
+        <w:rPr>
+          <w:rFonts w:ascii="Arial" w:hAnsi="Arial" w:cs="Arial"/>
+        </w:rPr>
+      </w:pPr>
+    </w:p>
+    <w:p>
+      <w:pPr>
+        <w:rPr>
+          <w:rFonts w:ascii="Arial" w:hAnsi="Arial" w:cs="Arial"/>
+        </w:rPr>
+      </w:pPr>
+      <w:r>
+        <w:rPr>
+          <w:rFonts w:ascii="Arial" w:hAnsi="Arial" w:cs="Arial"/>
+        </w:rPr>
+        <w:t>&lt;Expresion&gt; ::= &lt;Expr_Aritmetica&gt;</w:t>
+      </w:r>
+    </w:p>
+    <w:p>
+      <w:pPr>
+        <w:rPr>
+          <w:rFonts w:ascii="Arial" w:hAnsi="Arial" w:cs="Arial"/>
+        </w:rPr>
+      </w:pPr>
+      <w:r>
+        <w:rPr>
+          <w:rFonts w:ascii="Arial" w:hAnsi="Arial" w:cs="Arial"/>
+        </w:rPr>
+        <w:t>&lt;Expresion&gt; ::= &lt;Expr_Relacional&gt;</w:t>
+      </w:r>
+    </w:p>
+    <w:p>
+      <w:pPr>
+        <w:rPr>
+          <w:rFonts w:ascii="Arial" w:hAnsi="Arial" w:cs="Arial"/>
+        </w:rPr>
+      </w:pPr>
+      <w:r>
+        <w:rPr>
+          <w:rFonts w:ascii="Arial" w:hAnsi="Arial" w:cs="Arial"/>
+        </w:rPr>
+        <w:t>&lt;Expresion&gt; ::= &lt;Expr_Logica&gt;</w:t>
+      </w:r>
+    </w:p>
+    <w:p>
+      <w:pPr>
+        <w:rPr>
+          <w:rFonts w:ascii="Arial" w:hAnsi="Arial" w:cs="Arial"/>
+        </w:rPr>
+      </w:pPr>
+      <w:r>
+        <w:rPr>
+          <w:rFonts w:ascii="Arial" w:hAnsi="Arial" w:cs="Arial"/>
+        </w:rPr>
+        <w:t>&lt;Expresion&gt; ::= &lt;Expr_Negacion_Logica&gt;</w:t>
+      </w:r>
+    </w:p>
+    <w:p>
+      <w:pPr>
+        <w:rPr>
+          <w:rFonts w:ascii="Arial" w:hAnsi="Arial" w:cs="Arial"/>
+        </w:rPr>
+      </w:pPr>
+    </w:p>
+    <w:p>
+      <w:pPr>
+        <w:rPr>
+          <w:rFonts w:ascii="Arial" w:hAnsi="Arial" w:cs="Arial"/>
+        </w:rPr>
+      </w:pPr>
+      <w:r>
+        <w:rPr>
+          <w:rFonts w:ascii="Arial" w:hAnsi="Arial" w:cs="Arial"/>
+        </w:rPr>
+        <w:t>&lt;Declaracion_Var_Simple&gt;</w:t>
+      </w:r>
+      <w:r>
+        <w:rPr>
+          <w:rFonts w:ascii="Arial" w:hAnsi="Arial" w:cs="Arial"/>
+        </w:rPr>
+        <w:t xml:space="preserve"> </w:t>
+      </w:r>
+      <w:r>
+        <w:rPr>
+          <w:rFonts w:ascii="Arial" w:hAnsi="Arial" w:cs="Arial"/>
+        </w:rPr>
+        <w:t>::= &lt;Val&gt; &lt;Tipo&gt; &lt;Id&gt; &lt;Fin_Expr&gt;</w:t>
+      </w:r>
+    </w:p>
+    <w:p>
+      <w:pPr>
+        <w:rPr>
+          <w:rFonts w:ascii="Arial" w:hAnsi="Arial" w:cs="Arial"/>
+        </w:rPr>
+      </w:pPr>
+      <w:r>
+        <w:rPr>
+          <w:rFonts w:ascii="Arial" w:hAnsi="Arial" w:cs="Arial"/>
+        </w:rPr>
+        <w:t>&lt;Declaracion_Var_Asignada&gt; ::= &lt;Val&gt; &lt;Tipo&gt; &lt;Id&gt; &lt;Op_Asig&gt; &lt;Expresion&gt; &lt;Fin_Expr&gt;</w:t>
+      </w:r>
+    </w:p>
+    <w:p>
+      <w:pPr>
+        <w:rPr>
+          <w:rFonts w:ascii="Arial" w:hAnsi="Arial" w:cs="Arial"/>
+        </w:rPr>
+      </w:pPr>
+      <w:r>
+        <w:rPr>
+          <w:rFonts w:ascii="Arial" w:hAnsi="Arial" w:cs="Arial"/>
+        </w:rPr>
         <w:lastRenderedPageBreak/>
-        <w:t>&lt;Expr_Relacional&gt; ::= &lt;Cor_Ini&gt; &lt;Operando_Igualdad&gt; &lt;Cor_Fin&gt; &lt;Op_Igual&gt; &lt;Cor_Ini&gt; &lt;Operando_Igualdad&gt; &lt;Cor_Fin&gt;</w:t>
-      </w:r>
-    </w:p>
-    <w:p>
-      <w:pPr>
-        <w:rPr>
-          <w:rFonts w:ascii="Arial" w:hAnsi="Arial" w:cs="Arial"/>
-        </w:rPr>
-      </w:pPr>
-      <w:r>
-        <w:rPr>
-          <w:rFonts w:ascii="Arial" w:hAnsi="Arial" w:cs="Arial"/>
-        </w:rPr>
-        <w:t>&lt;Expr_Relacional&gt; ::= &lt;Cor_Ini&gt; &lt;Operando_Igualdad&gt; &lt;Cor_Fin&gt; &lt;Op_Dif&gt;   &lt;Cor_Ini&gt; &lt;Operando_Igualdad&gt; &lt;Cor_Fin&gt;</w:t>
-      </w:r>
-    </w:p>
-    <w:p>
-      <w:pPr>
-        <w:rPr>
-          <w:rFonts w:ascii="Arial" w:hAnsi="Arial" w:cs="Arial"/>
-        </w:rPr>
-      </w:pPr>
-    </w:p>
-    <w:p>
-      <w:pPr>
-        <w:rPr>
-          <w:rFonts w:ascii="Arial" w:hAnsi="Arial" w:cs="Arial"/>
-        </w:rPr>
-      </w:pPr>
-      <w:r>
-        <w:rPr>
-          <w:rFonts w:ascii="Arial" w:hAnsi="Arial" w:cs="Arial"/>
-        </w:rPr>
-        <w:t>&lt;Operando_Logico&gt; ::= &lt;Lit_Bool&gt;</w:t>
-      </w:r>
-    </w:p>
-    <w:p>
-      <w:pPr>
-        <w:rPr>
-          <w:rFonts w:ascii="Arial" w:hAnsi="Arial" w:cs="Arial"/>
-        </w:rPr>
-      </w:pPr>
-      <w:r>
-        <w:rPr>
-          <w:rFonts w:ascii="Arial" w:hAnsi="Arial" w:cs="Arial"/>
-        </w:rPr>
-        <w:t>&lt;Operando_Logico&gt; ::= &lt;Expr_Relacional&gt;</w:t>
-      </w:r>
-    </w:p>
-    <w:p>
-      <w:pPr>
-        <w:rPr>
-          <w:rFonts w:ascii="Arial" w:hAnsi="Arial" w:cs="Arial"/>
-        </w:rPr>
-      </w:pPr>
-      <w:r>
-        <w:rPr>
-          <w:rFonts w:ascii="Arial" w:hAnsi="Arial" w:cs="Arial"/>
-        </w:rPr>
-        <w:t>&lt;Operando_Logico&gt; ::= &lt;Expr_Negacion_Logica&gt;</w:t>
-      </w:r>
-    </w:p>
-    <w:p>
-      <w:pPr>
-        <w:rPr>
-          <w:rFonts w:ascii="Arial" w:hAnsi="Arial" w:cs="Arial"/>
-        </w:rPr>
-      </w:pPr>
-      <w:r>
-        <w:rPr>
-          <w:rFonts w:ascii="Arial" w:hAnsi="Arial" w:cs="Arial"/>
-        </w:rPr>
-        <w:t>&lt;Operando_Logico&gt;</w:t>
+        <w:t>&lt;Asignacion_Var&gt;</w:t>
       </w:r>
       <w:r>
         <w:rPr>
@@ -1848,194 +2043,6 @@
         <w:rPr>
           <w:rFonts w:ascii="Arial" w:hAnsi="Arial" w:cs="Arial"/>
         </w:rPr>
-        <w:t>::= &lt;Llamada_Funcion&gt;</w:t>
-      </w:r>
-    </w:p>
-    <w:p>
-      <w:pPr>
-        <w:rPr>
-          <w:rFonts w:ascii="Arial" w:hAnsi="Arial" w:cs="Arial"/>
-        </w:rPr>
-      </w:pPr>
-      <w:r>
-        <w:rPr>
-          <w:rFonts w:ascii="Arial" w:hAnsi="Arial" w:cs="Arial"/>
-        </w:rPr>
-        <w:t>&lt;Expr_Logica&gt; ::= &lt;Par_Ini&gt; &lt;Operando_Logico&gt; &lt;Par_Fin&gt; &lt;Op_And&gt; &lt;Par_Ini&gt; &lt;Operando_Logico&gt; &lt;Par_Fin&gt;</w:t>
-      </w:r>
-    </w:p>
-    <w:p>
-      <w:pPr>
-        <w:rPr>
-          <w:rFonts w:ascii="Arial" w:hAnsi="Arial" w:cs="Arial"/>
-        </w:rPr>
-      </w:pPr>
-      <w:r>
-        <w:rPr>
-          <w:rFonts w:ascii="Arial" w:hAnsi="Arial" w:cs="Arial"/>
-        </w:rPr>
-        <w:t>&lt;Expr_Logica&gt; ::= &lt;Par_Ini&gt; &lt;Operando_Logico&gt; &lt;Par_Fin&gt; &lt;Op_Or&gt;  &lt;Par_Ini&gt; &lt;Operando_Logico&gt; &lt;Par_Fin&gt;</w:t>
-      </w:r>
-    </w:p>
-    <w:p>
-      <w:pPr>
-        <w:rPr>
-          <w:rFonts w:ascii="Arial" w:hAnsi="Arial" w:cs="Arial"/>
-        </w:rPr>
-      </w:pPr>
-    </w:p>
-    <w:p>
-      <w:pPr>
-        <w:rPr>
-          <w:rFonts w:ascii="Arial" w:hAnsi="Arial" w:cs="Arial"/>
-        </w:rPr>
-      </w:pPr>
-      <w:r>
-        <w:rPr>
-          <w:rFonts w:ascii="Arial" w:hAnsi="Arial" w:cs="Arial"/>
-        </w:rPr>
-        <w:t>&lt;Expr_Negacion_Logica&gt; ::= &lt;Op_Not&gt; &lt;Par_Ini&gt; &lt;Operando_Logico&gt; &lt;Par_Fin&gt;</w:t>
-      </w:r>
-    </w:p>
-    <w:p>
-      <w:pPr>
-        <w:rPr>
-          <w:rFonts w:ascii="Arial" w:hAnsi="Arial" w:cs="Arial"/>
-        </w:rPr>
-      </w:pPr>
-      <w:r>
-        <w:rPr>
-          <w:rFonts w:ascii="Arial" w:hAnsi="Arial" w:cs="Arial"/>
-        </w:rPr>
-        <w:t>&lt;Expr_Negacion_Logica&gt; ::= &lt;Op_Not&gt; &lt;Par_Ini&gt; &lt;Expr_Logica&gt; &lt;Par_Fin&gt;</w:t>
-      </w:r>
-    </w:p>
-    <w:p>
-      <w:pPr>
-        <w:rPr>
-          <w:rFonts w:ascii="Arial" w:hAnsi="Arial" w:cs="Arial"/>
-        </w:rPr>
-      </w:pPr>
-    </w:p>
-    <w:p>
-      <w:pPr>
-        <w:rPr>
-          <w:rFonts w:ascii="Arial" w:hAnsi="Arial" w:cs="Arial"/>
-        </w:rPr>
-      </w:pPr>
-      <w:r>
-        <w:rPr>
-          <w:rFonts w:ascii="Arial" w:hAnsi="Arial" w:cs="Arial"/>
-        </w:rPr>
-        <w:t>&lt;Expresion&gt; ::= &lt;Expr_Aritmetica&gt;</w:t>
-      </w:r>
-    </w:p>
-    <w:p>
-      <w:pPr>
-        <w:rPr>
-          <w:rFonts w:ascii="Arial" w:hAnsi="Arial" w:cs="Arial"/>
-        </w:rPr>
-      </w:pPr>
-      <w:r>
-        <w:rPr>
-          <w:rFonts w:ascii="Arial" w:hAnsi="Arial" w:cs="Arial"/>
-        </w:rPr>
-        <w:t>&lt;Expresion&gt; ::= &lt;Expr_Relacional&gt;</w:t>
-      </w:r>
-    </w:p>
-    <w:p>
-      <w:pPr>
-        <w:rPr>
-          <w:rFonts w:ascii="Arial" w:hAnsi="Arial" w:cs="Arial"/>
-        </w:rPr>
-      </w:pPr>
-      <w:r>
-        <w:rPr>
-          <w:rFonts w:ascii="Arial" w:hAnsi="Arial" w:cs="Arial"/>
-        </w:rPr>
-        <w:t>&lt;Expresion&gt; ::= &lt;Expr_Logica&gt;</w:t>
-      </w:r>
-    </w:p>
-    <w:p>
-      <w:pPr>
-        <w:rPr>
-          <w:rFonts w:ascii="Arial" w:hAnsi="Arial" w:cs="Arial"/>
-        </w:rPr>
-      </w:pPr>
-      <w:r>
-        <w:rPr>
-          <w:rFonts w:ascii="Arial" w:hAnsi="Arial" w:cs="Arial"/>
-        </w:rPr>
-        <w:t>&lt;Expresion&gt; ::= &lt;Expr_Negacion_Logica&gt;</w:t>
-      </w:r>
-    </w:p>
-    <w:p>
-      <w:pPr>
-        <w:rPr>
-          <w:rFonts w:ascii="Arial" w:hAnsi="Arial" w:cs="Arial"/>
-        </w:rPr>
-      </w:pPr>
-    </w:p>
-    <w:p>
-      <w:pPr>
-        <w:rPr>
-          <w:rFonts w:ascii="Arial" w:hAnsi="Arial" w:cs="Arial"/>
-        </w:rPr>
-      </w:pPr>
-      <w:r>
-        <w:rPr>
-          <w:rFonts w:ascii="Arial" w:hAnsi="Arial" w:cs="Arial"/>
-        </w:rPr>
-        <w:t>&lt;Declaracion_Var_Simple&gt;</w:t>
-      </w:r>
-      <w:r>
-        <w:rPr>
-          <w:rFonts w:ascii="Arial" w:hAnsi="Arial" w:cs="Arial"/>
-        </w:rPr>
-        <w:t xml:space="preserve"> </w:t>
-      </w:r>
-      <w:r>
-        <w:rPr>
-          <w:rFonts w:ascii="Arial" w:hAnsi="Arial" w:cs="Arial"/>
-        </w:rPr>
-        <w:t>::= &lt;Val&gt; &lt;Tipo&gt; &lt;Id&gt; &lt;Fin_Expr&gt;</w:t>
-      </w:r>
-    </w:p>
-    <w:p>
-      <w:pPr>
-        <w:rPr>
-          <w:rFonts w:ascii="Arial" w:hAnsi="Arial" w:cs="Arial"/>
-        </w:rPr>
-      </w:pPr>
-      <w:r>
-        <w:rPr>
-          <w:rFonts w:ascii="Arial" w:hAnsi="Arial" w:cs="Arial"/>
-        </w:rPr>
-        <w:t>&lt;Declaracion_Var_Asignada&gt; ::= &lt;Val&gt; &lt;Tipo&gt; &lt;Id&gt; &lt;Op_Asig&gt; &lt;Expresion&gt; &lt;Fin_Expr&gt;</w:t>
-      </w:r>
-    </w:p>
-    <w:p>
-      <w:pPr>
-        <w:rPr>
-          <w:rFonts w:ascii="Arial" w:hAnsi="Arial" w:cs="Arial"/>
-        </w:rPr>
-      </w:pPr>
-      <w:r>
-        <w:rPr>
-          <w:rFonts w:ascii="Arial" w:hAnsi="Arial" w:cs="Arial"/>
-        </w:rPr>
-        <w:t>&lt;Asignacion_Var&gt;</w:t>
-      </w:r>
-      <w:r>
-        <w:rPr>
-          <w:rFonts w:ascii="Arial" w:hAnsi="Arial" w:cs="Arial"/>
-        </w:rPr>
-        <w:t xml:space="preserve"> </w:t>
-      </w:r>
-      <w:r>
-        <w:rPr>
-          <w:rFonts w:ascii="Arial" w:hAnsi="Arial" w:cs="Arial"/>
-        </w:rPr>
         <w:t>::= &lt;Id&gt; &lt;Op_Asig&gt; &lt;Expresion&gt; &lt;Fin_Expr&gt;</w:t>
       </w:r>
     </w:p>
@@ -2058,224 +2065,6 @@
           <w:rFonts w:ascii="Arial" w:hAnsi="Arial" w:cs="Arial"/>
         </w:rPr>
       </w:pPr>
-    </w:p>
-    <w:p>
-      <w:pPr>
-        <w:rPr>
-          <w:rFonts w:ascii="Arial" w:hAnsi="Arial" w:cs="Arial"/>
-        </w:rPr>
-      </w:pPr>
-    </w:p>
-    <w:p>
-      <w:pPr>
-        <w:rPr>
-          <w:rFonts w:ascii="Arial" w:hAnsi="Arial" w:cs="Arial"/>
-        </w:rPr>
-      </w:pPr>
-      <w:r>
-        <w:rPr>
-          <w:rFonts w:ascii="Arial" w:hAnsi="Arial" w:cs="Arial"/>
-        </w:rPr>
-        <w:lastRenderedPageBreak/>
-        <w:t>&lt;Tipo_Retorno&gt; ::= "int" | "float" | "char" | "bool"</w:t>
-      </w:r>
-    </w:p>
-    <w:p>
-      <w:pPr>
-        <w:rPr>
-          <w:rFonts w:ascii="Arial" w:hAnsi="Arial" w:cs="Arial"/>
-        </w:rPr>
-      </w:pPr>
-      <w:r>
-        <w:rPr>
-          <w:rFonts w:ascii="Arial" w:hAnsi="Arial" w:cs="Arial"/>
-        </w:rPr>
-        <w:t>&lt;Parametro&gt; ::= &lt;Tipo&gt; &lt;Id&gt;</w:t>
-      </w:r>
-    </w:p>
-    <w:p>
-      <w:pPr>
-        <w:rPr>
-          <w:rFonts w:ascii="Arial" w:hAnsi="Arial" w:cs="Arial"/>
-        </w:rPr>
-      </w:pPr>
-      <w:r>
-        <w:rPr>
-          <w:rFonts w:ascii="Arial" w:hAnsi="Arial" w:cs="Arial"/>
-        </w:rPr>
-        <w:t>&lt;Parametros&gt; ::= &lt;Parametro&gt;</w:t>
-      </w:r>
-    </w:p>
-    <w:p>
-      <w:pPr>
-        <w:rPr>
-          <w:rFonts w:ascii="Arial" w:hAnsi="Arial" w:cs="Arial"/>
-        </w:rPr>
-      </w:pPr>
-      <w:r>
-        <w:rPr>
-          <w:rFonts w:ascii="Arial" w:hAnsi="Arial" w:cs="Arial"/>
-        </w:rPr>
-        <w:t>&lt;Parametros&gt; ::= &lt;Parametro&gt; &lt;Coma&gt; &lt;Parametros&gt;</w:t>
-      </w:r>
-    </w:p>
-    <w:p>
-      <w:pPr>
-        <w:rPr>
-          <w:rFonts w:ascii="Arial" w:hAnsi="Arial" w:cs="Arial"/>
-        </w:rPr>
-      </w:pPr>
-    </w:p>
-    <w:p>
-      <w:pPr>
-        <w:rPr>
-          <w:rFonts w:ascii="Arial" w:hAnsi="Arial" w:cs="Arial"/>
-        </w:rPr>
-      </w:pPr>
-      <w:r>
-        <w:rPr>
-          <w:rFonts w:ascii="Arial" w:hAnsi="Arial" w:cs="Arial"/>
-        </w:rPr>
-        <w:t>&lt;Declaracion_Funcion&gt; ::= &lt;Tipo_Retorno&gt; &lt;Id&gt; &lt;Par_Ini&gt; &lt;Parametros&gt; &lt;Par_Fin&gt; &lt;Bloque&gt;</w:t>
-      </w:r>
-    </w:p>
-    <w:p>
-      <w:pPr>
-        <w:rPr>
-          <w:rFonts w:ascii="Arial" w:hAnsi="Arial" w:cs="Arial"/>
-        </w:rPr>
-      </w:pPr>
-      <w:r>
-        <w:rPr>
-          <w:rFonts w:ascii="Arial" w:hAnsi="Arial" w:cs="Arial"/>
-        </w:rPr>
-        <w:t>&lt;Declaracion_Funcion&gt; ::= &lt;Tipo_Retorno&gt; &lt;Id&gt; &lt;Par_Ini&gt; &lt;Par_Fin&gt; &lt;Bloque&gt;</w:t>
-      </w:r>
-    </w:p>
-    <w:p>
-      <w:pPr>
-        <w:rPr>
-          <w:rFonts w:ascii="Arial" w:hAnsi="Arial" w:cs="Arial"/>
-        </w:rPr>
-      </w:pPr>
-    </w:p>
-    <w:p>
-      <w:pPr>
-        <w:rPr>
-          <w:rFonts w:ascii="Arial" w:hAnsi="Arial" w:cs="Arial"/>
-        </w:rPr>
-      </w:pPr>
-      <w:r>
-        <w:rPr>
-          <w:rFonts w:ascii="Arial" w:hAnsi="Arial" w:cs="Arial"/>
-        </w:rPr>
-        <w:t>&lt;Argumento&gt; ::= &lt;Expresion&gt;</w:t>
-      </w:r>
-    </w:p>
-    <w:p>
-      <w:pPr>
-        <w:rPr>
-          <w:rFonts w:ascii="Arial" w:hAnsi="Arial" w:cs="Arial"/>
-        </w:rPr>
-      </w:pPr>
-      <w:r>
-        <w:rPr>
-          <w:rFonts w:ascii="Arial" w:hAnsi="Arial" w:cs="Arial"/>
-        </w:rPr>
-        <w:t>&lt;Argumentos&gt; ::= &lt;Argumento&gt;</w:t>
-      </w:r>
-    </w:p>
-    <w:p>
-      <w:pPr>
-        <w:rPr>
-          <w:rFonts w:ascii="Arial" w:hAnsi="Arial" w:cs="Arial"/>
-        </w:rPr>
-      </w:pPr>
-      <w:r>
-        <w:rPr>
-          <w:rFonts w:ascii="Arial" w:hAnsi="Arial" w:cs="Arial"/>
-        </w:rPr>
-        <w:t>&lt;Argumentos&gt; ::= &lt;Argumento&gt; &lt;Coma&gt; &lt;Argumentos&gt;</w:t>
-      </w:r>
-    </w:p>
-    <w:p>
-      <w:pPr>
-        <w:rPr>
-          <w:rFonts w:ascii="Arial" w:hAnsi="Arial" w:cs="Arial"/>
-        </w:rPr>
-      </w:pPr>
-    </w:p>
-    <w:p>
-      <w:pPr>
-        <w:rPr>
-          <w:rFonts w:ascii="Arial" w:hAnsi="Arial" w:cs="Arial"/>
-        </w:rPr>
-      </w:pPr>
-      <w:r>
-        <w:rPr>
-          <w:rFonts w:ascii="Arial" w:hAnsi="Arial" w:cs="Arial"/>
-        </w:rPr>
-        <w:t>&lt;Llamada_Funcion&gt; ::= &lt;Id&gt; &lt;Par_Ini&gt; &lt;Argumentos&gt; &lt;Par_Fin&gt;</w:t>
-      </w:r>
-    </w:p>
-    <w:p>
-      <w:pPr>
-        <w:rPr>
-          <w:rFonts w:ascii="Arial" w:hAnsi="Arial" w:cs="Arial"/>
-        </w:rPr>
-      </w:pPr>
-      <w:r>
-        <w:rPr>
-          <w:rFonts w:ascii="Arial" w:hAnsi="Arial" w:cs="Arial"/>
-        </w:rPr>
-        <w:t>&lt;Llamada_Funcion&gt; ::= &lt;Id&gt; &lt;Par_Ini&gt; &lt;Par_Fin&gt;</w:t>
-      </w:r>
-    </w:p>
-    <w:p>
-      <w:pPr>
-        <w:rPr>
-          <w:rFonts w:ascii="Arial" w:hAnsi="Arial" w:cs="Arial"/>
-        </w:rPr>
-      </w:pPr>
-    </w:p>
-    <w:p>
-      <w:pPr>
-        <w:rPr>
-          <w:rFonts w:ascii="Arial" w:hAnsi="Arial" w:cs="Arial"/>
-        </w:rPr>
-      </w:pPr>
-      <w:r>
-        <w:rPr>
-          <w:rFonts w:ascii="Arial" w:hAnsi="Arial" w:cs="Arial"/>
-        </w:rPr>
-        <w:t>&lt;</w:t>
-      </w:r>
-      <w:proofErr w:type="spellStart"/>
-      <w:r>
-        <w:rPr>
-          <w:rFonts w:ascii="Arial" w:hAnsi="Arial" w:cs="Arial"/>
-        </w:rPr>
-        <w:t>Funcion_Main</w:t>
-      </w:r>
-      <w:proofErr w:type="spellEnd"/>
-      <w:r>
-        <w:rPr>
-          <w:rFonts w:ascii="Arial" w:hAnsi="Arial" w:cs="Arial"/>
-        </w:rPr>
-        <w:t>&gt; ::= &lt;Void&gt; &lt;Main&gt; &lt;Par_Ini&gt; &lt;Par_Fin&gt; &lt;Bloque&gt;</w:t>
-      </w:r>
-      <w:r>
-        <w:rPr>
-          <w:rFonts w:ascii="Arial" w:hAnsi="Arial" w:cs="Arial"/>
-        </w:rPr>
-        <w:br/>
-      </w:r>
-      <w:r>
-        <w:rPr>
-          <w:rFonts w:ascii="Arial" w:hAnsi="Arial" w:cs="Arial"/>
-        </w:rPr>
-        <w:br/>
-      </w:r>
     </w:p>
     <w:sectPr>
       <w:pgSz w:w="12240" w:h="15840"/>

</xml_diff>

<commit_message>
estructura de for, while, if, else, elif, read, write
basándonos en lenguajes como c creamos la estructura de los ya mencionados

Co-Authored-By: Tayler1203 <159508110+Tayler1203@users.noreply.github.com>
</commit_message>
<xml_diff>
--- a/Producciones.docx
+++ b/Producciones.docx
@@ -843,7 +843,21 @@
           <w:rFonts w:ascii="Arial" w:hAnsi="Arial" w:cs="Arial"/>
           <w:lang w:val="en-US"/>
         </w:rPr>
-        <w:t>&lt;Main&gt;   ::= "main"</w:t>
+        <w:t>&lt;Main&gt;   ::= "</w:t>
+      </w:r>
+      <w:r>
+        <w:rPr>
+          <w:rFonts w:ascii="Arial" w:hAnsi="Arial" w:cs="Arial"/>
+          <w:lang w:val="en-US"/>
+        </w:rPr>
+        <w:t>principal</w:t>
+      </w:r>
+      <w:r>
+        <w:rPr>
+          <w:rFonts w:ascii="Arial" w:hAnsi="Arial" w:cs="Arial"/>
+          <w:lang w:val="en-US"/>
+        </w:rPr>
+        <w:t>"</w:t>
       </w:r>
     </w:p>
     <w:p>
@@ -2076,6 +2090,395 @@
         <w:rPr>
           <w:rFonts w:ascii="Arial" w:hAnsi="Arial" w:cs="Arial"/>
         </w:rPr>
+        <w:t>&lt;Tipo_Retorno&gt; ::= "int" | "float" | "char" | "bool"</w:t>
+      </w:r>
+    </w:p>
+    <w:p>
+      <w:pPr>
+        <w:rPr>
+          <w:rFonts w:ascii="Arial" w:hAnsi="Arial" w:cs="Arial"/>
+        </w:rPr>
+      </w:pPr>
+    </w:p>
+    <w:p>
+      <w:pPr>
+        <w:rPr>
+          <w:rFonts w:ascii="Arial" w:hAnsi="Arial" w:cs="Arial"/>
+        </w:rPr>
+      </w:pPr>
+      <w:r>
+        <w:rPr>
+          <w:rFonts w:ascii="Arial" w:hAnsi="Arial" w:cs="Arial"/>
+        </w:rPr>
+        <w:t>&lt;Parametro&gt; ::= &lt;Tipo&gt; &lt;Id&gt;</w:t>
+      </w:r>
+    </w:p>
+    <w:p>
+      <w:pPr>
+        <w:rPr>
+          <w:rFonts w:ascii="Arial" w:hAnsi="Arial" w:cs="Arial"/>
+        </w:rPr>
+      </w:pPr>
+      <w:r>
+        <w:rPr>
+          <w:rFonts w:ascii="Arial" w:hAnsi="Arial" w:cs="Arial"/>
+        </w:rPr>
+        <w:t>&lt;Parametros&gt; ::= &lt;Parametro&gt;</w:t>
+      </w:r>
+    </w:p>
+    <w:p>
+      <w:pPr>
+        <w:rPr>
+          <w:rFonts w:ascii="Arial" w:hAnsi="Arial" w:cs="Arial"/>
+        </w:rPr>
+      </w:pPr>
+      <w:r>
+        <w:rPr>
+          <w:rFonts w:ascii="Arial" w:hAnsi="Arial" w:cs="Arial"/>
+        </w:rPr>
+        <w:t>&lt;Parametros&gt; ::= &lt;Parametro&gt; &lt;Coma&gt; &lt;Parametros&gt;</w:t>
+      </w:r>
+    </w:p>
+    <w:p>
+      <w:pPr>
+        <w:rPr>
+          <w:rFonts w:ascii="Arial" w:hAnsi="Arial" w:cs="Arial"/>
+        </w:rPr>
+      </w:pPr>
+    </w:p>
+    <w:p>
+      <w:pPr>
+        <w:rPr>
+          <w:rFonts w:ascii="Arial" w:hAnsi="Arial" w:cs="Arial"/>
+        </w:rPr>
+      </w:pPr>
+      <w:r>
+        <w:rPr>
+          <w:rFonts w:ascii="Arial" w:hAnsi="Arial" w:cs="Arial"/>
+        </w:rPr>
+        <w:t>&lt;Declaracion_Funcion&gt; ::= &lt;Tipo_Retorno&gt; &lt;Id&gt; &lt;Par_Ini&gt; &lt;Parametros&gt; &lt;Par_Fin&gt; &lt;Bloque&gt;</w:t>
+      </w:r>
+    </w:p>
+    <w:p>
+      <w:pPr>
+        <w:rPr>
+          <w:rFonts w:ascii="Arial" w:hAnsi="Arial" w:cs="Arial"/>
+        </w:rPr>
+      </w:pPr>
+      <w:r>
+        <w:rPr>
+          <w:rFonts w:ascii="Arial" w:hAnsi="Arial" w:cs="Arial"/>
+        </w:rPr>
+        <w:t>&lt;Declaracion_Funcion&gt; ::= &lt;Tipo_Retorno&gt; &lt;Id&gt; &lt;Par_Ini&gt; &lt;Par_Fin&gt; &lt;Bloque&gt;</w:t>
+      </w:r>
+    </w:p>
+    <w:p>
+      <w:pPr>
+        <w:rPr>
+          <w:rFonts w:ascii="Arial" w:hAnsi="Arial" w:cs="Arial"/>
+        </w:rPr>
+      </w:pPr>
+    </w:p>
+    <w:p>
+      <w:pPr>
+        <w:rPr>
+          <w:rFonts w:ascii="Arial" w:hAnsi="Arial" w:cs="Arial"/>
+        </w:rPr>
+      </w:pPr>
+      <w:r>
+        <w:rPr>
+          <w:rFonts w:ascii="Arial" w:hAnsi="Arial" w:cs="Arial"/>
+        </w:rPr>
+        <w:t>&lt;Argumento&gt; ::= &lt;Expresion&gt;</w:t>
+      </w:r>
+    </w:p>
+    <w:p>
+      <w:pPr>
+        <w:rPr>
+          <w:rFonts w:ascii="Arial" w:hAnsi="Arial" w:cs="Arial"/>
+        </w:rPr>
+      </w:pPr>
+      <w:r>
+        <w:rPr>
+          <w:rFonts w:ascii="Arial" w:hAnsi="Arial" w:cs="Arial"/>
+        </w:rPr>
+        <w:t>&lt;Argumentos&gt; ::= &lt;Argumento&gt;</w:t>
+      </w:r>
+    </w:p>
+    <w:p>
+      <w:pPr>
+        <w:rPr>
+          <w:rFonts w:ascii="Arial" w:hAnsi="Arial" w:cs="Arial"/>
+        </w:rPr>
+      </w:pPr>
+      <w:r>
+        <w:rPr>
+          <w:rFonts w:ascii="Arial" w:hAnsi="Arial" w:cs="Arial"/>
+        </w:rPr>
+        <w:t>&lt;Argumentos&gt; ::= &lt;Argumento&gt; &lt;Coma&gt; &lt;Argumentos&gt;</w:t>
+      </w:r>
+    </w:p>
+    <w:p>
+      <w:pPr>
+        <w:rPr>
+          <w:rFonts w:ascii="Arial" w:hAnsi="Arial" w:cs="Arial"/>
+        </w:rPr>
+      </w:pPr>
+    </w:p>
+    <w:p>
+      <w:pPr>
+        <w:rPr>
+          <w:rFonts w:ascii="Arial" w:hAnsi="Arial" w:cs="Arial"/>
+        </w:rPr>
+      </w:pPr>
+      <w:r>
+        <w:rPr>
+          <w:rFonts w:ascii="Arial" w:hAnsi="Arial" w:cs="Arial"/>
+        </w:rPr>
+        <w:t>&lt;Llamada_Funcion&gt; ::= &lt;Id&gt; &lt;Par_Ini&gt; &lt;Argumentos&gt; &lt;Par_Fin&gt;</w:t>
+      </w:r>
+    </w:p>
+    <w:p>
+      <w:pPr>
+        <w:rPr>
+          <w:rFonts w:ascii="Arial" w:hAnsi="Arial" w:cs="Arial"/>
+        </w:rPr>
+      </w:pPr>
+      <w:r>
+        <w:rPr>
+          <w:rFonts w:ascii="Arial" w:hAnsi="Arial" w:cs="Arial"/>
+        </w:rPr>
+        <w:t>&lt;Llamada_Funcion&gt; ::= &lt;Id&gt; &lt;Par_Ini&gt; &lt;Par_Fin&gt;</w:t>
+      </w:r>
+      <w:r>
+        <w:rPr>
+          <w:rFonts w:ascii="Arial" w:hAnsi="Arial" w:cs="Arial"/>
+        </w:rPr>
+        <w:br/>
+      </w:r>
+      <w:r>
+        <w:rPr>
+          <w:rFonts w:ascii="Arial" w:hAnsi="Arial" w:cs="Arial"/>
+        </w:rPr>
+        <w:br/>
+      </w:r>
+    </w:p>
+    <w:p>
+      <w:pPr>
+        <w:rPr>
+          <w:rFonts w:ascii="Arial" w:hAnsi="Arial" w:cs="Arial"/>
+        </w:rPr>
+      </w:pPr>
+      <w:r>
+        <w:rPr>
+          <w:rFonts w:ascii="Arial" w:hAnsi="Arial" w:cs="Arial"/>
+        </w:rPr>
+        <w:t>&lt;Caracter_Comentario&gt; ::= [^¡!|]</w:t>
+      </w:r>
+    </w:p>
+    <w:p>
+      <w:pPr>
+        <w:rPr>
+          <w:rFonts w:ascii="Arial" w:hAnsi="Arial" w:cs="Arial"/>
+        </w:rPr>
+      </w:pPr>
+      <w:r>
+        <w:rPr>
+          <w:rFonts w:ascii="Arial" w:hAnsi="Arial" w:cs="Arial"/>
+        </w:rPr>
+        <w:t>&lt;Contenido_Comentario&gt; ::= &lt;Caracter_Comentario&gt; &lt;Contenido_Comentario&gt; |ε</w:t>
+      </w:r>
+    </w:p>
+    <w:p>
+      <w:pPr>
+        <w:rPr>
+          <w:rFonts w:ascii="Arial" w:hAnsi="Arial" w:cs="Arial"/>
+        </w:rPr>
+      </w:pPr>
+      <w:r>
+        <w:rPr>
+          <w:rFonts w:ascii="Arial" w:hAnsi="Arial" w:cs="Arial"/>
+        </w:rPr>
+        <w:t>&lt;Comentario_Linea&gt; ::= &lt;Com_Linea&gt; &lt;Contenido_Comentario&gt;</w:t>
+      </w:r>
+    </w:p>
+    <w:p>
+      <w:pPr>
+        <w:rPr>
+          <w:rFonts w:ascii="Arial" w:hAnsi="Arial" w:cs="Arial"/>
+        </w:rPr>
+      </w:pPr>
+      <w:r>
+        <w:rPr>
+          <w:rFonts w:ascii="Arial" w:hAnsi="Arial" w:cs="Arial"/>
+        </w:rPr>
+        <w:t>&lt;Comentario_Multi&gt; ::= &lt;Com_Multi_Ini&gt; &lt;Contenido_Comentario&gt; &lt;Com_Multi_Fin&gt;</w:t>
+      </w:r>
+    </w:p>
+    <w:p>
+      <w:pPr>
+        <w:rPr>
+          <w:rFonts w:ascii="Arial" w:hAnsi="Arial" w:cs="Arial"/>
+        </w:rPr>
+      </w:pPr>
+    </w:p>
+    <w:p>
+      <w:pPr>
+        <w:rPr>
+          <w:rFonts w:ascii="Arial" w:hAnsi="Arial" w:cs="Arial"/>
+        </w:rPr>
+      </w:pPr>
+    </w:p>
+    <w:p>
+      <w:pPr>
+        <w:rPr>
+          <w:rFonts w:ascii="Arial" w:hAnsi="Arial" w:cs="Arial"/>
+        </w:rPr>
+      </w:pPr>
+      <w:r>
+        <w:rPr>
+          <w:rFonts w:ascii="Arial" w:hAnsi="Arial" w:cs="Arial"/>
+        </w:rPr>
+        <w:lastRenderedPageBreak/>
+        <w:t>&lt;Sentencia_Read&gt; ::= &lt;Read&gt; &lt;Par_Ini&gt; &lt;Id&gt; &lt;Par_Fin&gt; &lt;Fin_Expr&gt;</w:t>
+      </w:r>
+    </w:p>
+    <w:p>
+      <w:pPr>
+        <w:rPr>
+          <w:rFonts w:ascii="Arial" w:hAnsi="Arial" w:cs="Arial"/>
+          <w:lang w:val="en-US"/>
+        </w:rPr>
+      </w:pPr>
+      <w:r>
+        <w:rPr>
+          <w:rFonts w:ascii="Arial" w:hAnsi="Arial" w:cs="Arial"/>
+          <w:lang w:val="en-US"/>
+        </w:rPr>
+        <w:t>&lt;Operando_Write&gt; ::= &lt;Id&gt;</w:t>
+      </w:r>
+    </w:p>
+    <w:p>
+      <w:pPr>
+        <w:rPr>
+          <w:rFonts w:ascii="Arial" w:hAnsi="Arial" w:cs="Arial"/>
+          <w:lang w:val="en-US"/>
+        </w:rPr>
+      </w:pPr>
+      <w:r>
+        <w:rPr>
+          <w:rFonts w:ascii="Arial" w:hAnsi="Arial" w:cs="Arial"/>
+          <w:lang w:val="en-US"/>
+        </w:rPr>
+        <w:t>&lt;Operando_Write&gt; ::= &lt;Lit_Int&gt;</w:t>
+      </w:r>
+    </w:p>
+    <w:p>
+      <w:pPr>
+        <w:rPr>
+          <w:rFonts w:ascii="Arial" w:hAnsi="Arial" w:cs="Arial"/>
+          <w:lang w:val="en-US"/>
+        </w:rPr>
+      </w:pPr>
+      <w:r>
+        <w:rPr>
+          <w:rFonts w:ascii="Arial" w:hAnsi="Arial" w:cs="Arial"/>
+          <w:lang w:val="en-US"/>
+        </w:rPr>
+        <w:t>&lt;Operando_Write&gt; ::= &lt;Lit_Float&gt;</w:t>
+      </w:r>
+    </w:p>
+    <w:p>
+      <w:pPr>
+        <w:rPr>
+          <w:rFonts w:ascii="Arial" w:hAnsi="Arial" w:cs="Arial"/>
+          <w:lang w:val="en-US"/>
+        </w:rPr>
+      </w:pPr>
+      <w:r>
+        <w:rPr>
+          <w:rFonts w:ascii="Arial" w:hAnsi="Arial" w:cs="Arial"/>
+          <w:lang w:val="en-US"/>
+        </w:rPr>
+        <w:t>&lt;Operando_Write&gt; ::= &lt;Lit_Bool&gt;</w:t>
+      </w:r>
+    </w:p>
+    <w:p>
+      <w:pPr>
+        <w:rPr>
+          <w:rFonts w:ascii="Arial" w:hAnsi="Arial" w:cs="Arial"/>
+          <w:lang w:val="en-US"/>
+        </w:rPr>
+      </w:pPr>
+      <w:r>
+        <w:rPr>
+          <w:rFonts w:ascii="Arial" w:hAnsi="Arial" w:cs="Arial"/>
+          <w:lang w:val="en-US"/>
+        </w:rPr>
+        <w:t>&lt;Operando_Write&gt; ::= &lt;Lit_String&gt;</w:t>
+      </w:r>
+    </w:p>
+    <w:p>
+      <w:pPr>
+        <w:rPr>
+          <w:rFonts w:ascii="Arial" w:hAnsi="Arial" w:cs="Arial"/>
+          <w:lang w:val="en-US"/>
+        </w:rPr>
+      </w:pPr>
+      <w:r>
+        <w:rPr>
+          <w:rFonts w:ascii="Arial" w:hAnsi="Arial" w:cs="Arial"/>
+          <w:lang w:val="en-US"/>
+        </w:rPr>
+        <w:t>&lt;Sentencia_Write&gt; ::= &lt;Write&gt; &lt;Par_Ini&gt; &lt;Operando_Write&gt; &lt;Par_Fin&gt; &lt;Fin_Expr&gt;</w:t>
+      </w:r>
+    </w:p>
+    <w:p>
+      <w:pPr>
+        <w:rPr>
+          <w:rFonts w:ascii="Arial" w:hAnsi="Arial" w:cs="Arial"/>
+          <w:lang w:val="en-US"/>
+        </w:rPr>
+      </w:pPr>
+    </w:p>
+    <w:p>
+      <w:pPr>
+        <w:rPr>
+          <w:rFonts w:ascii="Arial" w:hAnsi="Arial" w:cs="Arial"/>
+          <w:lang w:val="en-US"/>
+        </w:rPr>
+      </w:pPr>
+      <w:r>
+        <w:rPr>
+          <w:rFonts w:ascii="Arial" w:hAnsi="Arial" w:cs="Arial"/>
+          <w:lang w:val="en-US"/>
+        </w:rPr>
+        <w:t>&lt;Sentencia_Return&gt; ::= &lt;Return&gt; &lt;Fin_Expr&gt;</w:t>
+      </w:r>
+    </w:p>
+    <w:p>
+      <w:pPr>
+        <w:rPr>
+          <w:rFonts w:ascii="Arial" w:hAnsi="Arial" w:cs="Arial"/>
+        </w:rPr>
+      </w:pPr>
+      <w:r>
+        <w:rPr>
+          <w:rFonts w:ascii="Arial" w:hAnsi="Arial" w:cs="Arial"/>
+        </w:rPr>
+        <w:t>&lt;Sentencia_Return&gt; ::= &lt;Return&gt; &lt;Expresion&gt; &lt;Fin_Expr&gt;</w:t>
+      </w:r>
+    </w:p>
+    <w:p>
+      <w:pPr>
+        <w:rPr>
+          <w:rFonts w:ascii="Arial" w:hAnsi="Arial" w:cs="Arial"/>
+        </w:rPr>
+      </w:pPr>
+      <w:r>
+        <w:rPr>
+          <w:rFonts w:ascii="Arial" w:hAnsi="Arial" w:cs="Arial"/>
+        </w:rPr>
         <w:t>&lt;</w:t>
       </w:r>
       <w:proofErr w:type="spellStart"/>
@@ -2083,78 +2486,91 @@
         <w:rPr>
           <w:rFonts w:ascii="Arial" w:hAnsi="Arial" w:cs="Arial"/>
         </w:rPr>
-        <w:t>Tipo_Retorno</w:t>
+        <w:t>Sentencia_Break</w:t>
       </w:r>
       <w:proofErr w:type="spellEnd"/>
       <w:r>
         <w:rPr>
           <w:rFonts w:ascii="Arial" w:hAnsi="Arial" w:cs="Arial"/>
         </w:rPr>
-        <w:t>&gt; ::= "</w:t>
+        <w:t>&gt;  ::= &lt;Break&gt; &lt;</w:t>
       </w:r>
       <w:proofErr w:type="spellStart"/>
       <w:r>
         <w:rPr>
           <w:rFonts w:ascii="Arial" w:hAnsi="Arial" w:cs="Arial"/>
         </w:rPr>
-        <w:t>int</w:t>
+        <w:t>Fin_Expr</w:t>
       </w:r>
       <w:proofErr w:type="spellEnd"/>
       <w:r>
         <w:rPr>
           <w:rFonts w:ascii="Arial" w:hAnsi="Arial" w:cs="Arial"/>
         </w:rPr>
-        <w:t>" | "</w:t>
+        <w:t>&gt;</w:t>
+      </w:r>
+    </w:p>
+    <w:p>
+      <w:pPr>
+        <w:rPr>
+          <w:rFonts w:ascii="Arial" w:hAnsi="Arial" w:cs="Arial"/>
+        </w:rPr>
+      </w:pPr>
+    </w:p>
+    <w:p>
+      <w:pPr>
+        <w:rPr>
+          <w:rFonts w:ascii="Arial" w:hAnsi="Arial" w:cs="Arial"/>
+        </w:rPr>
+      </w:pPr>
+      <w:r>
+        <w:rPr>
+          <w:rFonts w:ascii="Arial" w:hAnsi="Arial" w:cs="Arial"/>
+        </w:rPr>
+        <w:t>&lt;</w:t>
       </w:r>
       <w:proofErr w:type="spellStart"/>
       <w:r>
         <w:rPr>
           <w:rFonts w:ascii="Arial" w:hAnsi="Arial" w:cs="Arial"/>
         </w:rPr>
-        <w:t>float</w:t>
+        <w:t>Declaracion_Var_Asignada_Sin_Fin</w:t>
       </w:r>
       <w:proofErr w:type="spellEnd"/>
       <w:r>
         <w:rPr>
           <w:rFonts w:ascii="Arial" w:hAnsi="Arial" w:cs="Arial"/>
         </w:rPr>
-        <w:t>" | "</w:t>
+        <w:t>&gt; ::= &lt;Val&gt; &lt;Tipo&gt; &lt;Id&gt; &lt;</w:t>
       </w:r>
       <w:proofErr w:type="spellStart"/>
       <w:r>
         <w:rPr>
           <w:rFonts w:ascii="Arial" w:hAnsi="Arial" w:cs="Arial"/>
         </w:rPr>
-        <w:t>char</w:t>
+        <w:t>Op_Asig</w:t>
       </w:r>
       <w:proofErr w:type="spellEnd"/>
       <w:r>
         <w:rPr>
           <w:rFonts w:ascii="Arial" w:hAnsi="Arial" w:cs="Arial"/>
         </w:rPr>
-        <w:t>" | "</w:t>
+        <w:t>&gt; &lt;</w:t>
       </w:r>
       <w:proofErr w:type="spellStart"/>
       <w:r>
         <w:rPr>
           <w:rFonts w:ascii="Arial" w:hAnsi="Arial" w:cs="Arial"/>
         </w:rPr>
-        <w:t>bool</w:t>
+        <w:t>Expresion</w:t>
       </w:r>
       <w:proofErr w:type="spellEnd"/>
       <w:r>
         <w:rPr>
           <w:rFonts w:ascii="Arial" w:hAnsi="Arial" w:cs="Arial"/>
         </w:rPr>
-        <w:t>"</w:t>
-      </w:r>
-    </w:p>
-    <w:p>
-      <w:pPr>
-        <w:rPr>
-          <w:rFonts w:ascii="Arial" w:hAnsi="Arial" w:cs="Arial"/>
-        </w:rPr>
-      </w:pPr>
+        <w:t>&gt;</w:t>
+      </w:r>
     </w:p>
     <w:p>
       <w:pPr>
@@ -2173,14 +2589,42 @@
         <w:rPr>
           <w:rFonts w:ascii="Arial" w:hAnsi="Arial" w:cs="Arial"/>
         </w:rPr>
-        <w:t>Parametro</w:t>
+        <w:t>Asignacion_Var_Sin_Fin</w:t>
       </w:r>
       <w:proofErr w:type="spellEnd"/>
       <w:r>
         <w:rPr>
           <w:rFonts w:ascii="Arial" w:hAnsi="Arial" w:cs="Arial"/>
         </w:rPr>
-        <w:t>&gt; ::= &lt;Tipo&gt; &lt;Id&gt;</w:t>
+        <w:t>&gt; ::= &lt;Id&gt; &lt;</w:t>
+      </w:r>
+      <w:proofErr w:type="spellStart"/>
+      <w:r>
+        <w:rPr>
+          <w:rFonts w:ascii="Arial" w:hAnsi="Arial" w:cs="Arial"/>
+        </w:rPr>
+        <w:t>Op_Asig</w:t>
+      </w:r>
+      <w:proofErr w:type="spellEnd"/>
+      <w:r>
+        <w:rPr>
+          <w:rFonts w:ascii="Arial" w:hAnsi="Arial" w:cs="Arial"/>
+        </w:rPr>
+        <w:t>&gt; &lt;</w:t>
+      </w:r>
+      <w:proofErr w:type="spellStart"/>
+      <w:r>
+        <w:rPr>
+          <w:rFonts w:ascii="Arial" w:hAnsi="Arial" w:cs="Arial"/>
+        </w:rPr>
+        <w:t>Expresion</w:t>
+      </w:r>
+      <w:proofErr w:type="spellEnd"/>
+      <w:r>
+        <w:rPr>
+          <w:rFonts w:ascii="Arial" w:hAnsi="Arial" w:cs="Arial"/>
+        </w:rPr>
+        <w:t>&gt;</w:t>
       </w:r>
     </w:p>
     <w:p>
@@ -2200,7 +2644,7 @@
         <w:rPr>
           <w:rFonts w:ascii="Arial" w:hAnsi="Arial" w:cs="Arial"/>
         </w:rPr>
-        <w:t>Parametros</w:t>
+        <w:t>Sentencia_For_Init</w:t>
       </w:r>
       <w:proofErr w:type="spellEnd"/>
       <w:r>
@@ -2214,7 +2658,7 @@
         <w:rPr>
           <w:rFonts w:ascii="Arial" w:hAnsi="Arial" w:cs="Arial"/>
         </w:rPr>
-        <w:t>Parametro</w:t>
+        <w:t>Declaracion_Var_Asignada_Sin_Fin</w:t>
       </w:r>
       <w:proofErr w:type="spellEnd"/>
       <w:r>
@@ -2241,7 +2685,7 @@
         <w:rPr>
           <w:rFonts w:ascii="Arial" w:hAnsi="Arial" w:cs="Arial"/>
         </w:rPr>
-        <w:t>Parametros</w:t>
+        <w:t>Sentencia_For_Init</w:t>
       </w:r>
       <w:proofErr w:type="spellEnd"/>
       <w:r>
@@ -2255,27 +2699,54 @@
         <w:rPr>
           <w:rFonts w:ascii="Arial" w:hAnsi="Arial" w:cs="Arial"/>
         </w:rPr>
-        <w:t>Parametro</w:t>
+        <w:t>Asignacion_Var_Sin_Fin</w:t>
       </w:r>
       <w:proofErr w:type="spellEnd"/>
       <w:r>
         <w:rPr>
           <w:rFonts w:ascii="Arial" w:hAnsi="Arial" w:cs="Arial"/>
         </w:rPr>
-        <w:t>&gt; &lt;Coma&gt; &lt;</w:t>
+        <w:t>&gt;</w:t>
+      </w:r>
+    </w:p>
+    <w:p>
+      <w:pPr>
+        <w:rPr>
+          <w:rFonts w:ascii="Arial" w:hAnsi="Arial" w:cs="Arial"/>
+        </w:rPr>
+      </w:pPr>
+      <w:r>
+        <w:rPr>
+          <w:rFonts w:ascii="Arial" w:hAnsi="Arial" w:cs="Arial"/>
+        </w:rPr>
+        <w:t>&lt;</w:t>
       </w:r>
       <w:proofErr w:type="spellStart"/>
       <w:r>
         <w:rPr>
           <w:rFonts w:ascii="Arial" w:hAnsi="Arial" w:cs="Arial"/>
         </w:rPr>
-        <w:t>Parametros</w:t>
+        <w:t>Sentencia_For_Incremento</w:t>
       </w:r>
       <w:proofErr w:type="spellEnd"/>
       <w:r>
         <w:rPr>
           <w:rFonts w:ascii="Arial" w:hAnsi="Arial" w:cs="Arial"/>
         </w:rPr>
+        <w:t>&gt; ::= &lt;</w:t>
+      </w:r>
+      <w:proofErr w:type="spellStart"/>
+      <w:r>
+        <w:rPr>
+          <w:rFonts w:ascii="Arial" w:hAnsi="Arial" w:cs="Arial"/>
+        </w:rPr>
+        <w:t>Expr_Incremento</w:t>
+      </w:r>
+      <w:proofErr w:type="spellEnd"/>
+      <w:r>
+        <w:rPr>
+          <w:rFonts w:ascii="Arial" w:hAnsi="Arial" w:cs="Arial"/>
+        </w:rPr>
         <w:t>&gt;</w:t>
       </w:r>
     </w:p>
@@ -2285,13 +2756,6 @@
           <w:rFonts w:ascii="Arial" w:hAnsi="Arial" w:cs="Arial"/>
         </w:rPr>
       </w:pPr>
-    </w:p>
-    <w:p>
-      <w:pPr>
-        <w:rPr>
-          <w:rFonts w:ascii="Arial" w:hAnsi="Arial" w:cs="Arial"/>
-        </w:rPr>
-      </w:pPr>
       <w:r>
         <w:rPr>
           <w:rFonts w:ascii="Arial" w:hAnsi="Arial" w:cs="Arial"/>
@@ -2303,7 +2767,7 @@
         <w:rPr>
           <w:rFonts w:ascii="Arial" w:hAnsi="Arial" w:cs="Arial"/>
         </w:rPr>
-        <w:t>Declaracion_Funcion</w:t>
+        <w:t>Sentencia_For_Incremento</w:t>
       </w:r>
       <w:proofErr w:type="spellEnd"/>
       <w:r>
@@ -2317,20 +2781,95 @@
         <w:rPr>
           <w:rFonts w:ascii="Arial" w:hAnsi="Arial" w:cs="Arial"/>
         </w:rPr>
-        <w:t>Tipo_Retorno</w:t>
+        <w:t>Expr_Decremento</w:t>
       </w:r>
       <w:proofErr w:type="spellEnd"/>
       <w:r>
         <w:rPr>
           <w:rFonts w:ascii="Arial" w:hAnsi="Arial" w:cs="Arial"/>
         </w:rPr>
-        <w:t>&gt; &lt;Id&gt; &lt;</w:t>
+        <w:t>&gt;</w:t>
+      </w:r>
+    </w:p>
+    <w:p>
+      <w:pPr>
+        <w:rPr>
+          <w:rFonts w:ascii="Arial" w:hAnsi="Arial" w:cs="Arial"/>
+        </w:rPr>
+      </w:pPr>
+      <w:r>
+        <w:rPr>
+          <w:rFonts w:ascii="Arial" w:hAnsi="Arial" w:cs="Arial"/>
+        </w:rPr>
+        <w:t>&lt;</w:t>
       </w:r>
       <w:proofErr w:type="spellStart"/>
       <w:r>
         <w:rPr>
           <w:rFonts w:ascii="Arial" w:hAnsi="Arial" w:cs="Arial"/>
         </w:rPr>
+        <w:t>Sentencia_For_Incremento</w:t>
+      </w:r>
+      <w:proofErr w:type="spellEnd"/>
+      <w:r>
+        <w:rPr>
+          <w:rFonts w:ascii="Arial" w:hAnsi="Arial" w:cs="Arial"/>
+        </w:rPr>
+        <w:t>&gt; ::= &lt;</w:t>
+      </w:r>
+      <w:proofErr w:type="spellStart"/>
+      <w:r>
+        <w:rPr>
+          <w:rFonts w:ascii="Arial" w:hAnsi="Arial" w:cs="Arial"/>
+        </w:rPr>
+        <w:t>Asignacion_Var_Sin_Fin</w:t>
+      </w:r>
+      <w:proofErr w:type="spellEnd"/>
+      <w:r>
+        <w:rPr>
+          <w:rFonts w:ascii="Arial" w:hAnsi="Arial" w:cs="Arial"/>
+        </w:rPr>
+        <w:t>&gt;</w:t>
+      </w:r>
+    </w:p>
+    <w:p>
+      <w:pPr>
+        <w:rPr>
+          <w:rFonts w:ascii="Arial" w:hAnsi="Arial" w:cs="Arial"/>
+        </w:rPr>
+      </w:pPr>
+    </w:p>
+    <w:p>
+      <w:pPr>
+        <w:rPr>
+          <w:rFonts w:ascii="Arial" w:hAnsi="Arial" w:cs="Arial"/>
+        </w:rPr>
+      </w:pPr>
+      <w:r>
+        <w:rPr>
+          <w:rFonts w:ascii="Arial" w:hAnsi="Arial" w:cs="Arial"/>
+        </w:rPr>
+        <w:t>&lt;</w:t>
+      </w:r>
+      <w:proofErr w:type="spellStart"/>
+      <w:r>
+        <w:rPr>
+          <w:rFonts w:ascii="Arial" w:hAnsi="Arial" w:cs="Arial"/>
+        </w:rPr>
+        <w:t>Sentencia_For</w:t>
+      </w:r>
+      <w:proofErr w:type="spellEnd"/>
+      <w:r>
+        <w:rPr>
+          <w:rFonts w:ascii="Arial" w:hAnsi="Arial" w:cs="Arial"/>
+        </w:rPr>
+        <w:t>&gt; ::= &lt;For&gt; &lt;</w:t>
+      </w:r>
+      <w:proofErr w:type="spellStart"/>
+      <w:r>
+        <w:rPr>
+          <w:rFonts w:ascii="Arial" w:hAnsi="Arial" w:cs="Arial"/>
+        </w:rPr>
         <w:t>Par_Ini</w:t>
       </w:r>
       <w:proofErr w:type="spellEnd"/>
@@ -2345,7 +2884,7 @@
         <w:rPr>
           <w:rFonts w:ascii="Arial" w:hAnsi="Arial" w:cs="Arial"/>
         </w:rPr>
-        <w:t>Parametros</w:t>
+        <w:t>Sentencia_For_Init</w:t>
       </w:r>
       <w:proofErr w:type="spellEnd"/>
       <w:r>
@@ -2359,6 +2898,62 @@
         <w:rPr>
           <w:rFonts w:ascii="Arial" w:hAnsi="Arial" w:cs="Arial"/>
         </w:rPr>
+        <w:t>Fin_Expr</w:t>
+      </w:r>
+      <w:proofErr w:type="spellEnd"/>
+      <w:r>
+        <w:rPr>
+          <w:rFonts w:ascii="Arial" w:hAnsi="Arial" w:cs="Arial"/>
+        </w:rPr>
+        <w:t>&gt; &lt;</w:t>
+      </w:r>
+      <w:proofErr w:type="spellStart"/>
+      <w:r>
+        <w:rPr>
+          <w:rFonts w:ascii="Arial" w:hAnsi="Arial" w:cs="Arial"/>
+        </w:rPr>
+        <w:t>Expresion</w:t>
+      </w:r>
+      <w:proofErr w:type="spellEnd"/>
+      <w:r>
+        <w:rPr>
+          <w:rFonts w:ascii="Arial" w:hAnsi="Arial" w:cs="Arial"/>
+        </w:rPr>
+        <w:t>&gt; &lt;</w:t>
+      </w:r>
+      <w:proofErr w:type="spellStart"/>
+      <w:r>
+        <w:rPr>
+          <w:rFonts w:ascii="Arial" w:hAnsi="Arial" w:cs="Arial"/>
+        </w:rPr>
+        <w:t>Fin_Expr</w:t>
+      </w:r>
+      <w:proofErr w:type="spellEnd"/>
+      <w:r>
+        <w:rPr>
+          <w:rFonts w:ascii="Arial" w:hAnsi="Arial" w:cs="Arial"/>
+        </w:rPr>
+        <w:t>&gt; &lt;</w:t>
+      </w:r>
+      <w:proofErr w:type="spellStart"/>
+      <w:r>
+        <w:rPr>
+          <w:rFonts w:ascii="Arial" w:hAnsi="Arial" w:cs="Arial"/>
+        </w:rPr>
+        <w:t>Sentencia_For_Incremento</w:t>
+      </w:r>
+      <w:proofErr w:type="spellEnd"/>
+      <w:r>
+        <w:rPr>
+          <w:rFonts w:ascii="Arial" w:hAnsi="Arial" w:cs="Arial"/>
+        </w:rPr>
+        <w:t>&gt; &lt;</w:t>
+      </w:r>
+      <w:proofErr w:type="spellStart"/>
+      <w:r>
+        <w:rPr>
+          <w:rFonts w:ascii="Arial" w:hAnsi="Arial" w:cs="Arial"/>
+        </w:rPr>
         <w:t>Par_Fin</w:t>
       </w:r>
       <w:proofErr w:type="spellEnd"/>
@@ -2375,6 +2970,13 @@
           <w:rFonts w:ascii="Arial" w:hAnsi="Arial" w:cs="Arial"/>
         </w:rPr>
       </w:pPr>
+    </w:p>
+    <w:p>
+      <w:pPr>
+        <w:rPr>
+          <w:rFonts w:ascii="Arial" w:hAnsi="Arial" w:cs="Arial"/>
+        </w:rPr>
+      </w:pPr>
       <w:r>
         <w:rPr>
           <w:rFonts w:ascii="Arial" w:hAnsi="Arial" w:cs="Arial"/>
@@ -2386,7 +2988,7 @@
         <w:rPr>
           <w:rFonts w:ascii="Arial" w:hAnsi="Arial" w:cs="Arial"/>
         </w:rPr>
-        <w:t>Declaracion_Funcion</w:t>
+        <w:t>Sentencia_If</w:t>
       </w:r>
       <w:proofErr w:type="spellEnd"/>
       <w:r>
@@ -2400,14 +3002,14 @@
         <w:rPr>
           <w:rFonts w:ascii="Arial" w:hAnsi="Arial" w:cs="Arial"/>
         </w:rPr>
-        <w:t>Tipo_Retorno</w:t>
+        <w:t>If</w:t>
       </w:r>
       <w:proofErr w:type="spellEnd"/>
       <w:r>
         <w:rPr>
           <w:rFonts w:ascii="Arial" w:hAnsi="Arial" w:cs="Arial"/>
         </w:rPr>
-        <w:t>&gt; &lt;Id&gt; &lt;</w:t>
+        <w:t>&gt; &lt;</w:t>
       </w:r>
       <w:proofErr w:type="spellStart"/>
       <w:r>
@@ -2428,6 +3030,20 @@
         <w:rPr>
           <w:rFonts w:ascii="Arial" w:hAnsi="Arial" w:cs="Arial"/>
         </w:rPr>
+        <w:t>Expresion</w:t>
+      </w:r>
+      <w:proofErr w:type="spellEnd"/>
+      <w:r>
+        <w:rPr>
+          <w:rFonts w:ascii="Arial" w:hAnsi="Arial" w:cs="Arial"/>
+        </w:rPr>
+        <w:t>&gt; &lt;</w:t>
+      </w:r>
+      <w:proofErr w:type="spellStart"/>
+      <w:r>
+        <w:rPr>
+          <w:rFonts w:ascii="Arial" w:hAnsi="Arial" w:cs="Arial"/>
+        </w:rPr>
         <w:t>Par_Fin</w:t>
       </w:r>
       <w:proofErr w:type="spellEnd"/>
@@ -2435,6 +3051,240 @@
         <w:rPr>
           <w:rFonts w:ascii="Arial" w:hAnsi="Arial" w:cs="Arial"/>
         </w:rPr>
+        <w:t>&gt; &lt;Bloque&gt; &lt;</w:t>
+      </w:r>
+      <w:proofErr w:type="spellStart"/>
+      <w:r>
+        <w:rPr>
+          <w:rFonts w:ascii="Arial" w:hAnsi="Arial" w:cs="Arial"/>
+        </w:rPr>
+        <w:t>Sentencia_If_Resto</w:t>
+      </w:r>
+      <w:proofErr w:type="spellEnd"/>
+      <w:r>
+        <w:rPr>
+          <w:rFonts w:ascii="Arial" w:hAnsi="Arial" w:cs="Arial"/>
+        </w:rPr>
+        <w:t>&gt;</w:t>
+      </w:r>
+    </w:p>
+    <w:p>
+      <w:pPr>
+        <w:rPr>
+          <w:rFonts w:ascii="Arial" w:hAnsi="Arial" w:cs="Arial"/>
+        </w:rPr>
+      </w:pPr>
+    </w:p>
+    <w:p>
+      <w:pPr>
+        <w:rPr>
+          <w:rFonts w:ascii="Arial" w:hAnsi="Arial" w:cs="Arial"/>
+        </w:rPr>
+      </w:pPr>
+      <w:r>
+        <w:rPr>
+          <w:rFonts w:ascii="Arial" w:hAnsi="Arial" w:cs="Arial"/>
+        </w:rPr>
+        <w:lastRenderedPageBreak/>
+        <w:t>&lt;</w:t>
+      </w:r>
+      <w:proofErr w:type="spellStart"/>
+      <w:r>
+        <w:rPr>
+          <w:rFonts w:ascii="Arial" w:hAnsi="Arial" w:cs="Arial"/>
+        </w:rPr>
+        <w:t>Sentencia_If_Resto</w:t>
+      </w:r>
+      <w:proofErr w:type="spellEnd"/>
+      <w:r>
+        <w:rPr>
+          <w:rFonts w:ascii="Arial" w:hAnsi="Arial" w:cs="Arial"/>
+        </w:rPr>
+        <w:t>&gt; ::= ε</w:t>
+      </w:r>
+    </w:p>
+    <w:p>
+      <w:pPr>
+        <w:rPr>
+          <w:rFonts w:ascii="Arial" w:hAnsi="Arial" w:cs="Arial"/>
+        </w:rPr>
+      </w:pPr>
+      <w:r>
+        <w:rPr>
+          <w:rFonts w:ascii="Arial" w:hAnsi="Arial" w:cs="Arial"/>
+        </w:rPr>
+        <w:t>&lt;</w:t>
+      </w:r>
+      <w:proofErr w:type="spellStart"/>
+      <w:r>
+        <w:rPr>
+          <w:rFonts w:ascii="Arial" w:hAnsi="Arial" w:cs="Arial"/>
+        </w:rPr>
+        <w:t>Sentencia_If_Resto</w:t>
+      </w:r>
+      <w:proofErr w:type="spellEnd"/>
+      <w:r>
+        <w:rPr>
+          <w:rFonts w:ascii="Arial" w:hAnsi="Arial" w:cs="Arial"/>
+        </w:rPr>
+        <w:t>&gt; ::= &lt;</w:t>
+      </w:r>
+      <w:proofErr w:type="spellStart"/>
+      <w:r>
+        <w:rPr>
+          <w:rFonts w:ascii="Arial" w:hAnsi="Arial" w:cs="Arial"/>
+        </w:rPr>
+        <w:t>Sentencia_Elif_Lista</w:t>
+      </w:r>
+      <w:proofErr w:type="spellEnd"/>
+      <w:r>
+        <w:rPr>
+          <w:rFonts w:ascii="Arial" w:hAnsi="Arial" w:cs="Arial"/>
+        </w:rPr>
+        <w:t>&gt;</w:t>
+      </w:r>
+    </w:p>
+    <w:p>
+      <w:pPr>
+        <w:rPr>
+          <w:rFonts w:ascii="Arial" w:hAnsi="Arial" w:cs="Arial"/>
+        </w:rPr>
+      </w:pPr>
+      <w:r>
+        <w:rPr>
+          <w:rFonts w:ascii="Arial" w:hAnsi="Arial" w:cs="Arial"/>
+        </w:rPr>
+        <w:t>&lt;</w:t>
+      </w:r>
+      <w:proofErr w:type="spellStart"/>
+      <w:r>
+        <w:rPr>
+          <w:rFonts w:ascii="Arial" w:hAnsi="Arial" w:cs="Arial"/>
+        </w:rPr>
+        <w:t>Sentencia_If_Resto</w:t>
+      </w:r>
+      <w:proofErr w:type="spellEnd"/>
+      <w:r>
+        <w:rPr>
+          <w:rFonts w:ascii="Arial" w:hAnsi="Arial" w:cs="Arial"/>
+        </w:rPr>
+        <w:t>&gt; ::= &lt;Else&gt; &lt;Bloque&gt;</w:t>
+      </w:r>
+    </w:p>
+    <w:p>
+      <w:pPr>
+        <w:rPr>
+          <w:rFonts w:ascii="Arial" w:hAnsi="Arial" w:cs="Arial"/>
+        </w:rPr>
+      </w:pPr>
+      <w:r>
+        <w:rPr>
+          <w:rFonts w:ascii="Arial" w:hAnsi="Arial" w:cs="Arial"/>
+        </w:rPr>
+        <w:t>&lt;</w:t>
+      </w:r>
+      <w:proofErr w:type="spellStart"/>
+      <w:r>
+        <w:rPr>
+          <w:rFonts w:ascii="Arial" w:hAnsi="Arial" w:cs="Arial"/>
+        </w:rPr>
+        <w:t>Sentencia_If_Resto</w:t>
+      </w:r>
+      <w:proofErr w:type="spellEnd"/>
+      <w:r>
+        <w:rPr>
+          <w:rFonts w:ascii="Arial" w:hAnsi="Arial" w:cs="Arial"/>
+        </w:rPr>
+        <w:t>&gt; ::= &lt;</w:t>
+      </w:r>
+      <w:proofErr w:type="spellStart"/>
+      <w:r>
+        <w:rPr>
+          <w:rFonts w:ascii="Arial" w:hAnsi="Arial" w:cs="Arial"/>
+        </w:rPr>
+        <w:t>Sentencia_Elif_Lista</w:t>
+      </w:r>
+      <w:proofErr w:type="spellEnd"/>
+      <w:r>
+        <w:rPr>
+          <w:rFonts w:ascii="Arial" w:hAnsi="Arial" w:cs="Arial"/>
+        </w:rPr>
+        <w:t>&gt; &lt;Else&gt; &lt;Bloque&gt;</w:t>
+      </w:r>
+    </w:p>
+    <w:p>
+      <w:pPr>
+        <w:rPr>
+          <w:rFonts w:ascii="Arial" w:hAnsi="Arial" w:cs="Arial"/>
+        </w:rPr>
+      </w:pPr>
+    </w:p>
+    <w:p>
+      <w:pPr>
+        <w:rPr>
+          <w:rFonts w:ascii="Arial" w:hAnsi="Arial" w:cs="Arial"/>
+        </w:rPr>
+      </w:pPr>
+      <w:r>
+        <w:rPr>
+          <w:rFonts w:ascii="Arial" w:hAnsi="Arial" w:cs="Arial"/>
+        </w:rPr>
+        <w:t>&lt;</w:t>
+      </w:r>
+      <w:proofErr w:type="spellStart"/>
+      <w:r>
+        <w:rPr>
+          <w:rFonts w:ascii="Arial" w:hAnsi="Arial" w:cs="Arial"/>
+        </w:rPr>
+        <w:t>Sentencia_Elif_Lista</w:t>
+      </w:r>
+      <w:proofErr w:type="spellEnd"/>
+      <w:r>
+        <w:rPr>
+          <w:rFonts w:ascii="Arial" w:hAnsi="Arial" w:cs="Arial"/>
+        </w:rPr>
+        <w:t>&gt; ::= &lt;Elif&gt; &lt;</w:t>
+      </w:r>
+      <w:proofErr w:type="spellStart"/>
+      <w:r>
+        <w:rPr>
+          <w:rFonts w:ascii="Arial" w:hAnsi="Arial" w:cs="Arial"/>
+        </w:rPr>
+        <w:t>Par_Ini</w:t>
+      </w:r>
+      <w:proofErr w:type="spellEnd"/>
+      <w:r>
+        <w:rPr>
+          <w:rFonts w:ascii="Arial" w:hAnsi="Arial" w:cs="Arial"/>
+        </w:rPr>
+        <w:t>&gt; &lt;</w:t>
+      </w:r>
+      <w:proofErr w:type="spellStart"/>
+      <w:r>
+        <w:rPr>
+          <w:rFonts w:ascii="Arial" w:hAnsi="Arial" w:cs="Arial"/>
+        </w:rPr>
+        <w:t>Expresion</w:t>
+      </w:r>
+      <w:proofErr w:type="spellEnd"/>
+      <w:r>
+        <w:rPr>
+          <w:rFonts w:ascii="Arial" w:hAnsi="Arial" w:cs="Arial"/>
+        </w:rPr>
+        <w:t>&gt; &lt;</w:t>
+      </w:r>
+      <w:proofErr w:type="spellStart"/>
+      <w:r>
+        <w:rPr>
+          <w:rFonts w:ascii="Arial" w:hAnsi="Arial" w:cs="Arial"/>
+        </w:rPr>
+        <w:t>Par_Fin</w:t>
+      </w:r>
+      <w:proofErr w:type="spellEnd"/>
+      <w:r>
+        <w:rPr>
+          <w:rFonts w:ascii="Arial" w:hAnsi="Arial" w:cs="Arial"/>
+        </w:rPr>
         <w:t>&gt; &lt;Bloque&gt;</w:t>
       </w:r>
     </w:p>
@@ -2444,24 +3294,45 @@
           <w:rFonts w:ascii="Arial" w:hAnsi="Arial" w:cs="Arial"/>
         </w:rPr>
       </w:pPr>
-    </w:p>
-    <w:p>
-      <w:pPr>
-        <w:rPr>
-          <w:rFonts w:ascii="Arial" w:hAnsi="Arial" w:cs="Arial"/>
-        </w:rPr>
-      </w:pPr>
-      <w:r>
-        <w:rPr>
-          <w:rFonts w:ascii="Arial" w:hAnsi="Arial" w:cs="Arial"/>
-        </w:rPr>
-        <w:t>&lt;Argumento&gt; ::= &lt;</w:t>
+      <w:r>
+        <w:rPr>
+          <w:rFonts w:ascii="Arial" w:hAnsi="Arial" w:cs="Arial"/>
+        </w:rPr>
+        <w:t>&lt;</w:t>
       </w:r>
       <w:proofErr w:type="spellStart"/>
       <w:r>
         <w:rPr>
           <w:rFonts w:ascii="Arial" w:hAnsi="Arial" w:cs="Arial"/>
         </w:rPr>
+        <w:t>Sentencia_Elif_Lista</w:t>
+      </w:r>
+      <w:proofErr w:type="spellEnd"/>
+      <w:r>
+        <w:rPr>
+          <w:rFonts w:ascii="Arial" w:hAnsi="Arial" w:cs="Arial"/>
+        </w:rPr>
+        <w:t>&gt; ::= &lt;Elif&gt; &lt;</w:t>
+      </w:r>
+      <w:proofErr w:type="spellStart"/>
+      <w:r>
+        <w:rPr>
+          <w:rFonts w:ascii="Arial" w:hAnsi="Arial" w:cs="Arial"/>
+        </w:rPr>
+        <w:t>Par_Ini</w:t>
+      </w:r>
+      <w:proofErr w:type="spellEnd"/>
+      <w:r>
+        <w:rPr>
+          <w:rFonts w:ascii="Arial" w:hAnsi="Arial" w:cs="Arial"/>
+        </w:rPr>
+        <w:t>&gt; &lt;</w:t>
+      </w:r>
+      <w:proofErr w:type="spellStart"/>
+      <w:r>
+        <w:rPr>
+          <w:rFonts w:ascii="Arial" w:hAnsi="Arial" w:cs="Arial"/>
+        </w:rPr>
         <w:t>Expresion</w:t>
       </w:r>
       <w:proofErr w:type="spellEnd"/>
@@ -2469,6 +3340,34 @@
         <w:rPr>
           <w:rFonts w:ascii="Arial" w:hAnsi="Arial" w:cs="Arial"/>
         </w:rPr>
+        <w:t>&gt; &lt;</w:t>
+      </w:r>
+      <w:proofErr w:type="spellStart"/>
+      <w:r>
+        <w:rPr>
+          <w:rFonts w:ascii="Arial" w:hAnsi="Arial" w:cs="Arial"/>
+        </w:rPr>
+        <w:t>Par_Fin</w:t>
+      </w:r>
+      <w:proofErr w:type="spellEnd"/>
+      <w:r>
+        <w:rPr>
+          <w:rFonts w:ascii="Arial" w:hAnsi="Arial" w:cs="Arial"/>
+        </w:rPr>
+        <w:t>&gt; &lt;Bloque&gt; &lt;</w:t>
+      </w:r>
+      <w:proofErr w:type="spellStart"/>
+      <w:r>
+        <w:rPr>
+          <w:rFonts w:ascii="Arial" w:hAnsi="Arial" w:cs="Arial"/>
+        </w:rPr>
+        <w:t>Sentencia_Elif_Lista</w:t>
+      </w:r>
+      <w:proofErr w:type="spellEnd"/>
+      <w:r>
+        <w:rPr>
+          <w:rFonts w:ascii="Arial" w:hAnsi="Arial" w:cs="Arial"/>
+        </w:rPr>
         <w:t>&gt;</w:t>
       </w:r>
     </w:p>
@@ -2478,142 +3377,13 @@
           <w:rFonts w:ascii="Arial" w:hAnsi="Arial" w:cs="Arial"/>
         </w:rPr>
       </w:pPr>
-      <w:r>
-        <w:rPr>
-          <w:rFonts w:ascii="Arial" w:hAnsi="Arial" w:cs="Arial"/>
-        </w:rPr>
-        <w:t>&lt;Argumentos&gt; ::= &lt;Argumento&gt;</w:t>
-      </w:r>
-    </w:p>
-    <w:p>
-      <w:pPr>
-        <w:rPr>
-          <w:rFonts w:ascii="Arial" w:hAnsi="Arial" w:cs="Arial"/>
-        </w:rPr>
-      </w:pPr>
-      <w:r>
-        <w:rPr>
-          <w:rFonts w:ascii="Arial" w:hAnsi="Arial" w:cs="Arial"/>
-        </w:rPr>
-        <w:t>&lt;Argumentos&gt; ::= &lt;Argumento&gt; &lt;Coma&gt; &lt;Argumentos&gt;</w:t>
-      </w:r>
-    </w:p>
-    <w:p>
-      <w:pPr>
-        <w:rPr>
-          <w:rFonts w:ascii="Arial" w:hAnsi="Arial" w:cs="Arial"/>
-        </w:rPr>
-      </w:pPr>
-    </w:p>
-    <w:p>
-      <w:pPr>
-        <w:rPr>
-          <w:rFonts w:ascii="Arial" w:hAnsi="Arial" w:cs="Arial"/>
-        </w:rPr>
-      </w:pPr>
-      <w:r>
-        <w:rPr>
-          <w:rFonts w:ascii="Arial" w:hAnsi="Arial" w:cs="Arial"/>
-        </w:rPr>
-        <w:t>&lt;</w:t>
-      </w:r>
-      <w:proofErr w:type="spellStart"/>
-      <w:r>
-        <w:rPr>
-          <w:rFonts w:ascii="Arial" w:hAnsi="Arial" w:cs="Arial"/>
-        </w:rPr>
-        <w:t>Llamada_Funcion</w:t>
-      </w:r>
-      <w:proofErr w:type="spellEnd"/>
-      <w:r>
-        <w:rPr>
-          <w:rFonts w:ascii="Arial" w:hAnsi="Arial" w:cs="Arial"/>
-        </w:rPr>
-        <w:t>&gt; ::= &lt;Id&gt; &lt;</w:t>
-      </w:r>
-      <w:proofErr w:type="spellStart"/>
-      <w:r>
-        <w:rPr>
-          <w:rFonts w:ascii="Arial" w:hAnsi="Arial" w:cs="Arial"/>
-        </w:rPr>
-        <w:t>Par_Ini</w:t>
-      </w:r>
-      <w:proofErr w:type="spellEnd"/>
-      <w:r>
-        <w:rPr>
-          <w:rFonts w:ascii="Arial" w:hAnsi="Arial" w:cs="Arial"/>
-        </w:rPr>
-        <w:t>&gt; &lt;Argumentos&gt; &lt;</w:t>
-      </w:r>
-      <w:proofErr w:type="spellStart"/>
-      <w:r>
-        <w:rPr>
-          <w:rFonts w:ascii="Arial" w:hAnsi="Arial" w:cs="Arial"/>
-        </w:rPr>
-        <w:t>Par_Fin</w:t>
-      </w:r>
-      <w:proofErr w:type="spellEnd"/>
-      <w:r>
-        <w:rPr>
-          <w:rFonts w:ascii="Arial" w:hAnsi="Arial" w:cs="Arial"/>
-        </w:rPr>
-        <w:t>&gt;</w:t>
-      </w:r>
-    </w:p>
-    <w:p>
-      <w:pPr>
-        <w:rPr>
-          <w:rFonts w:ascii="Arial" w:hAnsi="Arial" w:cs="Arial"/>
-        </w:rPr>
-      </w:pPr>
-      <w:r>
-        <w:rPr>
-          <w:rFonts w:ascii="Arial" w:hAnsi="Arial" w:cs="Arial"/>
-        </w:rPr>
-        <w:t>&lt;</w:t>
-      </w:r>
-      <w:proofErr w:type="spellStart"/>
-      <w:r>
-        <w:rPr>
-          <w:rFonts w:ascii="Arial" w:hAnsi="Arial" w:cs="Arial"/>
-        </w:rPr>
-        <w:t>Llamada_Funcion</w:t>
-      </w:r>
-      <w:proofErr w:type="spellEnd"/>
-      <w:r>
-        <w:rPr>
-          <w:rFonts w:ascii="Arial" w:hAnsi="Arial" w:cs="Arial"/>
-        </w:rPr>
-        <w:t>&gt; ::= &lt;Id&gt; &lt;</w:t>
-      </w:r>
-      <w:proofErr w:type="spellStart"/>
-      <w:r>
-        <w:rPr>
-          <w:rFonts w:ascii="Arial" w:hAnsi="Arial" w:cs="Arial"/>
-        </w:rPr>
-        <w:t>Par_Ini</w:t>
-      </w:r>
-      <w:proofErr w:type="spellEnd"/>
-      <w:r>
-        <w:rPr>
-          <w:rFonts w:ascii="Arial" w:hAnsi="Arial" w:cs="Arial"/>
-        </w:rPr>
-        <w:t>&gt; &lt;</w:t>
-      </w:r>
-      <w:proofErr w:type="spellStart"/>
-      <w:r>
-        <w:rPr>
-          <w:rFonts w:ascii="Arial" w:hAnsi="Arial" w:cs="Arial"/>
-        </w:rPr>
-        <w:t>Par_Fin</w:t>
-      </w:r>
-      <w:proofErr w:type="spellEnd"/>
-      <w:r>
-        <w:rPr>
-          <w:rFonts w:ascii="Arial" w:hAnsi="Arial" w:cs="Arial"/>
-        </w:rPr>
-        <w:t>&gt;</w:t>
-      </w:r>
+    </w:p>
+    <w:p>
+      <w:pPr>
+        <w:rPr>
+          <w:rFonts w:ascii="Arial" w:hAnsi="Arial" w:cs="Arial"/>
+        </w:rPr>
+      </w:pPr>
     </w:p>
     <w:sectPr>
       <w:pgSz w:w="12240" w:h="15840"/>

</xml_diff>

<commit_message>
Declaración de while y sentencias
</commit_message>
<xml_diff>
--- a/Producciones.docx
+++ b/Producciones.docx
@@ -3377,6 +3377,405 @@
           <w:rFonts w:ascii="Arial" w:hAnsi="Arial" w:cs="Arial"/>
         </w:rPr>
       </w:pPr>
+      <w:r>
+        <w:rPr>
+          <w:rFonts w:ascii="Arial" w:hAnsi="Arial" w:cs="Arial"/>
+        </w:rPr>
+        <w:t>&lt;Sentencia&gt; ::= &lt;</w:t>
+      </w:r>
+      <w:proofErr w:type="spellStart"/>
+      <w:r>
+        <w:rPr>
+          <w:rFonts w:ascii="Arial" w:hAnsi="Arial" w:cs="Arial"/>
+        </w:rPr>
+        <w:t>Declaracion_Var_Simple</w:t>
+      </w:r>
+      <w:proofErr w:type="spellEnd"/>
+      <w:r>
+        <w:rPr>
+          <w:rFonts w:ascii="Arial" w:hAnsi="Arial" w:cs="Arial"/>
+        </w:rPr>
+        <w:t>&gt;</w:t>
+      </w:r>
+    </w:p>
+    <w:p>
+      <w:pPr>
+        <w:rPr>
+          <w:rFonts w:ascii="Arial" w:hAnsi="Arial" w:cs="Arial"/>
+        </w:rPr>
+      </w:pPr>
+      <w:r>
+        <w:rPr>
+          <w:rFonts w:ascii="Arial" w:hAnsi="Arial" w:cs="Arial"/>
+        </w:rPr>
+        <w:t>&lt;Sentencia&gt; ::= &lt;</w:t>
+      </w:r>
+      <w:proofErr w:type="spellStart"/>
+      <w:r>
+        <w:rPr>
+          <w:rFonts w:ascii="Arial" w:hAnsi="Arial" w:cs="Arial"/>
+        </w:rPr>
+        <w:t>Declaracion_Var_Asignada</w:t>
+      </w:r>
+      <w:proofErr w:type="spellEnd"/>
+      <w:r>
+        <w:rPr>
+          <w:rFonts w:ascii="Arial" w:hAnsi="Arial" w:cs="Arial"/>
+        </w:rPr>
+        <w:t>&gt;</w:t>
+      </w:r>
+    </w:p>
+    <w:p>
+      <w:pPr>
+        <w:rPr>
+          <w:rFonts w:ascii="Arial" w:hAnsi="Arial" w:cs="Arial"/>
+        </w:rPr>
+      </w:pPr>
+      <w:r>
+        <w:rPr>
+          <w:rFonts w:ascii="Arial" w:hAnsi="Arial" w:cs="Arial"/>
+        </w:rPr>
+        <w:t>&lt;Sentencia&gt; ::= &lt;</w:t>
+      </w:r>
+      <w:proofErr w:type="spellStart"/>
+      <w:r>
+        <w:rPr>
+          <w:rFonts w:ascii="Arial" w:hAnsi="Arial" w:cs="Arial"/>
+        </w:rPr>
+        <w:t>Asignacion_Var</w:t>
+      </w:r>
+      <w:proofErr w:type="spellEnd"/>
+      <w:r>
+        <w:rPr>
+          <w:rFonts w:ascii="Arial" w:hAnsi="Arial" w:cs="Arial"/>
+        </w:rPr>
+        <w:t>&gt;</w:t>
+      </w:r>
+    </w:p>
+    <w:p>
+      <w:pPr>
+        <w:rPr>
+          <w:rFonts w:ascii="Arial" w:hAnsi="Arial" w:cs="Arial"/>
+        </w:rPr>
+      </w:pPr>
+      <w:r>
+        <w:rPr>
+          <w:rFonts w:ascii="Arial" w:hAnsi="Arial" w:cs="Arial"/>
+        </w:rPr>
+        <w:t>&lt;Sentencia&gt; ::= &lt;Arreglo&gt;</w:t>
+      </w:r>
+    </w:p>
+    <w:p>
+      <w:pPr>
+        <w:rPr>
+          <w:rFonts w:ascii="Arial" w:hAnsi="Arial" w:cs="Arial"/>
+        </w:rPr>
+      </w:pPr>
+      <w:r>
+        <w:rPr>
+          <w:rFonts w:ascii="Arial" w:hAnsi="Arial" w:cs="Arial"/>
+        </w:rPr>
+        <w:t>&lt;Sentencia&gt; ::= &lt;</w:t>
+      </w:r>
+      <w:proofErr w:type="spellStart"/>
+      <w:r>
+        <w:rPr>
+          <w:rFonts w:ascii="Arial" w:hAnsi="Arial" w:cs="Arial"/>
+        </w:rPr>
+        <w:t>Asignacion_Arreglo</w:t>
+      </w:r>
+      <w:proofErr w:type="spellEnd"/>
+      <w:r>
+        <w:rPr>
+          <w:rFonts w:ascii="Arial" w:hAnsi="Arial" w:cs="Arial"/>
+        </w:rPr>
+        <w:t>&gt;</w:t>
+      </w:r>
+    </w:p>
+    <w:p>
+      <w:pPr>
+        <w:rPr>
+          <w:rFonts w:ascii="Arial" w:hAnsi="Arial" w:cs="Arial"/>
+        </w:rPr>
+      </w:pPr>
+      <w:r>
+        <w:rPr>
+          <w:rFonts w:ascii="Arial" w:hAnsi="Arial" w:cs="Arial"/>
+        </w:rPr>
+        <w:t>&lt;Sentencia&gt; ::= &lt;</w:t>
+      </w:r>
+      <w:proofErr w:type="spellStart"/>
+      <w:r>
+        <w:rPr>
+          <w:rFonts w:ascii="Arial" w:hAnsi="Arial" w:cs="Arial"/>
+        </w:rPr>
+        <w:t>Expr_Sin_Asignacion</w:t>
+      </w:r>
+      <w:proofErr w:type="spellEnd"/>
+      <w:r>
+        <w:rPr>
+          <w:rFonts w:ascii="Arial" w:hAnsi="Arial" w:cs="Arial"/>
+        </w:rPr>
+        <w:t>&gt;</w:t>
+      </w:r>
+    </w:p>
+    <w:p>
+      <w:pPr>
+        <w:rPr>
+          <w:rFonts w:ascii="Arial" w:hAnsi="Arial" w:cs="Arial"/>
+        </w:rPr>
+      </w:pPr>
+      <w:r>
+        <w:rPr>
+          <w:rFonts w:ascii="Arial" w:hAnsi="Arial" w:cs="Arial"/>
+        </w:rPr>
+        <w:t>&lt;Sentencia&gt; ::= &lt;</w:t>
+      </w:r>
+      <w:proofErr w:type="spellStart"/>
+      <w:r>
+        <w:rPr>
+          <w:rFonts w:ascii="Arial" w:hAnsi="Arial" w:cs="Arial"/>
+        </w:rPr>
+        <w:t>Sentencia_Return</w:t>
+      </w:r>
+      <w:proofErr w:type="spellEnd"/>
+      <w:r>
+        <w:rPr>
+          <w:rFonts w:ascii="Arial" w:hAnsi="Arial" w:cs="Arial"/>
+        </w:rPr>
+        <w:t>&gt;</w:t>
+      </w:r>
+    </w:p>
+    <w:p>
+      <w:pPr>
+        <w:rPr>
+          <w:rFonts w:ascii="Arial" w:hAnsi="Arial" w:cs="Arial"/>
+        </w:rPr>
+      </w:pPr>
+      <w:r>
+        <w:rPr>
+          <w:rFonts w:ascii="Arial" w:hAnsi="Arial" w:cs="Arial"/>
+        </w:rPr>
+        <w:t>&lt;Sentencia&gt; ::= &lt;</w:t>
+      </w:r>
+      <w:proofErr w:type="spellStart"/>
+      <w:r>
+        <w:rPr>
+          <w:rFonts w:ascii="Arial" w:hAnsi="Arial" w:cs="Arial"/>
+        </w:rPr>
+        <w:t>Sentencia_Break</w:t>
+      </w:r>
+      <w:proofErr w:type="spellEnd"/>
+      <w:r>
+        <w:rPr>
+          <w:rFonts w:ascii="Arial" w:hAnsi="Arial" w:cs="Arial"/>
+        </w:rPr>
+        <w:t>&gt;</w:t>
+      </w:r>
+    </w:p>
+    <w:p>
+      <w:pPr>
+        <w:rPr>
+          <w:rFonts w:ascii="Arial" w:hAnsi="Arial" w:cs="Arial"/>
+        </w:rPr>
+      </w:pPr>
+      <w:r>
+        <w:rPr>
+          <w:rFonts w:ascii="Arial" w:hAnsi="Arial" w:cs="Arial"/>
+        </w:rPr>
+        <w:t>&lt;Sentencia&gt; ::= &lt;</w:t>
+      </w:r>
+      <w:proofErr w:type="spellStart"/>
+      <w:r>
+        <w:rPr>
+          <w:rFonts w:ascii="Arial" w:hAnsi="Arial" w:cs="Arial"/>
+        </w:rPr>
+        <w:t>Sentencia_Read</w:t>
+      </w:r>
+      <w:proofErr w:type="spellEnd"/>
+      <w:r>
+        <w:rPr>
+          <w:rFonts w:ascii="Arial" w:hAnsi="Arial" w:cs="Arial"/>
+        </w:rPr>
+        <w:t>&gt;</w:t>
+      </w:r>
+    </w:p>
+    <w:p>
+      <w:pPr>
+        <w:rPr>
+          <w:rFonts w:ascii="Arial" w:hAnsi="Arial" w:cs="Arial"/>
+        </w:rPr>
+      </w:pPr>
+      <w:r>
+        <w:rPr>
+          <w:rFonts w:ascii="Arial" w:hAnsi="Arial" w:cs="Arial"/>
+        </w:rPr>
+        <w:t>&lt;Sentencia&gt; ::= &lt;</w:t>
+      </w:r>
+      <w:proofErr w:type="spellStart"/>
+      <w:r>
+        <w:rPr>
+          <w:rFonts w:ascii="Arial" w:hAnsi="Arial" w:cs="Arial"/>
+        </w:rPr>
+        <w:t>Sentencia_Write</w:t>
+      </w:r>
+      <w:proofErr w:type="spellEnd"/>
+      <w:r>
+        <w:rPr>
+          <w:rFonts w:ascii="Arial" w:hAnsi="Arial" w:cs="Arial"/>
+        </w:rPr>
+        <w:t>&gt;</w:t>
+      </w:r>
+    </w:p>
+    <w:p>
+      <w:pPr>
+        <w:rPr>
+          <w:rFonts w:ascii="Arial" w:hAnsi="Arial" w:cs="Arial"/>
+        </w:rPr>
+      </w:pPr>
+      <w:r>
+        <w:rPr>
+          <w:rFonts w:ascii="Arial" w:hAnsi="Arial" w:cs="Arial"/>
+        </w:rPr>
+        <w:t>&lt;Sentencia&gt; ::= &lt;</w:t>
+      </w:r>
+      <w:proofErr w:type="spellStart"/>
+      <w:r>
+        <w:rPr>
+          <w:rFonts w:ascii="Arial" w:hAnsi="Arial" w:cs="Arial"/>
+        </w:rPr>
+        <w:t>Sentencia_If</w:t>
+      </w:r>
+      <w:proofErr w:type="spellEnd"/>
+      <w:r>
+        <w:rPr>
+          <w:rFonts w:ascii="Arial" w:hAnsi="Arial" w:cs="Arial"/>
+        </w:rPr>
+        <w:t>&gt;</w:t>
+      </w:r>
+    </w:p>
+    <w:p>
+      <w:pPr>
+        <w:rPr>
+          <w:rFonts w:ascii="Arial" w:hAnsi="Arial" w:cs="Arial"/>
+        </w:rPr>
+      </w:pPr>
+      <w:r>
+        <w:rPr>
+          <w:rFonts w:ascii="Arial" w:hAnsi="Arial" w:cs="Arial"/>
+        </w:rPr>
+        <w:t>&lt;Sentencia&gt; ::= &lt;</w:t>
+      </w:r>
+      <w:proofErr w:type="spellStart"/>
+      <w:r>
+        <w:rPr>
+          <w:rFonts w:ascii="Arial" w:hAnsi="Arial" w:cs="Arial"/>
+        </w:rPr>
+        <w:t>Sentencia_While</w:t>
+      </w:r>
+      <w:proofErr w:type="spellEnd"/>
+      <w:r>
+        <w:rPr>
+          <w:rFonts w:ascii="Arial" w:hAnsi="Arial" w:cs="Arial"/>
+        </w:rPr>
+        <w:t>&gt;</w:t>
+      </w:r>
+    </w:p>
+    <w:p>
+      <w:pPr>
+        <w:rPr>
+          <w:rFonts w:ascii="Arial" w:hAnsi="Arial" w:cs="Arial"/>
+        </w:rPr>
+      </w:pPr>
+      <w:r>
+        <w:rPr>
+          <w:rFonts w:ascii="Arial" w:hAnsi="Arial" w:cs="Arial"/>
+        </w:rPr>
+        <w:t>&lt;Sentencia&gt; ::= &lt;</w:t>
+      </w:r>
+      <w:proofErr w:type="spellStart"/>
+      <w:r>
+        <w:rPr>
+          <w:rFonts w:ascii="Arial" w:hAnsi="Arial" w:cs="Arial"/>
+        </w:rPr>
+        <w:t>Sentencia_For</w:t>
+      </w:r>
+      <w:proofErr w:type="spellEnd"/>
+      <w:r>
+        <w:rPr>
+          <w:rFonts w:ascii="Arial" w:hAnsi="Arial" w:cs="Arial"/>
+        </w:rPr>
+        <w:t>&gt;</w:t>
+      </w:r>
+    </w:p>
+    <w:p>
+      <w:pPr>
+        <w:rPr>
+          <w:rFonts w:ascii="Arial" w:hAnsi="Arial" w:cs="Arial"/>
+        </w:rPr>
+      </w:pPr>
+      <w:r>
+        <w:rPr>
+          <w:rFonts w:ascii="Arial" w:hAnsi="Arial" w:cs="Arial"/>
+        </w:rPr>
+        <w:t>&lt;</w:t>
+      </w:r>
+      <w:proofErr w:type="spellStart"/>
+      <w:r>
+        <w:rPr>
+          <w:rFonts w:ascii="Arial" w:hAnsi="Arial" w:cs="Arial"/>
+        </w:rPr>
+        <w:t>Sentencia_While</w:t>
+      </w:r>
+      <w:proofErr w:type="spellEnd"/>
+      <w:r>
+        <w:rPr>
+          <w:rFonts w:ascii="Arial" w:hAnsi="Arial" w:cs="Arial"/>
+        </w:rPr>
+        <w:t>&gt; ::= &lt;While&gt; &lt;</w:t>
+      </w:r>
+      <w:proofErr w:type="spellStart"/>
+      <w:r>
+        <w:rPr>
+          <w:rFonts w:ascii="Arial" w:hAnsi="Arial" w:cs="Arial"/>
+        </w:rPr>
+        <w:t>Par_Ini</w:t>
+      </w:r>
+      <w:proofErr w:type="spellEnd"/>
+      <w:r>
+        <w:rPr>
+          <w:rFonts w:ascii="Arial" w:hAnsi="Arial" w:cs="Arial"/>
+        </w:rPr>
+        <w:t>&gt; &lt;</w:t>
+      </w:r>
+      <w:proofErr w:type="spellStart"/>
+      <w:r>
+        <w:rPr>
+          <w:rFonts w:ascii="Arial" w:hAnsi="Arial" w:cs="Arial"/>
+        </w:rPr>
+        <w:t>Expresion</w:t>
+      </w:r>
+      <w:proofErr w:type="spellEnd"/>
+      <w:r>
+        <w:rPr>
+          <w:rFonts w:ascii="Arial" w:hAnsi="Arial" w:cs="Arial"/>
+        </w:rPr>
+        <w:t>&gt; &lt;</w:t>
+      </w:r>
+      <w:proofErr w:type="spellStart"/>
+      <w:r>
+        <w:rPr>
+          <w:rFonts w:ascii="Arial" w:hAnsi="Arial" w:cs="Arial"/>
+        </w:rPr>
+        <w:t>Par_Fin</w:t>
+      </w:r>
+      <w:proofErr w:type="spellEnd"/>
+      <w:r>
+        <w:rPr>
+          <w:rFonts w:ascii="Arial" w:hAnsi="Arial" w:cs="Arial"/>
+        </w:rPr>
+        <w:t>&gt; &lt;Bloque&gt;</w:t>
+      </w:r>
     </w:p>
     <w:p>
       <w:pPr>
@@ -3917,11 +4316,11 @@
     <w:name w:val="Normal"/>
     <w:qFormat/>
   </w:style>
-  <w:style w:type="paragraph" w:styleId="Ttulo1">
+  <w:style w:type="paragraph" w:styleId="Heading1">
     <w:name w:val="heading 1"/>
     <w:basedOn w:val="Normal"/>
     <w:next w:val="Normal"/>
-    <w:link w:val="Ttulo1Car"/>
+    <w:link w:val="Heading1Char"/>
     <w:uiPriority w:val="9"/>
     <w:qFormat/>
     <w:rsid w:val="00C00C98"/>
@@ -3938,11 +4337,11 @@
       <w:szCs w:val="40"/>
     </w:rPr>
   </w:style>
-  <w:style w:type="paragraph" w:styleId="Ttulo2">
+  <w:style w:type="paragraph" w:styleId="Heading2">
     <w:name w:val="heading 2"/>
     <w:basedOn w:val="Normal"/>
     <w:next w:val="Normal"/>
-    <w:link w:val="Ttulo2Car"/>
+    <w:link w:val="Heading2Char"/>
     <w:uiPriority w:val="9"/>
     <w:semiHidden/>
     <w:unhideWhenUsed/>
@@ -3961,11 +4360,11 @@
       <w:szCs w:val="32"/>
     </w:rPr>
   </w:style>
-  <w:style w:type="paragraph" w:styleId="Ttulo3">
+  <w:style w:type="paragraph" w:styleId="Heading3">
     <w:name w:val="heading 3"/>
     <w:basedOn w:val="Normal"/>
     <w:next w:val="Normal"/>
-    <w:link w:val="Ttulo3Car"/>
+    <w:link w:val="Heading3Char"/>
     <w:uiPriority w:val="9"/>
     <w:semiHidden/>
     <w:unhideWhenUsed/>
@@ -3984,11 +4383,11 @@
       <w:szCs w:val="28"/>
     </w:rPr>
   </w:style>
-  <w:style w:type="paragraph" w:styleId="Ttulo4">
+  <w:style w:type="paragraph" w:styleId="Heading4">
     <w:name w:val="heading 4"/>
     <w:basedOn w:val="Normal"/>
     <w:next w:val="Normal"/>
-    <w:link w:val="Ttulo4Car"/>
+    <w:link w:val="Heading4Char"/>
     <w:uiPriority w:val="9"/>
     <w:semiHidden/>
     <w:unhideWhenUsed/>
@@ -4007,11 +4406,11 @@
       <w:color w:val="0F4761" w:themeColor="accent1" w:themeShade="BF"/>
     </w:rPr>
   </w:style>
-  <w:style w:type="paragraph" w:styleId="Ttulo5">
+  <w:style w:type="paragraph" w:styleId="Heading5">
     <w:name w:val="heading 5"/>
     <w:basedOn w:val="Normal"/>
     <w:next w:val="Normal"/>
-    <w:link w:val="Ttulo5Car"/>
+    <w:link w:val="Heading5Char"/>
     <w:uiPriority w:val="9"/>
     <w:semiHidden/>
     <w:unhideWhenUsed/>
@@ -4028,11 +4427,11 @@
       <w:color w:val="0F4761" w:themeColor="accent1" w:themeShade="BF"/>
     </w:rPr>
   </w:style>
-  <w:style w:type="paragraph" w:styleId="Ttulo6">
+  <w:style w:type="paragraph" w:styleId="Heading6">
     <w:name w:val="heading 6"/>
     <w:basedOn w:val="Normal"/>
     <w:next w:val="Normal"/>
-    <w:link w:val="Ttulo6Car"/>
+    <w:link w:val="Heading6Char"/>
     <w:uiPriority w:val="9"/>
     <w:semiHidden/>
     <w:unhideWhenUsed/>
@@ -4051,11 +4450,11 @@
       <w:color w:val="595959" w:themeColor="text1" w:themeTint="A6"/>
     </w:rPr>
   </w:style>
-  <w:style w:type="paragraph" w:styleId="Ttulo7">
+  <w:style w:type="paragraph" w:styleId="Heading7">
     <w:name w:val="heading 7"/>
     <w:basedOn w:val="Normal"/>
     <w:next w:val="Normal"/>
-    <w:link w:val="Ttulo7Car"/>
+    <w:link w:val="Heading7Char"/>
     <w:uiPriority w:val="9"/>
     <w:semiHidden/>
     <w:unhideWhenUsed/>
@@ -4072,11 +4471,11 @@
       <w:color w:val="595959" w:themeColor="text1" w:themeTint="A6"/>
     </w:rPr>
   </w:style>
-  <w:style w:type="paragraph" w:styleId="Ttulo8">
+  <w:style w:type="paragraph" w:styleId="Heading8">
     <w:name w:val="heading 8"/>
     <w:basedOn w:val="Normal"/>
     <w:next w:val="Normal"/>
-    <w:link w:val="Ttulo8Car"/>
+    <w:link w:val="Heading8Char"/>
     <w:uiPriority w:val="9"/>
     <w:semiHidden/>
     <w:unhideWhenUsed/>
@@ -4095,11 +4494,11 @@
       <w:color w:val="272727" w:themeColor="text1" w:themeTint="D8"/>
     </w:rPr>
   </w:style>
-  <w:style w:type="paragraph" w:styleId="Ttulo9">
+  <w:style w:type="paragraph" w:styleId="Heading9">
     <w:name w:val="heading 9"/>
     <w:basedOn w:val="Normal"/>
     <w:next w:val="Normal"/>
-    <w:link w:val="Ttulo9Car"/>
+    <w:link w:val="Heading9Char"/>
     <w:uiPriority w:val="9"/>
     <w:semiHidden/>
     <w:unhideWhenUsed/>
@@ -4116,13 +4515,13 @@
       <w:color w:val="272727" w:themeColor="text1" w:themeTint="D8"/>
     </w:rPr>
   </w:style>
-  <w:style w:type="character" w:default="1" w:styleId="Fuentedeprrafopredeter">
+  <w:style w:type="character" w:default="1" w:styleId="DefaultParagraphFont">
     <w:name w:val="Default Paragraph Font"/>
     <w:uiPriority w:val="1"/>
     <w:semiHidden/>
     <w:unhideWhenUsed/>
   </w:style>
-  <w:style w:type="table" w:default="1" w:styleId="Tablanormal">
+  <w:style w:type="table" w:default="1" w:styleId="TableNormal">
     <w:name w:val="Normal Table"/>
     <w:uiPriority w:val="99"/>
     <w:semiHidden/>
@@ -4137,16 +4536,16 @@
       </w:tblCellMar>
     </w:tblPr>
   </w:style>
-  <w:style w:type="numbering" w:default="1" w:styleId="Sinlista">
+  <w:style w:type="numbering" w:default="1" w:styleId="NoList">
     <w:name w:val="No List"/>
     <w:uiPriority w:val="99"/>
     <w:semiHidden/>
     <w:unhideWhenUsed/>
   </w:style>
-  <w:style w:type="character" w:customStyle="1" w:styleId="Ttulo1Car">
-    <w:name w:val="Título 1 Car"/>
-    <w:basedOn w:val="Fuentedeprrafopredeter"/>
-    <w:link w:val="Ttulo1"/>
+  <w:style w:type="character" w:customStyle="1" w:styleId="Heading1Char">
+    <w:name w:val="Heading 1 Char"/>
+    <w:basedOn w:val="DefaultParagraphFont"/>
+    <w:link w:val="Heading1"/>
     <w:uiPriority w:val="9"/>
     <w:rsid w:val="00C00C98"/>
     <w:rPr>
@@ -4156,10 +4555,10 @@
       <w:szCs w:val="40"/>
     </w:rPr>
   </w:style>
-  <w:style w:type="character" w:customStyle="1" w:styleId="Ttulo2Car">
-    <w:name w:val="Título 2 Car"/>
-    <w:basedOn w:val="Fuentedeprrafopredeter"/>
-    <w:link w:val="Ttulo2"/>
+  <w:style w:type="character" w:customStyle="1" w:styleId="Heading2Char">
+    <w:name w:val="Heading 2 Char"/>
+    <w:basedOn w:val="DefaultParagraphFont"/>
+    <w:link w:val="Heading2"/>
     <w:uiPriority w:val="9"/>
     <w:semiHidden/>
     <w:rsid w:val="00C00C98"/>
@@ -4170,10 +4569,10 @@
       <w:szCs w:val="32"/>
     </w:rPr>
   </w:style>
-  <w:style w:type="character" w:customStyle="1" w:styleId="Ttulo3Car">
-    <w:name w:val="Título 3 Car"/>
-    <w:basedOn w:val="Fuentedeprrafopredeter"/>
-    <w:link w:val="Ttulo3"/>
+  <w:style w:type="character" w:customStyle="1" w:styleId="Heading3Char">
+    <w:name w:val="Heading 3 Char"/>
+    <w:basedOn w:val="DefaultParagraphFont"/>
+    <w:link w:val="Heading3"/>
     <w:uiPriority w:val="9"/>
     <w:semiHidden/>
     <w:rsid w:val="00C00C98"/>
@@ -4184,10 +4583,10 @@
       <w:szCs w:val="28"/>
     </w:rPr>
   </w:style>
-  <w:style w:type="character" w:customStyle="1" w:styleId="Ttulo4Car">
-    <w:name w:val="Título 4 Car"/>
-    <w:basedOn w:val="Fuentedeprrafopredeter"/>
-    <w:link w:val="Ttulo4"/>
+  <w:style w:type="character" w:customStyle="1" w:styleId="Heading4Char">
+    <w:name w:val="Heading 4 Char"/>
+    <w:basedOn w:val="DefaultParagraphFont"/>
+    <w:link w:val="Heading4"/>
     <w:uiPriority w:val="9"/>
     <w:semiHidden/>
     <w:rsid w:val="00C00C98"/>
@@ -4198,10 +4597,10 @@
       <w:color w:val="0F4761" w:themeColor="accent1" w:themeShade="BF"/>
     </w:rPr>
   </w:style>
-  <w:style w:type="character" w:customStyle="1" w:styleId="Ttulo5Car">
-    <w:name w:val="Título 5 Car"/>
-    <w:basedOn w:val="Fuentedeprrafopredeter"/>
-    <w:link w:val="Ttulo5"/>
+  <w:style w:type="character" w:customStyle="1" w:styleId="Heading5Char">
+    <w:name w:val="Heading 5 Char"/>
+    <w:basedOn w:val="DefaultParagraphFont"/>
+    <w:link w:val="Heading5"/>
     <w:uiPriority w:val="9"/>
     <w:semiHidden/>
     <w:rsid w:val="00C00C98"/>
@@ -4210,10 +4609,10 @@
       <w:color w:val="0F4761" w:themeColor="accent1" w:themeShade="BF"/>
     </w:rPr>
   </w:style>
-  <w:style w:type="character" w:customStyle="1" w:styleId="Ttulo6Car">
-    <w:name w:val="Título 6 Car"/>
-    <w:basedOn w:val="Fuentedeprrafopredeter"/>
-    <w:link w:val="Ttulo6"/>
+  <w:style w:type="character" w:customStyle="1" w:styleId="Heading6Char">
+    <w:name w:val="Heading 6 Char"/>
+    <w:basedOn w:val="DefaultParagraphFont"/>
+    <w:link w:val="Heading6"/>
     <w:uiPriority w:val="9"/>
     <w:semiHidden/>
     <w:rsid w:val="00C00C98"/>
@@ -4224,10 +4623,10 @@
       <w:color w:val="595959" w:themeColor="text1" w:themeTint="A6"/>
     </w:rPr>
   </w:style>
-  <w:style w:type="character" w:customStyle="1" w:styleId="Ttulo7Car">
-    <w:name w:val="Título 7 Car"/>
-    <w:basedOn w:val="Fuentedeprrafopredeter"/>
-    <w:link w:val="Ttulo7"/>
+  <w:style w:type="character" w:customStyle="1" w:styleId="Heading7Char">
+    <w:name w:val="Heading 7 Char"/>
+    <w:basedOn w:val="DefaultParagraphFont"/>
+    <w:link w:val="Heading7"/>
     <w:uiPriority w:val="9"/>
     <w:semiHidden/>
     <w:rsid w:val="00C00C98"/>
@@ -4236,10 +4635,10 @@
       <w:color w:val="595959" w:themeColor="text1" w:themeTint="A6"/>
     </w:rPr>
   </w:style>
-  <w:style w:type="character" w:customStyle="1" w:styleId="Ttulo8Car">
-    <w:name w:val="Título 8 Car"/>
-    <w:basedOn w:val="Fuentedeprrafopredeter"/>
-    <w:link w:val="Ttulo8"/>
+  <w:style w:type="character" w:customStyle="1" w:styleId="Heading8Char">
+    <w:name w:val="Heading 8 Char"/>
+    <w:basedOn w:val="DefaultParagraphFont"/>
+    <w:link w:val="Heading8"/>
     <w:uiPriority w:val="9"/>
     <w:semiHidden/>
     <w:rsid w:val="00C00C98"/>
@@ -4250,10 +4649,10 @@
       <w:color w:val="272727" w:themeColor="text1" w:themeTint="D8"/>
     </w:rPr>
   </w:style>
-  <w:style w:type="character" w:customStyle="1" w:styleId="Ttulo9Car">
-    <w:name w:val="Título 9 Car"/>
-    <w:basedOn w:val="Fuentedeprrafopredeter"/>
-    <w:link w:val="Ttulo9"/>
+  <w:style w:type="character" w:customStyle="1" w:styleId="Heading9Char">
+    <w:name w:val="Heading 9 Char"/>
+    <w:basedOn w:val="DefaultParagraphFont"/>
+    <w:link w:val="Heading9"/>
     <w:uiPriority w:val="9"/>
     <w:semiHidden/>
     <w:rsid w:val="00C00C98"/>
@@ -4262,11 +4661,11 @@
       <w:color w:val="272727" w:themeColor="text1" w:themeTint="D8"/>
     </w:rPr>
   </w:style>
-  <w:style w:type="paragraph" w:styleId="Ttulo">
+  <w:style w:type="paragraph" w:styleId="Title">
     <w:name w:val="Title"/>
     <w:basedOn w:val="Normal"/>
     <w:next w:val="Normal"/>
-    <w:link w:val="TtuloCar"/>
+    <w:link w:val="TitleChar"/>
     <w:uiPriority w:val="10"/>
     <w:qFormat/>
     <w:rsid w:val="00C00C98"/>
@@ -4282,10 +4681,10 @@
       <w:szCs w:val="56"/>
     </w:rPr>
   </w:style>
-  <w:style w:type="character" w:customStyle="1" w:styleId="TtuloCar">
-    <w:name w:val="Título Car"/>
-    <w:basedOn w:val="Fuentedeprrafopredeter"/>
-    <w:link w:val="Ttulo"/>
+  <w:style w:type="character" w:customStyle="1" w:styleId="TitleChar">
+    <w:name w:val="Title Char"/>
+    <w:basedOn w:val="DefaultParagraphFont"/>
+    <w:link w:val="Title"/>
     <w:uiPriority w:val="10"/>
     <w:rsid w:val="00C00C98"/>
     <w:rPr>
@@ -4296,11 +4695,11 @@
       <w:szCs w:val="56"/>
     </w:rPr>
   </w:style>
-  <w:style w:type="paragraph" w:styleId="Subttulo">
+  <w:style w:type="paragraph" w:styleId="Subtitle">
     <w:name w:val="Subtitle"/>
     <w:basedOn w:val="Normal"/>
     <w:next w:val="Normal"/>
-    <w:link w:val="SubttuloCar"/>
+    <w:link w:val="SubtitleChar"/>
     <w:uiPriority w:val="11"/>
     <w:qFormat/>
     <w:rsid w:val="00C00C98"/>
@@ -4317,10 +4716,10 @@
       <w:szCs w:val="28"/>
     </w:rPr>
   </w:style>
-  <w:style w:type="character" w:customStyle="1" w:styleId="SubttuloCar">
-    <w:name w:val="Subtítulo Car"/>
-    <w:basedOn w:val="Fuentedeprrafopredeter"/>
-    <w:link w:val="Subttulo"/>
+  <w:style w:type="character" w:customStyle="1" w:styleId="SubtitleChar">
+    <w:name w:val="Subtitle Char"/>
+    <w:basedOn w:val="DefaultParagraphFont"/>
+    <w:link w:val="Subtitle"/>
     <w:uiPriority w:val="11"/>
     <w:rsid w:val="00C00C98"/>
     <w:rPr>
@@ -4331,11 +4730,11 @@
       <w:szCs w:val="28"/>
     </w:rPr>
   </w:style>
-  <w:style w:type="paragraph" w:styleId="Cita">
+  <w:style w:type="paragraph" w:styleId="Quote">
     <w:name w:val="Quote"/>
     <w:basedOn w:val="Normal"/>
     <w:next w:val="Normal"/>
-    <w:link w:val="CitaCar"/>
+    <w:link w:val="QuoteChar"/>
     <w:uiPriority w:val="29"/>
     <w:qFormat/>
     <w:rsid w:val="00C00C98"/>
@@ -4349,10 +4748,10 @@
       <w:color w:val="404040" w:themeColor="text1" w:themeTint="BF"/>
     </w:rPr>
   </w:style>
-  <w:style w:type="character" w:customStyle="1" w:styleId="CitaCar">
-    <w:name w:val="Cita Car"/>
-    <w:basedOn w:val="Fuentedeprrafopredeter"/>
-    <w:link w:val="Cita"/>
+  <w:style w:type="character" w:customStyle="1" w:styleId="QuoteChar">
+    <w:name w:val="Quote Char"/>
+    <w:basedOn w:val="DefaultParagraphFont"/>
+    <w:link w:val="Quote"/>
     <w:uiPriority w:val="29"/>
     <w:rsid w:val="00C00C98"/>
     <w:rPr>
@@ -4361,7 +4760,7 @@
       <w:color w:val="404040" w:themeColor="text1" w:themeTint="BF"/>
     </w:rPr>
   </w:style>
-  <w:style w:type="paragraph" w:styleId="Prrafodelista">
+  <w:style w:type="paragraph" w:styleId="ListParagraph">
     <w:name w:val="List Paragraph"/>
     <w:basedOn w:val="Normal"/>
     <w:uiPriority w:val="34"/>
@@ -4372,9 +4771,9 @@
       <w:contextualSpacing/>
     </w:pPr>
   </w:style>
-  <w:style w:type="character" w:styleId="nfasisintenso">
+  <w:style w:type="character" w:styleId="IntenseEmphasis">
     <w:name w:val="Intense Emphasis"/>
-    <w:basedOn w:val="Fuentedeprrafopredeter"/>
+    <w:basedOn w:val="DefaultParagraphFont"/>
     <w:uiPriority w:val="21"/>
     <w:qFormat/>
     <w:rsid w:val="00C00C98"/>
@@ -4384,11 +4783,11 @@
       <w:color w:val="0F4761" w:themeColor="accent1" w:themeShade="BF"/>
     </w:rPr>
   </w:style>
-  <w:style w:type="paragraph" w:styleId="Citadestacada">
+  <w:style w:type="paragraph" w:styleId="IntenseQuote">
     <w:name w:val="Intense Quote"/>
     <w:basedOn w:val="Normal"/>
     <w:next w:val="Normal"/>
-    <w:link w:val="CitadestacadaCar"/>
+    <w:link w:val="IntenseQuoteChar"/>
     <w:uiPriority w:val="30"/>
     <w:qFormat/>
     <w:rsid w:val="00C00C98"/>
@@ -4407,10 +4806,10 @@
       <w:color w:val="0F4761" w:themeColor="accent1" w:themeShade="BF"/>
     </w:rPr>
   </w:style>
-  <w:style w:type="character" w:customStyle="1" w:styleId="CitadestacadaCar">
-    <w:name w:val="Cita destacada Car"/>
-    <w:basedOn w:val="Fuentedeprrafopredeter"/>
-    <w:link w:val="Citadestacada"/>
+  <w:style w:type="character" w:customStyle="1" w:styleId="IntenseQuoteChar">
+    <w:name w:val="Intense Quote Char"/>
+    <w:basedOn w:val="DefaultParagraphFont"/>
+    <w:link w:val="IntenseQuote"/>
     <w:uiPriority w:val="30"/>
     <w:rsid w:val="00C00C98"/>
     <w:rPr>
@@ -4419,9 +4818,9 @@
       <w:color w:val="0F4761" w:themeColor="accent1" w:themeShade="BF"/>
     </w:rPr>
   </w:style>
-  <w:style w:type="character" w:styleId="Referenciaintensa">
+  <w:style w:type="character" w:styleId="IntenseReference">
     <w:name w:val="Intense Reference"/>
-    <w:basedOn w:val="Fuentedeprrafopredeter"/>
+    <w:basedOn w:val="DefaultParagraphFont"/>
     <w:uiPriority w:val="32"/>
     <w:qFormat/>
     <w:rsid w:val="00C00C98"/>

</xml_diff>

<commit_message>
Declaración de bloque y función main
</commit_message>
<xml_diff>
--- a/Producciones.docx
+++ b/Producciones.docx
@@ -3783,6 +3783,184 @@
           <w:rFonts w:ascii="Arial" w:hAnsi="Arial" w:cs="Arial"/>
         </w:rPr>
       </w:pPr>
+      <w:r>
+        <w:rPr>
+          <w:rFonts w:ascii="Arial" w:hAnsi="Arial" w:cs="Arial"/>
+        </w:rPr>
+        <w:t>&lt;Bloque&gt; ::= &lt;</w:t>
+      </w:r>
+      <w:proofErr w:type="spellStart"/>
+      <w:r>
+        <w:rPr>
+          <w:rFonts w:ascii="Arial" w:hAnsi="Arial" w:cs="Arial"/>
+        </w:rPr>
+        <w:t>Bloque_Ini</w:t>
+      </w:r>
+      <w:proofErr w:type="spellEnd"/>
+      <w:r>
+        <w:rPr>
+          <w:rFonts w:ascii="Arial" w:hAnsi="Arial" w:cs="Arial"/>
+        </w:rPr>
+        <w:t>&gt; &lt;</w:t>
+      </w:r>
+      <w:proofErr w:type="spellStart"/>
+      <w:r>
+        <w:rPr>
+          <w:rFonts w:ascii="Arial" w:hAnsi="Arial" w:cs="Arial"/>
+        </w:rPr>
+        <w:t>Lista_Sentencias</w:t>
+      </w:r>
+      <w:proofErr w:type="spellEnd"/>
+      <w:r>
+        <w:rPr>
+          <w:rFonts w:ascii="Arial" w:hAnsi="Arial" w:cs="Arial"/>
+        </w:rPr>
+        <w:t>&gt; &lt;</w:t>
+      </w:r>
+      <w:proofErr w:type="spellStart"/>
+      <w:r>
+        <w:rPr>
+          <w:rFonts w:ascii="Arial" w:hAnsi="Arial" w:cs="Arial"/>
+        </w:rPr>
+        <w:t>Bloque_Fin</w:t>
+      </w:r>
+      <w:proofErr w:type="spellEnd"/>
+      <w:r>
+        <w:rPr>
+          <w:rFonts w:ascii="Arial" w:hAnsi="Arial" w:cs="Arial"/>
+        </w:rPr>
+        <w:t>&gt;</w:t>
+      </w:r>
+    </w:p>
+    <w:p>
+      <w:pPr>
+        <w:rPr>
+          <w:rFonts w:ascii="Arial" w:hAnsi="Arial" w:cs="Arial"/>
+        </w:rPr>
+      </w:pPr>
+      <w:r>
+        <w:rPr>
+          <w:rFonts w:ascii="Arial" w:hAnsi="Arial" w:cs="Arial"/>
+        </w:rPr>
+        <w:t>&lt;</w:t>
+      </w:r>
+      <w:proofErr w:type="spellStart"/>
+      <w:r>
+        <w:rPr>
+          <w:rFonts w:ascii="Arial" w:hAnsi="Arial" w:cs="Arial"/>
+        </w:rPr>
+        <w:t>Lista_Sentencias</w:t>
+      </w:r>
+      <w:proofErr w:type="spellEnd"/>
+      <w:r>
+        <w:rPr>
+          <w:rFonts w:ascii="Arial" w:hAnsi="Arial" w:cs="Arial"/>
+        </w:rPr>
+        <w:t>&gt; ::= &lt;Sentencia&gt;</w:t>
+      </w:r>
+    </w:p>
+    <w:p>
+      <w:pPr>
+        <w:rPr>
+          <w:rFonts w:ascii="Arial" w:hAnsi="Arial" w:cs="Arial"/>
+        </w:rPr>
+      </w:pPr>
+      <w:r>
+        <w:rPr>
+          <w:rFonts w:ascii="Arial" w:hAnsi="Arial" w:cs="Arial"/>
+        </w:rPr>
+        <w:t>&lt;</w:t>
+      </w:r>
+      <w:proofErr w:type="spellStart"/>
+      <w:r>
+        <w:rPr>
+          <w:rFonts w:ascii="Arial" w:hAnsi="Arial" w:cs="Arial"/>
+        </w:rPr>
+        <w:t>Lista_Sentencias</w:t>
+      </w:r>
+      <w:proofErr w:type="spellEnd"/>
+      <w:r>
+        <w:rPr>
+          <w:rFonts w:ascii="Arial" w:hAnsi="Arial" w:cs="Arial"/>
+        </w:rPr>
+        <w:t>&gt; ::= &lt;Sentencia&gt; &lt;</w:t>
+      </w:r>
+      <w:proofErr w:type="spellStart"/>
+      <w:r>
+        <w:rPr>
+          <w:rFonts w:ascii="Arial" w:hAnsi="Arial" w:cs="Arial"/>
+        </w:rPr>
+        <w:t>Lista_Sentencias</w:t>
+      </w:r>
+      <w:proofErr w:type="spellEnd"/>
+      <w:r>
+        <w:rPr>
+          <w:rFonts w:ascii="Arial" w:hAnsi="Arial" w:cs="Arial"/>
+        </w:rPr>
+        <w:t>&gt;</w:t>
+      </w:r>
+    </w:p>
+    <w:p>
+      <w:pPr>
+        <w:rPr>
+          <w:rFonts w:ascii="Arial" w:hAnsi="Arial" w:cs="Arial"/>
+        </w:rPr>
+      </w:pPr>
+    </w:p>
+    <w:p>
+      <w:pPr>
+        <w:rPr>
+          <w:rFonts w:ascii="Arial" w:hAnsi="Arial" w:cs="Arial"/>
+        </w:rPr>
+      </w:pPr>
+      <w:r>
+        <w:rPr>
+          <w:rFonts w:ascii="Arial" w:hAnsi="Arial" w:cs="Arial"/>
+        </w:rPr>
+        <w:t>&lt;</w:t>
+      </w:r>
+      <w:proofErr w:type="spellStart"/>
+      <w:r>
+        <w:rPr>
+          <w:rFonts w:ascii="Arial" w:hAnsi="Arial" w:cs="Arial"/>
+        </w:rPr>
+        <w:t>Funcion_Main</w:t>
+      </w:r>
+      <w:proofErr w:type="spellEnd"/>
+      <w:r>
+        <w:rPr>
+          <w:rFonts w:ascii="Arial" w:hAnsi="Arial" w:cs="Arial"/>
+        </w:rPr>
+        <w:t>&gt; ::= &lt;Void&gt; &lt;Main&gt; &lt;</w:t>
+      </w:r>
+      <w:proofErr w:type="spellStart"/>
+      <w:r>
+        <w:rPr>
+          <w:rFonts w:ascii="Arial" w:hAnsi="Arial" w:cs="Arial"/>
+        </w:rPr>
+        <w:t>Par_Ini</w:t>
+      </w:r>
+      <w:proofErr w:type="spellEnd"/>
+      <w:r>
+        <w:rPr>
+          <w:rFonts w:ascii="Arial" w:hAnsi="Arial" w:cs="Arial"/>
+        </w:rPr>
+        <w:t>&gt; &lt;</w:t>
+      </w:r>
+      <w:proofErr w:type="spellStart"/>
+      <w:r>
+        <w:rPr>
+          <w:rFonts w:ascii="Arial" w:hAnsi="Arial" w:cs="Arial"/>
+        </w:rPr>
+        <w:t>Par_Fin</w:t>
+      </w:r>
+      <w:proofErr w:type="spellEnd"/>
+      <w:r>
+        <w:rPr>
+          <w:rFonts w:ascii="Arial" w:hAnsi="Arial" w:cs="Arial"/>
+        </w:rPr>
+        <w:t>&gt; &lt;Bloque&gt;</w:t>
+      </w:r>
     </w:p>
     <w:sectPr>
       <w:pgSz w:w="12240" w:h="15840"/>

</xml_diff>